<commit_message>
Update reference doc: party roles, independent witnesses and experts, expected government experts
Co-Authored-By: Claude Opus 5.5 <noreply@anthropic.com>
Claude-Session: https://claude.ai/code/session_017oEPUMkR5nJuWbwJeQ76i8
</commit_message>
<xml_diff>
--- a/Acuan_Kelompok_Pemohon_UU13_2011.docx
+++ b/Acuan_Kelompok_Pemohon_UU13_2011.docx
@@ -5298,7 +5298,7 @@
         <w:rPr>
           <w:rFonts w:ascii="Arial" w:cs="Arial" w:eastAsia="Arial" w:hAnsi="Arial"/>
         </w:rPr>
-        <w:t xml:space="preserve">6. Saksi dan Ahli Pihak Pemohon</w:t>
+        <w:t xml:space="preserve">6. Pihak dalam Sidang dan Pembagian Peran</w:t>
       </w:r>
     </w:p>
     <w:p>
@@ -5310,7 +5310,7 @@
         <w:rPr>
           <w:rFonts w:ascii="Arial" w:cs="Arial" w:eastAsia="Arial" w:hAnsi="Arial"/>
         </w:rPr>
-        <w:t xml:space="preserve">Saksi membuktikan fakta bahwa masyarakat hanya menjadi pengirim data. Ahli membuktikan bahwa norma itu cacat dan partisipasi bisa dijalankan. Pemohon tidak boleh merangkap saksi, dan ahli harus independen (tanpa hubungan keluarga atau kerja dengan Pemohon).</w:t>
+        <w:t xml:space="preserve">Sidang simulasi melibatkan 41 orang dalam tiga kelompok; 16 anggota Pemohon pas dibagi menjadi 5 kuasa hukum, 4 Pemohon prinsipal, 3 saksi, dan 4 ahli.</w:t>
       </w:r>
     </w:p>
     <w:tbl>
@@ -5327,10 +5327,9 @@
         <w:tblLayout w:type="fixed"/>
       </w:tblPr>
       <w:tblGrid>
-        <w:gridCol w:w="1100"/>
-        <w:gridCol w:w="2300"/>
-        <w:gridCol w:w="4038"/>
-        <w:gridCol w:w="2200"/>
+        <w:gridCol w:w="2000"/>
+        <w:gridCol w:w="1200"/>
+        <w:gridCol w:w="6438"/>
       </w:tblGrid>
       <w:tr>
         <w:trPr>
@@ -5338,7 +5337,7 @@
         </w:trPr>
         <w:tc>
           <w:tcPr>
-            <w:tcW w:type="dxa" w:w="1100"/>
+            <w:tcW w:type="dxa" w:w="2000"/>
             <w:tcBorders>
               <w:top w:val="single" w:color="999999" w:sz="4"/>
               <w:left w:val="single" w:color="999999" w:sz="4"/>
@@ -5365,13 +5364,13 @@
                 <w:sz w:val="18"/>
                 <w:szCs w:val="18"/>
               </w:rPr>
-              <w:t xml:space="preserve">Peran</w:t>
-            </w:r>
-          </w:p>
-        </w:tc>
-        <w:tc>
-          <w:tcPr>
-            <w:tcW w:type="dxa" w:w="2300"/>
+              <w:t xml:space="preserve">Kelompok</w:t>
+            </w:r>
+          </w:p>
+        </w:tc>
+        <w:tc>
+          <w:tcPr>
+            <w:tcW w:type="dxa" w:w="1200"/>
             <w:tcBorders>
               <w:top w:val="single" w:color="999999" w:sz="4"/>
               <w:left w:val="single" w:color="999999" w:sz="4"/>
@@ -5398,13 +5397,13 @@
                 <w:sz w:val="18"/>
                 <w:szCs w:val="18"/>
               </w:rPr>
-              <w:t xml:space="preserve">Nama (fiktif)</w:t>
-            </w:r>
-          </w:p>
-        </w:tc>
-        <w:tc>
-          <w:tcPr>
-            <w:tcW w:type="dxa" w:w="4038"/>
+              <w:t xml:space="preserve">Jumlah</w:t>
+            </w:r>
+          </w:p>
+        </w:tc>
+        <w:tc>
+          <w:tcPr>
+            <w:tcW w:type="dxa" w:w="6438"/>
             <w:tcBorders>
               <w:top w:val="single" w:color="999999" w:sz="4"/>
               <w:left w:val="single" w:color="999999" w:sz="4"/>
@@ -5431,40 +5430,7 @@
                 <w:sz w:val="18"/>
                 <w:szCs w:val="18"/>
               </w:rPr>
-              <w:t xml:space="preserve">Pokok keterangan</w:t>
-            </w:r>
-          </w:p>
-        </w:tc>
-        <w:tc>
-          <w:tcPr>
-            <w:tcW w:type="dxa" w:w="2200"/>
-            <w:tcBorders>
-              <w:top w:val="single" w:color="999999" w:sz="4"/>
-              <w:left w:val="single" w:color="999999" w:sz="4"/>
-              <w:bottom w:val="single" w:color="999999" w:sz="4"/>
-              <w:right w:val="single" w:color="999999" w:sz="4"/>
-            </w:tcBorders>
-            <w:shd w:fill="D9E2F3" w:color="auto" w:val="clear"/>
-            <w:tcMar>
-              <w:top w:type="dxa" w:w="60"/>
-              <w:left w:type="dxa" w:w="100"/>
-              <w:bottom w:type="dxa" w:w="60"/>
-              <w:right w:type="dxa" w:w="100"/>
-            </w:tcMar>
-          </w:tcPr>
-          <w:p>
-            <w:pPr>
-              <w:jc w:val="left"/>
-            </w:pPr>
-            <w:r>
-              <w:rPr>
-                <w:rFonts w:ascii="Arial" w:cs="Arial" w:eastAsia="Arial" w:hAnsi="Arial"/>
-                <w:b/>
-                <w:bCs/>
-                <w:sz w:val="18"/>
-                <w:szCs w:val="18"/>
-              </w:rPr>
-              <w:t xml:space="preserve">Dalil yang dibuktikan</w:t>
+              <w:t xml:space="preserve">Isi peran</w:t>
             </w:r>
           </w:p>
         </w:tc>
@@ -5475,129 +5441,97 @@
         </w:trPr>
         <w:tc>
           <w:tcPr>
-            <w:tcW w:type="dxa" w:w="1100"/>
-            <w:tcBorders>
-              <w:top w:val="single" w:color="999999" w:sz="4"/>
-              <w:left w:val="single" w:color="999999" w:sz="4"/>
-              <w:bottom w:val="single" w:color="999999" w:sz="4"/>
-              <w:right w:val="single" w:color="999999" w:sz="4"/>
-            </w:tcBorders>
-            <w:tcMar>
-              <w:top w:type="dxa" w:w="60"/>
-              <w:left w:type="dxa" w:w="100"/>
-              <w:bottom w:type="dxa" w:w="60"/>
-              <w:right w:type="dxa" w:w="100"/>
-            </w:tcMar>
-          </w:tcPr>
-          <w:p>
-            <w:pPr>
-              <w:jc w:val="left"/>
-            </w:pPr>
-            <w:r>
-              <w:rPr>
-                <w:rFonts w:ascii="Arial" w:cs="Arial" w:eastAsia="Arial" w:hAnsi="Arial"/>
-                <w:b w:val="false"/>
-                <w:bCs w:val="false"/>
-                <w:sz w:val="18"/>
-                <w:szCs w:val="18"/>
-              </w:rPr>
-              <w:t xml:space="preserve">Saksi 1</w:t>
-            </w:r>
-          </w:p>
-        </w:tc>
-        <w:tc>
-          <w:tcPr>
-            <w:tcW w:type="dxa" w:w="2300"/>
-            <w:tcBorders>
-              <w:top w:val="single" w:color="999999" w:sz="4"/>
-              <w:left w:val="single" w:color="999999" w:sz="4"/>
-              <w:bottom w:val="single" w:color="999999" w:sz="4"/>
-              <w:right w:val="single" w:color="999999" w:sz="4"/>
-            </w:tcBorders>
-            <w:tcMar>
-              <w:top w:type="dxa" w:w="60"/>
-              <w:left w:type="dxa" w:w="100"/>
-              <w:bottom w:type="dxa" w:w="60"/>
-              <w:right w:type="dxa" w:w="100"/>
-            </w:tcMar>
-          </w:tcPr>
-          <w:p>
-            <w:pPr>
-              <w:jc w:val="left"/>
-            </w:pPr>
-            <w:r>
-              <w:rPr>
-                <w:rFonts w:ascii="Arial" w:cs="Arial" w:eastAsia="Arial" w:hAnsi="Arial"/>
-                <w:b w:val="false"/>
-                <w:bCs w:val="false"/>
-                <w:sz w:val="18"/>
-                <w:szCs w:val="18"/>
-              </w:rPr>
-              <w:t xml:space="preserve">H. Asep Saepudin, Kepala Desa Sukamulya, Kab. Garut</w:t>
-            </w:r>
-          </w:p>
-        </w:tc>
-        <w:tc>
-          <w:tcPr>
-            <w:tcW w:type="dxa" w:w="4038"/>
-            <w:tcBorders>
-              <w:top w:val="single" w:color="999999" w:sz="4"/>
-              <w:left w:val="single" w:color="999999" w:sz="4"/>
-              <w:bottom w:val="single" w:color="999999" w:sz="4"/>
-              <w:right w:val="single" w:color="999999" w:sz="4"/>
-            </w:tcBorders>
-            <w:tcMar>
-              <w:top w:type="dxa" w:w="60"/>
-              <w:left w:type="dxa" w:w="100"/>
-              <w:bottom w:type="dxa" w:w="60"/>
-              <w:right w:type="dxa" w:w="100"/>
-            </w:tcMar>
-          </w:tcPr>
-          <w:p>
-            <w:pPr>
-              <w:jc w:val="left"/>
-            </w:pPr>
-            <w:r>
-              <w:rPr>
-                <w:rFonts w:ascii="Arial" w:cs="Arial" w:eastAsia="Arial" w:hAnsi="Arial"/>
-                <w:b w:val="false"/>
-                <w:bCs w:val="false"/>
-                <w:sz w:val="18"/>
-                <w:szCs w:val="18"/>
-              </w:rPr>
-              <w:t xml:space="preserve">Musyawarah desa hanya mengusulkan data; usulan sering tidak mengubah desil; desa tidak pernah dimintai pendapat soal variabel atau kriteria</w:t>
-            </w:r>
-          </w:p>
-        </w:tc>
-        <w:tc>
-          <w:tcPr>
-            <w:tcW w:type="dxa" w:w="2200"/>
-            <w:tcBorders>
-              <w:top w:val="single" w:color="999999" w:sz="4"/>
-              <w:left w:val="single" w:color="999999" w:sz="4"/>
-              <w:bottom w:val="single" w:color="999999" w:sz="4"/>
-              <w:right w:val="single" w:color="999999" w:sz="4"/>
-            </w:tcBorders>
-            <w:tcMar>
-              <w:top w:type="dxa" w:w="60"/>
-              <w:left w:type="dxa" w:w="100"/>
-              <w:bottom w:type="dxa" w:w="60"/>
-              <w:right w:type="dxa" w:w="100"/>
-            </w:tcMar>
-          </w:tcPr>
-          <w:p>
-            <w:pPr>
-              <w:jc w:val="left"/>
-            </w:pPr>
-            <w:r>
-              <w:rPr>
-                <w:rFonts w:ascii="Arial" w:cs="Arial" w:eastAsia="Arial" w:hAnsi="Arial"/>
-                <w:b w:val="false"/>
-                <w:bCs w:val="false"/>
-                <w:sz w:val="18"/>
-                <w:szCs w:val="18"/>
-              </w:rPr>
-              <w:t xml:space="preserve">Masyarakat hanya kurir data; hak dipertimbangkan tidak terpenuhi</w:t>
+            <w:tcW w:type="dxa" w:w="2000"/>
+            <w:tcBorders>
+              <w:top w:val="single" w:color="999999" w:sz="4"/>
+              <w:left w:val="single" w:color="999999" w:sz="4"/>
+              <w:bottom w:val="single" w:color="999999" w:sz="4"/>
+              <w:right w:val="single" w:color="999999" w:sz="4"/>
+            </w:tcBorders>
+            <w:tcMar>
+              <w:top w:type="dxa" w:w="60"/>
+              <w:left w:type="dxa" w:w="100"/>
+              <w:bottom w:type="dxa" w:w="60"/>
+              <w:right w:type="dxa" w:w="100"/>
+            </w:tcMar>
+          </w:tcPr>
+          <w:p>
+            <w:pPr>
+              <w:jc w:val="left"/>
+            </w:pPr>
+            <w:r>
+              <w:rPr>
+                <w:rFonts w:ascii="Arial" w:cs="Arial" w:eastAsia="Arial" w:hAnsi="Arial"/>
+                <w:b w:val="false"/>
+                <w:bCs w:val="false"/>
+                <w:sz w:val="18"/>
+                <w:szCs w:val="18"/>
+              </w:rPr>
+              <w:t xml:space="preserve">Pemohon</w:t>
+            </w:r>
+          </w:p>
+        </w:tc>
+        <w:tc>
+          <w:tcPr>
+            <w:tcW w:type="dxa" w:w="1200"/>
+            <w:tcBorders>
+              <w:top w:val="single" w:color="999999" w:sz="4"/>
+              <w:left w:val="single" w:color="999999" w:sz="4"/>
+              <w:bottom w:val="single" w:color="999999" w:sz="4"/>
+              <w:right w:val="single" w:color="999999" w:sz="4"/>
+            </w:tcBorders>
+            <w:tcMar>
+              <w:top w:type="dxa" w:w="60"/>
+              <w:left w:type="dxa" w:w="100"/>
+              <w:bottom w:type="dxa" w:w="60"/>
+              <w:right w:type="dxa" w:w="100"/>
+            </w:tcMar>
+          </w:tcPr>
+          <w:p>
+            <w:pPr>
+              <w:jc w:val="left"/>
+            </w:pPr>
+            <w:r>
+              <w:rPr>
+                <w:rFonts w:ascii="Arial" w:cs="Arial" w:eastAsia="Arial" w:hAnsi="Arial"/>
+                <w:b w:val="false"/>
+                <w:bCs w:val="false"/>
+                <w:sz w:val="18"/>
+                <w:szCs w:val="18"/>
+              </w:rPr>
+              <w:t xml:space="preserve">16</w:t>
+            </w:r>
+          </w:p>
+        </w:tc>
+        <w:tc>
+          <w:tcPr>
+            <w:tcW w:type="dxa" w:w="6438"/>
+            <w:tcBorders>
+              <w:top w:val="single" w:color="999999" w:sz="4"/>
+              <w:left w:val="single" w:color="999999" w:sz="4"/>
+              <w:bottom w:val="single" w:color="999999" w:sz="4"/>
+              <w:right w:val="single" w:color="999999" w:sz="4"/>
+            </w:tcBorders>
+            <w:tcMar>
+              <w:top w:type="dxa" w:w="60"/>
+              <w:left w:type="dxa" w:w="100"/>
+              <w:bottom w:type="dxa" w:w="60"/>
+              <w:right w:type="dxa" w:w="100"/>
+            </w:tcMar>
+          </w:tcPr>
+          <w:p>
+            <w:pPr>
+              <w:jc w:val="left"/>
+            </w:pPr>
+            <w:r>
+              <w:rPr>
+                <w:rFonts w:ascii="Arial" w:cs="Arial" w:eastAsia="Arial" w:hAnsi="Arial"/>
+                <w:b w:val="false"/>
+                <w:bCs w:val="false"/>
+                <w:sz w:val="18"/>
+                <w:szCs w:val="18"/>
+              </w:rPr>
+              <w:t xml:space="preserve">Kuasa hukum, Pemohon prinsipal, saksi dan ahli pihak Pemohon</w:t>
             </w:r>
           </w:p>
         </w:tc>
@@ -5608,129 +5542,97 @@
         </w:trPr>
         <w:tc>
           <w:tcPr>
-            <w:tcW w:type="dxa" w:w="1100"/>
-            <w:tcBorders>
-              <w:top w:val="single" w:color="999999" w:sz="4"/>
-              <w:left w:val="single" w:color="999999" w:sz="4"/>
-              <w:bottom w:val="single" w:color="999999" w:sz="4"/>
-              <w:right w:val="single" w:color="999999" w:sz="4"/>
-            </w:tcBorders>
-            <w:tcMar>
-              <w:top w:type="dxa" w:w="60"/>
-              <w:left w:type="dxa" w:w="100"/>
-              <w:bottom w:type="dxa" w:w="60"/>
-              <w:right w:type="dxa" w:w="100"/>
-            </w:tcMar>
-          </w:tcPr>
-          <w:p>
-            <w:pPr>
-              <w:jc w:val="left"/>
-            </w:pPr>
-            <w:r>
-              <w:rPr>
-                <w:rFonts w:ascii="Arial" w:cs="Arial" w:eastAsia="Arial" w:hAnsi="Arial"/>
-                <w:b w:val="false"/>
-                <w:bCs w:val="false"/>
-                <w:sz w:val="18"/>
-                <w:szCs w:val="18"/>
-              </w:rPr>
-              <w:t xml:space="preserve">Saksi 2</w:t>
-            </w:r>
-          </w:p>
-        </w:tc>
-        <w:tc>
-          <w:tcPr>
-            <w:tcW w:type="dxa" w:w="2300"/>
-            <w:tcBorders>
-              <w:top w:val="single" w:color="999999" w:sz="4"/>
-              <w:left w:val="single" w:color="999999" w:sz="4"/>
-              <w:bottom w:val="single" w:color="999999" w:sz="4"/>
-              <w:right w:val="single" w:color="999999" w:sz="4"/>
-            </w:tcBorders>
-            <w:tcMar>
-              <w:top w:type="dxa" w:w="60"/>
-              <w:left w:type="dxa" w:w="100"/>
-              <w:bottom w:type="dxa" w:w="60"/>
-              <w:right w:type="dxa" w:w="100"/>
-            </w:tcMar>
-          </w:tcPr>
-          <w:p>
-            <w:pPr>
-              <w:jc w:val="left"/>
-            </w:pPr>
-            <w:r>
-              <w:rPr>
-                <w:rFonts w:ascii="Arial" w:cs="Arial" w:eastAsia="Arial" w:hAnsi="Arial"/>
-                <w:b w:val="false"/>
-                <w:bCs w:val="false"/>
-                <w:sz w:val="18"/>
-                <w:szCs w:val="18"/>
-              </w:rPr>
-              <w:t xml:space="preserve">Rina Marlina, S.Sos., pendamping PKH di Kota Bandung</w:t>
-            </w:r>
-          </w:p>
-        </w:tc>
-        <w:tc>
-          <w:tcPr>
-            <w:tcW w:type="dxa" w:w="4038"/>
-            <w:tcBorders>
-              <w:top w:val="single" w:color="999999" w:sz="4"/>
-              <w:left w:val="single" w:color="999999" w:sz="4"/>
-              <w:bottom w:val="single" w:color="999999" w:sz="4"/>
-              <w:right w:val="single" w:color="999999" w:sz="4"/>
-            </w:tcBorders>
-            <w:tcMar>
-              <w:top w:type="dxa" w:w="60"/>
-              <w:left w:type="dxa" w:w="100"/>
-              <w:bottom w:type="dxa" w:w="60"/>
-              <w:right w:type="dxa" w:w="100"/>
-            </w:tcMar>
-          </w:tcPr>
-          <w:p>
-            <w:pPr>
-              <w:jc w:val="left"/>
-            </w:pPr>
-            <w:r>
-              <w:rPr>
-                <w:rFonts w:ascii="Arial" w:cs="Arial" w:eastAsia="Arial" w:hAnsi="Arial"/>
-                <w:b w:val="false"/>
-                <w:bCs w:val="false"/>
-                <w:sz w:val="18"/>
-                <w:szCs w:val="18"/>
-              </w:rPr>
-              <w:t xml:space="preserve">Menyaksikan keluarga miskin tercoret, termasuk keluarga Pemohon I; tidak ada forum resmi untuk masukan indikator; kriteria berganti tanpa uji publik</w:t>
-            </w:r>
-          </w:p>
-        </w:tc>
-        <w:tc>
-          <w:tcPr>
-            <w:tcW w:type="dxa" w:w="2200"/>
-            <w:tcBorders>
-              <w:top w:val="single" w:color="999999" w:sz="4"/>
-              <w:left w:val="single" w:color="999999" w:sz="4"/>
-              <w:bottom w:val="single" w:color="999999" w:sz="4"/>
-              <w:right w:val="single" w:color="999999" w:sz="4"/>
-            </w:tcBorders>
-            <w:tcMar>
-              <w:top w:type="dxa" w:w="60"/>
-              <w:left w:type="dxa" w:w="100"/>
-              <w:bottom w:type="dxa" w:w="60"/>
-              <w:right w:type="dxa" w:w="100"/>
-            </w:tcMar>
-          </w:tcPr>
-          <w:p>
-            <w:pPr>
-              <w:jc w:val="left"/>
-            </w:pPr>
-            <w:r>
-              <w:rPr>
-                <w:rFonts w:ascii="Arial" w:cs="Arial" w:eastAsia="Arial" w:hAnsi="Arial"/>
-                <w:b w:val="false"/>
-                <w:bCs w:val="false"/>
-                <w:sz w:val="18"/>
-                <w:szCs w:val="18"/>
-              </w:rPr>
-              <w:t xml:space="preserve">Dampak nyata kriteria tertutup</w:t>
+            <w:tcW w:type="dxa" w:w="2000"/>
+            <w:tcBorders>
+              <w:top w:val="single" w:color="999999" w:sz="4"/>
+              <w:left w:val="single" w:color="999999" w:sz="4"/>
+              <w:bottom w:val="single" w:color="999999" w:sz="4"/>
+              <w:right w:val="single" w:color="999999" w:sz="4"/>
+            </w:tcBorders>
+            <w:tcMar>
+              <w:top w:type="dxa" w:w="60"/>
+              <w:left w:type="dxa" w:w="100"/>
+              <w:bottom w:type="dxa" w:w="60"/>
+              <w:right w:type="dxa" w:w="100"/>
+            </w:tcMar>
+          </w:tcPr>
+          <w:p>
+            <w:pPr>
+              <w:jc w:val="left"/>
+            </w:pPr>
+            <w:r>
+              <w:rPr>
+                <w:rFonts w:ascii="Arial" w:cs="Arial" w:eastAsia="Arial" w:hAnsi="Arial"/>
+                <w:b w:val="false"/>
+                <w:bCs w:val="false"/>
+                <w:sz w:val="18"/>
+                <w:szCs w:val="18"/>
+              </w:rPr>
+              <w:t xml:space="preserve">Pemerintah</w:t>
+            </w:r>
+          </w:p>
+        </w:tc>
+        <w:tc>
+          <w:tcPr>
+            <w:tcW w:type="dxa" w:w="1200"/>
+            <w:tcBorders>
+              <w:top w:val="single" w:color="999999" w:sz="4"/>
+              <w:left w:val="single" w:color="999999" w:sz="4"/>
+              <w:bottom w:val="single" w:color="999999" w:sz="4"/>
+              <w:right w:val="single" w:color="999999" w:sz="4"/>
+            </w:tcBorders>
+            <w:tcMar>
+              <w:top w:type="dxa" w:w="60"/>
+              <w:left w:type="dxa" w:w="100"/>
+              <w:bottom w:type="dxa" w:w="60"/>
+              <w:right w:type="dxa" w:w="100"/>
+            </w:tcMar>
+          </w:tcPr>
+          <w:p>
+            <w:pPr>
+              <w:jc w:val="left"/>
+            </w:pPr>
+            <w:r>
+              <w:rPr>
+                <w:rFonts w:ascii="Arial" w:cs="Arial" w:eastAsia="Arial" w:hAnsi="Arial"/>
+                <w:b w:val="false"/>
+                <w:bCs w:val="false"/>
+                <w:sz w:val="18"/>
+                <w:szCs w:val="18"/>
+              </w:rPr>
+              <w:t xml:space="preserve">15</w:t>
+            </w:r>
+          </w:p>
+        </w:tc>
+        <w:tc>
+          <w:tcPr>
+            <w:tcW w:type="dxa" w:w="6438"/>
+            <w:tcBorders>
+              <w:top w:val="single" w:color="999999" w:sz="4"/>
+              <w:left w:val="single" w:color="999999" w:sz="4"/>
+              <w:bottom w:val="single" w:color="999999" w:sz="4"/>
+              <w:right w:val="single" w:color="999999" w:sz="4"/>
+            </w:tcBorders>
+            <w:tcMar>
+              <w:top w:type="dxa" w:w="60"/>
+              <w:left w:type="dxa" w:w="100"/>
+              <w:bottom w:type="dxa" w:w="60"/>
+              <w:right w:type="dxa" w:w="100"/>
+            </w:tcMar>
+          </w:tcPr>
+          <w:p>
+            <w:pPr>
+              <w:jc w:val="left"/>
+            </w:pPr>
+            <w:r>
+              <w:rPr>
+                <w:rFonts w:ascii="Arial" w:cs="Arial" w:eastAsia="Arial" w:hAnsi="Arial"/>
+                <w:b w:val="false"/>
+                <w:bCs w:val="false"/>
+                <w:sz w:val="18"/>
+                <w:szCs w:val="18"/>
+              </w:rPr>
+              <w:t xml:space="preserve">Kuasa Presiden (Kemensos dan kementerian terkait), DPR, serta ahli dan saksi Pemerintah</w:t>
             </w:r>
           </w:p>
         </w:tc>
@@ -5741,100 +5643,129 @@
         </w:trPr>
         <w:tc>
           <w:tcPr>
-            <w:tcW w:type="dxa" w:w="1100"/>
-            <w:tcBorders>
-              <w:top w:val="single" w:color="999999" w:sz="4"/>
-              <w:left w:val="single" w:color="999999" w:sz="4"/>
-              <w:bottom w:val="single" w:color="999999" w:sz="4"/>
-              <w:right w:val="single" w:color="999999" w:sz="4"/>
-            </w:tcBorders>
-            <w:tcMar>
-              <w:top w:type="dxa" w:w="60"/>
-              <w:left w:type="dxa" w:w="100"/>
-              <w:bottom w:type="dxa" w:w="60"/>
-              <w:right w:type="dxa" w:w="100"/>
-            </w:tcMar>
-          </w:tcPr>
-          <w:p>
-            <w:pPr>
-              <w:jc w:val="left"/>
-            </w:pPr>
-            <w:r>
-              <w:rPr>
-                <w:rFonts w:ascii="Arial" w:cs="Arial" w:eastAsia="Arial" w:hAnsi="Arial"/>
-                <w:b w:val="false"/>
-                <w:bCs w:val="false"/>
-                <w:sz w:val="18"/>
-                <w:szCs w:val="18"/>
-              </w:rPr>
-              <w:t xml:space="preserve">Saksi 3 (opsional)</w:t>
-            </w:r>
-          </w:p>
-        </w:tc>
-        <w:tc>
-          <w:tcPr>
-            <w:tcW w:type="dxa" w:w="2300"/>
-            <w:tcBorders>
-              <w:top w:val="single" w:color="999999" w:sz="4"/>
-              <w:left w:val="single" w:color="999999" w:sz="4"/>
-              <w:bottom w:val="single" w:color="999999" w:sz="4"/>
-              <w:right w:val="single" w:color="999999" w:sz="4"/>
-            </w:tcBorders>
-            <w:tcMar>
-              <w:top w:type="dxa" w:w="60"/>
-              <w:left w:type="dxa" w:w="100"/>
-              <w:bottom w:type="dxa" w:w="60"/>
-              <w:right w:type="dxa" w:w="100"/>
-            </w:tcMar>
-          </w:tcPr>
-          <w:p>
-            <w:pPr>
-              <w:jc w:val="left"/>
-            </w:pPr>
-            <w:r>
-              <w:rPr>
-                <w:rFonts w:ascii="Arial" w:cs="Arial" w:eastAsia="Arial" w:hAnsi="Arial"/>
-                <w:b w:val="false"/>
-                <w:bCs w:val="false"/>
-                <w:sz w:val="18"/>
-                <w:szCs w:val="18"/>
-              </w:rPr>
-              <w:t xml:space="preserve">Warga lain yang pernah mengajukan sanggah</w:t>
-            </w:r>
-          </w:p>
-        </w:tc>
-        <w:tc>
-          <w:tcPr>
-            <w:tcW w:type="dxa" w:w="4038"/>
-            <w:tcBorders>
-              <w:top w:val="single" w:color="999999" w:sz="4"/>
-              <w:left w:val="single" w:color="999999" w:sz="4"/>
-              <w:bottom w:val="single" w:color="999999" w:sz="4"/>
-              <w:right w:val="single" w:color="999999" w:sz="4"/>
-            </w:tcBorders>
-            <w:tcMar>
-              <w:top w:type="dxa" w:w="60"/>
-              <w:left w:type="dxa" w:w="100"/>
-              <w:bottom w:type="dxa" w:w="60"/>
-              <w:right w:type="dxa" w:w="100"/>
-            </w:tcMar>
-          </w:tcPr>
-          <w:p>
-            <w:pPr>
-              <w:jc w:val="left"/>
-            </w:pPr>
-            <w:r>
-              <w:rPr>
-                <w:rFonts w:ascii="Arial" w:cs="Arial" w:eastAsia="Arial" w:hAnsi="Arial"/>
-                <w:b w:val="false"/>
-                <w:bCs w:val="false"/>
-                <w:sz w:val="18"/>
-                <w:szCs w:val="18"/>
-              </w:rPr>
-              <w:t xml:space="preserve">Proses sanggah dan tidak adanya penjelasan</w:t>
-            </w:r>
-          </w:p>
-        </w:tc>
+            <w:tcW w:type="dxa" w:w="2000"/>
+            <w:tcBorders>
+              <w:top w:val="single" w:color="999999" w:sz="4"/>
+              <w:left w:val="single" w:color="999999" w:sz="4"/>
+              <w:bottom w:val="single" w:color="999999" w:sz="4"/>
+              <w:right w:val="single" w:color="999999" w:sz="4"/>
+            </w:tcBorders>
+            <w:tcMar>
+              <w:top w:type="dxa" w:w="60"/>
+              <w:left w:type="dxa" w:w="100"/>
+              <w:bottom w:type="dxa" w:w="60"/>
+              <w:right w:type="dxa" w:w="100"/>
+            </w:tcMar>
+          </w:tcPr>
+          <w:p>
+            <w:pPr>
+              <w:jc w:val="left"/>
+            </w:pPr>
+            <w:r>
+              <w:rPr>
+                <w:rFonts w:ascii="Arial" w:cs="Arial" w:eastAsia="Arial" w:hAnsi="Arial"/>
+                <w:b w:val="false"/>
+                <w:bCs w:val="false"/>
+                <w:sz w:val="18"/>
+                <w:szCs w:val="18"/>
+              </w:rPr>
+              <w:t xml:space="preserve">Majelis</w:t>
+            </w:r>
+          </w:p>
+        </w:tc>
+        <w:tc>
+          <w:tcPr>
+            <w:tcW w:type="dxa" w:w="1200"/>
+            <w:tcBorders>
+              <w:top w:val="single" w:color="999999" w:sz="4"/>
+              <w:left w:val="single" w:color="999999" w:sz="4"/>
+              <w:bottom w:val="single" w:color="999999" w:sz="4"/>
+              <w:right w:val="single" w:color="999999" w:sz="4"/>
+            </w:tcBorders>
+            <w:tcMar>
+              <w:top w:type="dxa" w:w="60"/>
+              <w:left w:type="dxa" w:w="100"/>
+              <w:bottom w:type="dxa" w:w="60"/>
+              <w:right w:type="dxa" w:w="100"/>
+            </w:tcMar>
+          </w:tcPr>
+          <w:p>
+            <w:pPr>
+              <w:jc w:val="left"/>
+            </w:pPr>
+            <w:r>
+              <w:rPr>
+                <w:rFonts w:ascii="Arial" w:cs="Arial" w:eastAsia="Arial" w:hAnsi="Arial"/>
+                <w:b w:val="false"/>
+                <w:bCs w:val="false"/>
+                <w:sz w:val="18"/>
+                <w:szCs w:val="18"/>
+              </w:rPr>
+              <w:t xml:space="preserve">10</w:t>
+            </w:r>
+          </w:p>
+        </w:tc>
+        <w:tc>
+          <w:tcPr>
+            <w:tcW w:type="dxa" w:w="6438"/>
+            <w:tcBorders>
+              <w:top w:val="single" w:color="999999" w:sz="4"/>
+              <w:left w:val="single" w:color="999999" w:sz="4"/>
+              <w:bottom w:val="single" w:color="999999" w:sz="4"/>
+              <w:right w:val="single" w:color="999999" w:sz="4"/>
+            </w:tcBorders>
+            <w:tcMar>
+              <w:top w:type="dxa" w:w="60"/>
+              <w:left w:type="dxa" w:w="100"/>
+              <w:bottom w:type="dxa" w:w="60"/>
+              <w:right w:type="dxa" w:w="100"/>
+            </w:tcMar>
+          </w:tcPr>
+          <w:p>
+            <w:pPr>
+              <w:jc w:val="left"/>
+            </w:pPr>
+            <w:r>
+              <w:rPr>
+                <w:rFonts w:ascii="Arial" w:cs="Arial" w:eastAsia="Arial" w:hAnsi="Arial"/>
+                <w:b w:val="false"/>
+                <w:bCs w:val="false"/>
+                <w:sz w:val="18"/>
+                <w:szCs w:val="18"/>
+              </w:rPr>
+              <w:t xml:space="preserve">Saran: 9 hakim konstitusi (sesuai jumlah hakim MK) dan 1 panitera pengganti</w:t>
+            </w:r>
+          </w:p>
+        </w:tc>
+      </w:tr>
+    </w:tbl>
+    <w:p>
+      <w:pPr>
+        <w:spacing w:after="120"/>
+      </w:pPr>
+    </w:p>
+    <w:tbl>
+      <w:tblPr>
+        <w:tblW w:type="dxa" w:w="9638"/>
+        <w:tblBorders>
+          <w:top w:val="single" w:color="auto" w:sz="4"/>
+          <w:left w:val="single" w:color="auto" w:sz="4"/>
+          <w:bottom w:val="single" w:color="auto" w:sz="4"/>
+          <w:right w:val="single" w:color="auto" w:sz="4"/>
+          <w:insideH w:val="single" w:color="auto" w:sz="4"/>
+          <w:insideV w:val="single" w:color="auto" w:sz="4"/>
+        </w:tblBorders>
+        <w:tblLayout w:type="fixed"/>
+      </w:tblPr>
+      <w:tblGrid>
+        <w:gridCol w:w="2200"/>
+        <w:gridCol w:w="1200"/>
+        <w:gridCol w:w="6238"/>
+      </w:tblGrid>
+      <w:tr>
+        <w:trPr>
+          <w:tblHeader/>
+        </w:trPr>
         <w:tc>
           <w:tcPr>
             <w:tcW w:type="dxa" w:w="2200"/>
@@ -5844,26 +5775,93 @@
               <w:bottom w:val="single" w:color="999999" w:sz="4"/>
               <w:right w:val="single" w:color="999999" w:sz="4"/>
             </w:tcBorders>
-            <w:tcMar>
-              <w:top w:type="dxa" w:w="60"/>
-              <w:left w:type="dxa" w:w="100"/>
-              <w:bottom w:type="dxa" w:w="60"/>
-              <w:right w:type="dxa" w:w="100"/>
-            </w:tcMar>
-          </w:tcPr>
-          <w:p>
-            <w:pPr>
-              <w:jc w:val="left"/>
-            </w:pPr>
-            <w:r>
-              <w:rPr>
-                <w:rFonts w:ascii="Arial" w:cs="Arial" w:eastAsia="Arial" w:hAnsi="Arial"/>
-                <w:b w:val="false"/>
-                <w:bCs w:val="false"/>
-                <w:sz w:val="18"/>
-                <w:szCs w:val="18"/>
-              </w:rPr>
-              <w:t xml:space="preserve">Hak mendapat penjelasan tidak terpenuhi</w:t>
+            <w:shd w:fill="D9E2F3" w:color="auto" w:val="clear"/>
+            <w:tcMar>
+              <w:top w:type="dxa" w:w="60"/>
+              <w:left w:type="dxa" w:w="100"/>
+              <w:bottom w:type="dxa" w:w="60"/>
+              <w:right w:type="dxa" w:w="100"/>
+            </w:tcMar>
+          </w:tcPr>
+          <w:p>
+            <w:pPr>
+              <w:jc w:val="left"/>
+            </w:pPr>
+            <w:r>
+              <w:rPr>
+                <w:rFonts w:ascii="Arial" w:cs="Arial" w:eastAsia="Arial" w:hAnsi="Arial"/>
+                <w:b/>
+                <w:bCs/>
+                <w:sz w:val="18"/>
+                <w:szCs w:val="18"/>
+              </w:rPr>
+              <w:t xml:space="preserve">Peran Pemohon</w:t>
+            </w:r>
+          </w:p>
+        </w:tc>
+        <w:tc>
+          <w:tcPr>
+            <w:tcW w:type="dxa" w:w="1200"/>
+            <w:tcBorders>
+              <w:top w:val="single" w:color="999999" w:sz="4"/>
+              <w:left w:val="single" w:color="999999" w:sz="4"/>
+              <w:bottom w:val="single" w:color="999999" w:sz="4"/>
+              <w:right w:val="single" w:color="999999" w:sz="4"/>
+            </w:tcBorders>
+            <w:shd w:fill="D9E2F3" w:color="auto" w:val="clear"/>
+            <w:tcMar>
+              <w:top w:type="dxa" w:w="60"/>
+              <w:left w:type="dxa" w:w="100"/>
+              <w:bottom w:type="dxa" w:w="60"/>
+              <w:right w:type="dxa" w:w="100"/>
+            </w:tcMar>
+          </w:tcPr>
+          <w:p>
+            <w:pPr>
+              <w:jc w:val="left"/>
+            </w:pPr>
+            <w:r>
+              <w:rPr>
+                <w:rFonts w:ascii="Arial" w:cs="Arial" w:eastAsia="Arial" w:hAnsi="Arial"/>
+                <w:b/>
+                <w:bCs/>
+                <w:sz w:val="18"/>
+                <w:szCs w:val="18"/>
+              </w:rPr>
+              <w:t xml:space="preserve">Jumlah</w:t>
+            </w:r>
+          </w:p>
+        </w:tc>
+        <w:tc>
+          <w:tcPr>
+            <w:tcW w:type="dxa" w:w="6238"/>
+            <w:tcBorders>
+              <w:top w:val="single" w:color="999999" w:sz="4"/>
+              <w:left w:val="single" w:color="999999" w:sz="4"/>
+              <w:bottom w:val="single" w:color="999999" w:sz="4"/>
+              <w:right w:val="single" w:color="999999" w:sz="4"/>
+            </w:tcBorders>
+            <w:shd w:fill="D9E2F3" w:color="auto" w:val="clear"/>
+            <w:tcMar>
+              <w:top w:type="dxa" w:w="60"/>
+              <w:left w:type="dxa" w:w="100"/>
+              <w:bottom w:type="dxa" w:w="60"/>
+              <w:right w:type="dxa" w:w="100"/>
+            </w:tcMar>
+          </w:tcPr>
+          <w:p>
+            <w:pPr>
+              <w:jc w:val="left"/>
+            </w:pPr>
+            <w:r>
+              <w:rPr>
+                <w:rFonts w:ascii="Arial" w:cs="Arial" w:eastAsia="Arial" w:hAnsi="Arial"/>
+                <w:b/>
+                <w:bCs/>
+                <w:sz w:val="18"/>
+                <w:szCs w:val="18"/>
+              </w:rPr>
+              <w:t xml:space="preserve">Tugas</w:t>
             </w:r>
           </w:p>
         </w:tc>
@@ -5874,102 +5872,6 @@
         </w:trPr>
         <w:tc>
           <w:tcPr>
-            <w:tcW w:type="dxa" w:w="1100"/>
-            <w:tcBorders>
-              <w:top w:val="single" w:color="999999" w:sz="4"/>
-              <w:left w:val="single" w:color="999999" w:sz="4"/>
-              <w:bottom w:val="single" w:color="999999" w:sz="4"/>
-              <w:right w:val="single" w:color="999999" w:sz="4"/>
-            </w:tcBorders>
-            <w:tcMar>
-              <w:top w:type="dxa" w:w="60"/>
-              <w:left w:type="dxa" w:w="100"/>
-              <w:bottom w:type="dxa" w:w="60"/>
-              <w:right w:type="dxa" w:w="100"/>
-            </w:tcMar>
-          </w:tcPr>
-          <w:p>
-            <w:pPr>
-              <w:jc w:val="left"/>
-            </w:pPr>
-            <w:r>
-              <w:rPr>
-                <w:rFonts w:ascii="Arial" w:cs="Arial" w:eastAsia="Arial" w:hAnsi="Arial"/>
-                <w:b w:val="false"/>
-                <w:bCs w:val="false"/>
-                <w:sz w:val="18"/>
-                <w:szCs w:val="18"/>
-              </w:rPr>
-              <w:t xml:space="preserve">Ahli 1</w:t>
-            </w:r>
-          </w:p>
-        </w:tc>
-        <w:tc>
-          <w:tcPr>
-            <w:tcW w:type="dxa" w:w="2300"/>
-            <w:tcBorders>
-              <w:top w:val="single" w:color="999999" w:sz="4"/>
-              <w:left w:val="single" w:color="999999" w:sz="4"/>
-              <w:bottom w:val="single" w:color="999999" w:sz="4"/>
-              <w:right w:val="single" w:color="999999" w:sz="4"/>
-            </w:tcBorders>
-            <w:tcMar>
-              <w:top w:type="dxa" w:w="60"/>
-              <w:left w:type="dxa" w:w="100"/>
-              <w:bottom w:type="dxa" w:w="60"/>
-              <w:right w:type="dxa" w:w="100"/>
-            </w:tcMar>
-          </w:tcPr>
-          <w:p>
-            <w:pPr>
-              <w:jc w:val="left"/>
-            </w:pPr>
-            <w:r>
-              <w:rPr>
-                <w:rFonts w:ascii="Arial" w:cs="Arial" w:eastAsia="Arial" w:hAnsi="Arial"/>
-                <w:b w:val="false"/>
-                <w:bCs w:val="false"/>
-                <w:sz w:val="18"/>
-                <w:szCs w:val="18"/>
-              </w:rPr>
-              <w:t xml:space="preserve">Prof. Dr. Aryani Kusumastuti, S.H., M.H. (Hukum Tata Negara)</w:t>
-            </w:r>
-          </w:p>
-        </w:tc>
-        <w:tc>
-          <w:tcPr>
-            <w:tcW w:type="dxa" w:w="4038"/>
-            <w:tcBorders>
-              <w:top w:val="single" w:color="999999" w:sz="4"/>
-              <w:left w:val="single" w:color="999999" w:sz="4"/>
-              <w:bottom w:val="single" w:color="999999" w:sz="4"/>
-              <w:right w:val="single" w:color="999999" w:sz="4"/>
-            </w:tcBorders>
-            <w:tcMar>
-              <w:top w:type="dxa" w:w="60"/>
-              <w:left w:type="dxa" w:w="100"/>
-              <w:bottom w:type="dxa" w:w="60"/>
-              <w:right w:type="dxa" w:w="100"/>
-            </w:tcMar>
-          </w:tcPr>
-          <w:p>
-            <w:pPr>
-              <w:jc w:val="left"/>
-            </w:pPr>
-            <w:r>
-              <w:rPr>
-                <w:rFonts w:ascii="Arial" w:cs="Arial" w:eastAsia="Arial" w:hAnsi="Arial"/>
-                <w:b w:val="false"/>
-                <w:bCs w:val="false"/>
-                <w:sz w:val="18"/>
-                <w:szCs w:val="18"/>
-              </w:rPr>
-              <w:t xml:space="preserve">Partisipasi bermakna (Putusan 91/PUU-XVIII/2020) secara analogis; expressio unius est exclusio alterius; kontradiksi Pasal 4 huruf c dan Pasal 8 ayat (7) dengan Pasal 8 ayat (2); alasan putusan bersyarat</w:t>
-            </w:r>
-          </w:p>
-        </w:tc>
-        <w:tc>
-          <w:tcPr>
             <w:tcW w:type="dxa" w:w="2200"/>
             <w:tcBorders>
               <w:top w:val="single" w:color="999999" w:sz="4"/>
@@ -5996,7 +5898,71 @@
                 <w:sz w:val="18"/>
                 <w:szCs w:val="18"/>
               </w:rPr>
-              <w:t xml:space="preserve">Inti konstitusionalitas</w:t>
+              <w:t xml:space="preserve">Kuasa hukum</w:t>
+            </w:r>
+          </w:p>
+        </w:tc>
+        <w:tc>
+          <w:tcPr>
+            <w:tcW w:type="dxa" w:w="1200"/>
+            <w:tcBorders>
+              <w:top w:val="single" w:color="999999" w:sz="4"/>
+              <w:left w:val="single" w:color="999999" w:sz="4"/>
+              <w:bottom w:val="single" w:color="999999" w:sz="4"/>
+              <w:right w:val="single" w:color="999999" w:sz="4"/>
+            </w:tcBorders>
+            <w:tcMar>
+              <w:top w:type="dxa" w:w="60"/>
+              <w:left w:type="dxa" w:w="100"/>
+              <w:bottom w:type="dxa" w:w="60"/>
+              <w:right w:type="dxa" w:w="100"/>
+            </w:tcMar>
+          </w:tcPr>
+          <w:p>
+            <w:pPr>
+              <w:jc w:val="left"/>
+            </w:pPr>
+            <w:r>
+              <w:rPr>
+                <w:rFonts w:ascii="Arial" w:cs="Arial" w:eastAsia="Arial" w:hAnsi="Arial"/>
+                <w:b w:val="false"/>
+                <w:bCs w:val="false"/>
+                <w:sz w:val="18"/>
+                <w:szCs w:val="18"/>
+              </w:rPr>
+              <w:t xml:space="preserve">5</w:t>
+            </w:r>
+          </w:p>
+        </w:tc>
+        <w:tc>
+          <w:tcPr>
+            <w:tcW w:type="dxa" w:w="6238"/>
+            <w:tcBorders>
+              <w:top w:val="single" w:color="999999" w:sz="4"/>
+              <w:left w:val="single" w:color="999999" w:sz="4"/>
+              <w:bottom w:val="single" w:color="999999" w:sz="4"/>
+              <w:right w:val="single" w:color="999999" w:sz="4"/>
+            </w:tcBorders>
+            <w:tcMar>
+              <w:top w:type="dxa" w:w="60"/>
+              <w:left w:type="dxa" w:w="100"/>
+              <w:bottom w:type="dxa" w:w="60"/>
+              <w:right w:type="dxa" w:w="100"/>
+            </w:tcMar>
+          </w:tcPr>
+          <w:p>
+            <w:pPr>
+              <w:jc w:val="left"/>
+            </w:pPr>
+            <w:r>
+              <w:rPr>
+                <w:rFonts w:ascii="Arial" w:cs="Arial" w:eastAsia="Arial" w:hAnsi="Arial"/>
+                <w:b w:val="false"/>
+                <w:bCs w:val="false"/>
+                <w:sz w:val="18"/>
+                <w:szCs w:val="18"/>
+              </w:rPr>
+              <w:t xml:space="preserve">1 koordinator; membacakan permohonan; memeriksa saksi dan ahli; bertanya kepada ahli Pemerintah; menyusun kesimpulan</w:t>
             </w:r>
           </w:p>
         </w:tc>
@@ -6007,102 +5973,6 @@
         </w:trPr>
         <w:tc>
           <w:tcPr>
-            <w:tcW w:type="dxa" w:w="1100"/>
-            <w:tcBorders>
-              <w:top w:val="single" w:color="999999" w:sz="4"/>
-              <w:left w:val="single" w:color="999999" w:sz="4"/>
-              <w:bottom w:val="single" w:color="999999" w:sz="4"/>
-              <w:right w:val="single" w:color="999999" w:sz="4"/>
-            </w:tcBorders>
-            <w:tcMar>
-              <w:top w:type="dxa" w:w="60"/>
-              <w:left w:type="dxa" w:w="100"/>
-              <w:bottom w:type="dxa" w:w="60"/>
-              <w:right w:type="dxa" w:w="100"/>
-            </w:tcMar>
-          </w:tcPr>
-          <w:p>
-            <w:pPr>
-              <w:jc w:val="left"/>
-            </w:pPr>
-            <w:r>
-              <w:rPr>
-                <w:rFonts w:ascii="Arial" w:cs="Arial" w:eastAsia="Arial" w:hAnsi="Arial"/>
-                <w:b w:val="false"/>
-                <w:bCs w:val="false"/>
-                <w:sz w:val="18"/>
-                <w:szCs w:val="18"/>
-              </w:rPr>
-              <w:t xml:space="preserve">Ahli 2</w:t>
-            </w:r>
-          </w:p>
-        </w:tc>
-        <w:tc>
-          <w:tcPr>
-            <w:tcW w:type="dxa" w:w="2300"/>
-            <w:tcBorders>
-              <w:top w:val="single" w:color="999999" w:sz="4"/>
-              <w:left w:val="single" w:color="999999" w:sz="4"/>
-              <w:bottom w:val="single" w:color="999999" w:sz="4"/>
-              <w:right w:val="single" w:color="999999" w:sz="4"/>
-            </w:tcBorders>
-            <w:tcMar>
-              <w:top w:type="dxa" w:w="60"/>
-              <w:left w:type="dxa" w:w="100"/>
-              <w:bottom w:type="dxa" w:w="60"/>
-              <w:right w:type="dxa" w:w="100"/>
-            </w:tcMar>
-          </w:tcPr>
-          <w:p>
-            <w:pPr>
-              <w:jc w:val="left"/>
-            </w:pPr>
-            <w:r>
-              <w:rPr>
-                <w:rFonts w:ascii="Arial" w:cs="Arial" w:eastAsia="Arial" w:hAnsi="Arial"/>
-                <w:b w:val="false"/>
-                <w:bCs w:val="false"/>
-                <w:sz w:val="18"/>
-                <w:szCs w:val="18"/>
-              </w:rPr>
-              <w:t xml:space="preserve">Dr. Bonifasius Tarigan, S.H., LL.M. (Hukum Administrasi Negara)</w:t>
-            </w:r>
-          </w:p>
-        </w:tc>
-        <w:tc>
-          <w:tcPr>
-            <w:tcW w:type="dxa" w:w="4038"/>
-            <w:tcBorders>
-              <w:top w:val="single" w:color="999999" w:sz="4"/>
-              <w:left w:val="single" w:color="999999" w:sz="4"/>
-              <w:bottom w:val="single" w:color="999999" w:sz="4"/>
-              <w:right w:val="single" w:color="999999" w:sz="4"/>
-            </w:tcBorders>
-            <w:tcMar>
-              <w:top w:type="dxa" w:w="60"/>
-              <w:left w:type="dxa" w:w="100"/>
-              <w:bottom w:type="dxa" w:w="60"/>
-              <w:right w:type="dxa" w:w="100"/>
-            </w:tcMar>
-          </w:tcPr>
-          <w:p>
-            <w:pPr>
-              <w:jc w:val="left"/>
-            </w:pPr>
-            <w:r>
-              <w:rPr>
-                <w:rFonts w:ascii="Arial" w:cs="Arial" w:eastAsia="Arial" w:hAnsi="Arial"/>
-                <w:b w:val="false"/>
-                <w:bCs w:val="false"/>
-                <w:sz w:val="18"/>
-                <w:szCs w:val="18"/>
-              </w:rPr>
-              <w:t xml:space="preserve">Kriteria bersifat mengatur tetapi berbentuk Keputusan, sehingga lolos dari jaminan partisipasi Pasal 96 UU 12/2011; asas keterbukaan; pembanding kewajiban partisipasi dalam standar pelayanan UU 25/2009</w:t>
-            </w:r>
-          </w:p>
-        </w:tc>
-        <w:tc>
-          <w:tcPr>
             <w:tcW w:type="dxa" w:w="2200"/>
             <w:tcBorders>
               <w:top w:val="single" w:color="999999" w:sz="4"/>
@@ -6129,7 +5999,71 @@
                 <w:sz w:val="18"/>
                 <w:szCs w:val="18"/>
               </w:rPr>
-              <w:t xml:space="preserve">Kekosongan jaminan partisipasi</w:t>
+              <w:t xml:space="preserve">Pemohon prinsipal</w:t>
+            </w:r>
+          </w:p>
+        </w:tc>
+        <w:tc>
+          <w:tcPr>
+            <w:tcW w:type="dxa" w:w="1200"/>
+            <w:tcBorders>
+              <w:top w:val="single" w:color="999999" w:sz="4"/>
+              <w:left w:val="single" w:color="999999" w:sz="4"/>
+              <w:bottom w:val="single" w:color="999999" w:sz="4"/>
+              <w:right w:val="single" w:color="999999" w:sz="4"/>
+            </w:tcBorders>
+            <w:tcMar>
+              <w:top w:type="dxa" w:w="60"/>
+              <w:left w:type="dxa" w:w="100"/>
+              <w:bottom w:type="dxa" w:w="60"/>
+              <w:right w:type="dxa" w:w="100"/>
+            </w:tcMar>
+          </w:tcPr>
+          <w:p>
+            <w:pPr>
+              <w:jc w:val="left"/>
+            </w:pPr>
+            <w:r>
+              <w:rPr>
+                <w:rFonts w:ascii="Arial" w:cs="Arial" w:eastAsia="Arial" w:hAnsi="Arial"/>
+                <w:b w:val="false"/>
+                <w:bCs w:val="false"/>
+                <w:sz w:val="18"/>
+                <w:szCs w:val="18"/>
+              </w:rPr>
+              <w:t xml:space="preserve">4</w:t>
+            </w:r>
+          </w:p>
+        </w:tc>
+        <w:tc>
+          <w:tcPr>
+            <w:tcW w:type="dxa" w:w="6238"/>
+            <w:tcBorders>
+              <w:top w:val="single" w:color="999999" w:sz="4"/>
+              <w:left w:val="single" w:color="999999" w:sz="4"/>
+              <w:bottom w:val="single" w:color="999999" w:sz="4"/>
+              <w:right w:val="single" w:color="999999" w:sz="4"/>
+            </w:tcBorders>
+            <w:tcMar>
+              <w:top w:type="dxa" w:w="60"/>
+              <w:left w:type="dxa" w:w="100"/>
+              <w:bottom w:type="dxa" w:w="60"/>
+              <w:right w:type="dxa" w:w="100"/>
+            </w:tcMar>
+          </w:tcPr>
+          <w:p>
+            <w:pPr>
+              <w:jc w:val="left"/>
+            </w:pPr>
+            <w:r>
+              <w:rPr>
+                <w:rFonts w:ascii="Arial" w:cs="Arial" w:eastAsia="Arial" w:hAnsi="Arial"/>
+                <w:b w:val="false"/>
+                <w:bCs w:val="false"/>
+                <w:sz w:val="18"/>
+                <w:szCs w:val="18"/>
+              </w:rPr>
+              <w:t xml:space="preserve">Pemohon I–IV; menyampaikan kerugian konstitusional masing-masing</w:t>
             </w:r>
           </w:p>
         </w:tc>
@@ -6140,102 +6074,6 @@
         </w:trPr>
         <w:tc>
           <w:tcPr>
-            <w:tcW w:type="dxa" w:w="1100"/>
-            <w:tcBorders>
-              <w:top w:val="single" w:color="999999" w:sz="4"/>
-              <w:left w:val="single" w:color="999999" w:sz="4"/>
-              <w:bottom w:val="single" w:color="999999" w:sz="4"/>
-              <w:right w:val="single" w:color="999999" w:sz="4"/>
-            </w:tcBorders>
-            <w:tcMar>
-              <w:top w:type="dxa" w:w="60"/>
-              <w:left w:type="dxa" w:w="100"/>
-              <w:bottom w:type="dxa" w:w="60"/>
-              <w:right w:type="dxa" w:w="100"/>
-            </w:tcMar>
-          </w:tcPr>
-          <w:p>
-            <w:pPr>
-              <w:jc w:val="left"/>
-            </w:pPr>
-            <w:r>
-              <w:rPr>
-                <w:rFonts w:ascii="Arial" w:cs="Arial" w:eastAsia="Arial" w:hAnsi="Arial"/>
-                <w:b w:val="false"/>
-                <w:bCs w:val="false"/>
-                <w:sz w:val="18"/>
-                <w:szCs w:val="18"/>
-              </w:rPr>
-              <w:t xml:space="preserve">Ahli 3</w:t>
-            </w:r>
-          </w:p>
-        </w:tc>
-        <w:tc>
-          <w:tcPr>
-            <w:tcW w:type="dxa" w:w="2300"/>
-            <w:tcBorders>
-              <w:top w:val="single" w:color="999999" w:sz="4"/>
-              <w:left w:val="single" w:color="999999" w:sz="4"/>
-              <w:bottom w:val="single" w:color="999999" w:sz="4"/>
-              <w:right w:val="single" w:color="999999" w:sz="4"/>
-            </w:tcBorders>
-            <w:tcMar>
-              <w:top w:type="dxa" w:w="60"/>
-              <w:left w:type="dxa" w:w="100"/>
-              <w:bottom w:type="dxa" w:w="60"/>
-              <w:right w:type="dxa" w:w="100"/>
-            </w:tcMar>
-          </w:tcPr>
-          <w:p>
-            <w:pPr>
-              <w:jc w:val="left"/>
-            </w:pPr>
-            <w:r>
-              <w:rPr>
-                <w:rFonts w:ascii="Arial" w:cs="Arial" w:eastAsia="Arial" w:hAnsi="Arial"/>
-                <w:b w:val="false"/>
-                <w:bCs w:val="false"/>
-                <w:sz w:val="18"/>
-                <w:szCs w:val="18"/>
-              </w:rPr>
-              <w:t xml:space="preserve">Dr. Maya Anggraini, M.Sc. (statistik dan kebijakan kemiskinan)</w:t>
-            </w:r>
-          </w:p>
-        </w:tc>
-        <w:tc>
-          <w:tcPr>
-            <w:tcW w:type="dxa" w:w="4038"/>
-            <w:tcBorders>
-              <w:top w:val="single" w:color="999999" w:sz="4"/>
-              <w:left w:val="single" w:color="999999" w:sz="4"/>
-              <w:bottom w:val="single" w:color="999999" w:sz="4"/>
-              <w:right w:val="single" w:color="999999" w:sz="4"/>
-            </w:tcBorders>
-            <w:tcMar>
-              <w:top w:type="dxa" w:w="60"/>
-              <w:left w:type="dxa" w:w="100"/>
-              <w:bottom w:type="dxa" w:w="60"/>
-              <w:right w:type="dxa" w:w="100"/>
-            </w:tcMar>
-          </w:tcPr>
-          <w:p>
-            <w:pPr>
-              <w:jc w:val="left"/>
-            </w:pPr>
-            <w:r>
-              <w:rPr>
-                <w:rFonts w:ascii="Arial" w:cs="Arial" w:eastAsia="Arial" w:hAnsi="Arial"/>
-                <w:b w:val="false"/>
-                <w:bCs w:val="false"/>
-                <w:sz w:val="18"/>
-                <w:szCs w:val="18"/>
-              </w:rPr>
-              <w:t xml:space="preserve">Cara kerja Proxy Means Test dan batasnya; desil relatif vs garis kemiskinan absolut; penargetan berbasis komunitas (Alatas dkk. 2012) dengan kelebihan dan kekurangannya; pentingnya publikasi variabel dan bobot</w:t>
-            </w:r>
-          </w:p>
-        </w:tc>
-        <w:tc>
-          <w:tcPr>
             <w:tcW w:type="dxa" w:w="2200"/>
             <w:tcBorders>
               <w:top w:val="single" w:color="999999" w:sz="4"/>
@@ -6262,7 +6100,71 @@
                 <w:sz w:val="18"/>
                 <w:szCs w:val="18"/>
               </w:rPr>
-              <w:t xml:space="preserve">Bukti empiris desil</w:t>
+              <w:t xml:space="preserve">Saksi</w:t>
+            </w:r>
+          </w:p>
+        </w:tc>
+        <w:tc>
+          <w:tcPr>
+            <w:tcW w:type="dxa" w:w="1200"/>
+            <w:tcBorders>
+              <w:top w:val="single" w:color="999999" w:sz="4"/>
+              <w:left w:val="single" w:color="999999" w:sz="4"/>
+              <w:bottom w:val="single" w:color="999999" w:sz="4"/>
+              <w:right w:val="single" w:color="999999" w:sz="4"/>
+            </w:tcBorders>
+            <w:tcMar>
+              <w:top w:type="dxa" w:w="60"/>
+              <w:left w:type="dxa" w:w="100"/>
+              <w:bottom w:type="dxa" w:w="60"/>
+              <w:right w:type="dxa" w:w="100"/>
+            </w:tcMar>
+          </w:tcPr>
+          <w:p>
+            <w:pPr>
+              <w:jc w:val="left"/>
+            </w:pPr>
+            <w:r>
+              <w:rPr>
+                <w:rFonts w:ascii="Arial" w:cs="Arial" w:eastAsia="Arial" w:hAnsi="Arial"/>
+                <w:b w:val="false"/>
+                <w:bCs w:val="false"/>
+                <w:sz w:val="18"/>
+                <w:szCs w:val="18"/>
+              </w:rPr>
+              <w:t xml:space="preserve">3</w:t>
+            </w:r>
+          </w:p>
+        </w:tc>
+        <w:tc>
+          <w:tcPr>
+            <w:tcW w:type="dxa" w:w="6238"/>
+            <w:tcBorders>
+              <w:top w:val="single" w:color="999999" w:sz="4"/>
+              <w:left w:val="single" w:color="999999" w:sz="4"/>
+              <w:bottom w:val="single" w:color="999999" w:sz="4"/>
+              <w:right w:val="single" w:color="999999" w:sz="4"/>
+            </w:tcBorders>
+            <w:tcMar>
+              <w:top w:type="dxa" w:w="60"/>
+              <w:left w:type="dxa" w:w="100"/>
+              <w:bottom w:type="dxa" w:w="60"/>
+              <w:right w:type="dxa" w:w="100"/>
+            </w:tcMar>
+          </w:tcPr>
+          <w:p>
+            <w:pPr>
+              <w:jc w:val="left"/>
+            </w:pPr>
+            <w:r>
+              <w:rPr>
+                <w:rFonts w:ascii="Arial" w:cs="Arial" w:eastAsia="Arial" w:hAnsi="Arial"/>
+                <w:b w:val="false"/>
+                <w:bCs w:val="false"/>
+                <w:sz w:val="18"/>
+                <w:szCs w:val="18"/>
+              </w:rPr>
+              <w:t xml:space="preserve">Saksi 1–3 (bagian 7)</w:t>
             </w:r>
           </w:p>
         </w:tc>
@@ -6273,102 +6175,6 @@
         </w:trPr>
         <w:tc>
           <w:tcPr>
-            <w:tcW w:type="dxa" w:w="1100"/>
-            <w:tcBorders>
-              <w:top w:val="single" w:color="999999" w:sz="4"/>
-              <w:left w:val="single" w:color="999999" w:sz="4"/>
-              <w:bottom w:val="single" w:color="999999" w:sz="4"/>
-              <w:right w:val="single" w:color="999999" w:sz="4"/>
-            </w:tcBorders>
-            <w:tcMar>
-              <w:top w:type="dxa" w:w="60"/>
-              <w:left w:type="dxa" w:w="100"/>
-              <w:bottom w:type="dxa" w:w="60"/>
-              <w:right w:type="dxa" w:w="100"/>
-            </w:tcMar>
-          </w:tcPr>
-          <w:p>
-            <w:pPr>
-              <w:jc w:val="left"/>
-            </w:pPr>
-            <w:r>
-              <w:rPr>
-                <w:rFonts w:ascii="Arial" w:cs="Arial" w:eastAsia="Arial" w:hAnsi="Arial"/>
-                <w:b w:val="false"/>
-                <w:bCs w:val="false"/>
-                <w:sz w:val="18"/>
-                <w:szCs w:val="18"/>
-              </w:rPr>
-              <w:t xml:space="preserve">Ahli 4 (opsional)</w:t>
-            </w:r>
-          </w:p>
-        </w:tc>
-        <w:tc>
-          <w:tcPr>
-            <w:tcW w:type="dxa" w:w="2300"/>
-            <w:tcBorders>
-              <w:top w:val="single" w:color="999999" w:sz="4"/>
-              <w:left w:val="single" w:color="999999" w:sz="4"/>
-              <w:bottom w:val="single" w:color="999999" w:sz="4"/>
-              <w:right w:val="single" w:color="999999" w:sz="4"/>
-            </w:tcBorders>
-            <w:tcMar>
-              <w:top w:type="dxa" w:w="60"/>
-              <w:left w:type="dxa" w:w="100"/>
-              <w:bottom w:type="dxa" w:w="60"/>
-              <w:right w:type="dxa" w:w="100"/>
-            </w:tcMar>
-          </w:tcPr>
-          <w:p>
-            <w:pPr>
-              <w:jc w:val="left"/>
-            </w:pPr>
-            <w:r>
-              <w:rPr>
-                <w:rFonts w:ascii="Arial" w:cs="Arial" w:eastAsia="Arial" w:hAnsi="Arial"/>
-                <w:b w:val="false"/>
-                <w:bCs w:val="false"/>
-                <w:sz w:val="18"/>
-                <w:szCs w:val="18"/>
-              </w:rPr>
-              <w:t xml:space="preserve">Dr. Yosephine Wattimena, S.H., M.A. (HAM)</w:t>
-            </w:r>
-          </w:p>
-        </w:tc>
-        <w:tc>
-          <w:tcPr>
-            <w:tcW w:type="dxa" w:w="4038"/>
-            <w:tcBorders>
-              <w:top w:val="single" w:color="999999" w:sz="4"/>
-              <w:left w:val="single" w:color="999999" w:sz="4"/>
-              <w:bottom w:val="single" w:color="999999" w:sz="4"/>
-              <w:right w:val="single" w:color="999999" w:sz="4"/>
-            </w:tcBorders>
-            <w:tcMar>
-              <w:top w:type="dxa" w:w="60"/>
-              <w:left w:type="dxa" w:w="100"/>
-              <w:bottom w:type="dxa" w:w="60"/>
-              <w:right w:type="dxa" w:w="100"/>
-            </w:tcMar>
-          </w:tcPr>
-          <w:p>
-            <w:pPr>
-              <w:jc w:val="left"/>
-            </w:pPr>
-            <w:r>
-              <w:rPr>
-                <w:rFonts w:ascii="Arial" w:cs="Arial" w:eastAsia="Arial" w:hAnsi="Arial"/>
-                <w:b w:val="false"/>
-                <w:bCs w:val="false"/>
-                <w:sz w:val="18"/>
-                <w:szCs w:val="18"/>
-              </w:rPr>
-              <w:t xml:space="preserve">Hak orang miskin berpartisipasi menurut Kovenan Hak Ekosob (UU 11/2005) dan UN Guiding Principles on Extreme Poverty (2012)</w:t>
-            </w:r>
-          </w:p>
-        </w:tc>
-        <w:tc>
-          <w:tcPr>
             <w:tcW w:type="dxa" w:w="2200"/>
             <w:tcBorders>
               <w:top w:val="single" w:color="999999" w:sz="4"/>
@@ -6395,7 +6201,71 @@
                 <w:sz w:val="18"/>
                 <w:szCs w:val="18"/>
               </w:rPr>
-              <w:t xml:space="preserve">Standar HAM internasional</w:t>
+              <w:t xml:space="preserve">Ahli</w:t>
+            </w:r>
+          </w:p>
+        </w:tc>
+        <w:tc>
+          <w:tcPr>
+            <w:tcW w:type="dxa" w:w="1200"/>
+            <w:tcBorders>
+              <w:top w:val="single" w:color="999999" w:sz="4"/>
+              <w:left w:val="single" w:color="999999" w:sz="4"/>
+              <w:bottom w:val="single" w:color="999999" w:sz="4"/>
+              <w:right w:val="single" w:color="999999" w:sz="4"/>
+            </w:tcBorders>
+            <w:tcMar>
+              <w:top w:type="dxa" w:w="60"/>
+              <w:left w:type="dxa" w:w="100"/>
+              <w:bottom w:type="dxa" w:w="60"/>
+              <w:right w:type="dxa" w:w="100"/>
+            </w:tcMar>
+          </w:tcPr>
+          <w:p>
+            <w:pPr>
+              <w:jc w:val="left"/>
+            </w:pPr>
+            <w:r>
+              <w:rPr>
+                <w:rFonts w:ascii="Arial" w:cs="Arial" w:eastAsia="Arial" w:hAnsi="Arial"/>
+                <w:b w:val="false"/>
+                <w:bCs w:val="false"/>
+                <w:sz w:val="18"/>
+                <w:szCs w:val="18"/>
+              </w:rPr>
+              <w:t xml:space="preserve">4</w:t>
+            </w:r>
+          </w:p>
+        </w:tc>
+        <w:tc>
+          <w:tcPr>
+            <w:tcW w:type="dxa" w:w="6238"/>
+            <w:tcBorders>
+              <w:top w:val="single" w:color="999999" w:sz="4"/>
+              <w:left w:val="single" w:color="999999" w:sz="4"/>
+              <w:bottom w:val="single" w:color="999999" w:sz="4"/>
+              <w:right w:val="single" w:color="999999" w:sz="4"/>
+            </w:tcBorders>
+            <w:tcMar>
+              <w:top w:type="dxa" w:w="60"/>
+              <w:left w:type="dxa" w:w="100"/>
+              <w:bottom w:type="dxa" w:w="60"/>
+              <w:right w:type="dxa" w:w="100"/>
+            </w:tcMar>
+          </w:tcPr>
+          <w:p>
+            <w:pPr>
+              <w:jc w:val="left"/>
+            </w:pPr>
+            <w:r>
+              <w:rPr>
+                <w:rFonts w:ascii="Arial" w:cs="Arial" w:eastAsia="Arial" w:hAnsi="Arial"/>
+                <w:b w:val="false"/>
+                <w:bCs w:val="false"/>
+                <w:sz w:val="18"/>
+                <w:szCs w:val="18"/>
+              </w:rPr>
+              <w:t xml:space="preserve">Ahli 1–4 (bagian 7)</w:t>
             </w:r>
           </w:p>
         </w:tc>
@@ -6403,8 +6273,14 @@
     </w:tbl>
     <w:p>
       <w:pPr>
-        <w:spacing w:after="120"/>
-      </w:pPr>
+        <w:pStyle w:val="Heading1"/>
+      </w:pPr>
+      <w:r>
+        <w:rPr>
+          <w:rFonts w:ascii="Arial" w:cs="Arial" w:eastAsia="Arial" w:hAnsi="Arial"/>
+        </w:rPr>
+        <w:t xml:space="preserve">7. Saksi dan Ahli Pihak Pemohon</w:t>
+      </w:r>
     </w:p>
     <w:p>
       <w:pPr>
@@ -6415,7 +6291,7 @@
         <w:rPr>
           <w:rFonts w:ascii="Arial" w:cs="Arial" w:eastAsia="Arial" w:hAnsi="Arial"/>
         </w:rPr>
-        <w:t xml:space="preserve">Ahli 3 wajib menyebut kedua sisi riset Alatas dkk.: berbasis komunitas lebih sesuai persepsi lokal, tetapi sedikit kalah akurat menurut konsumsi. Posisi kita: partisipasi </w:t>
+        <w:t xml:space="preserve">Semua saksi dan ahli kita </w:t>
       </w:r>
       <w:r>
         <w:rPr>
@@ -6423,169 +6299,1361 @@
           <w:b/>
           <w:bCs/>
         </w:rPr>
-        <w:t xml:space="preserve">melengkapi</w:t>
-      </w:r>
-      <w:r>
-        <w:rPr>
-          <w:rFonts w:ascii="Arial" w:cs="Arial" w:eastAsia="Arial" w:hAnsi="Arial"/>
-        </w:rPr>
-        <w:t xml:space="preserve"> metode statistik, bukan menggantikannya.</w:t>
-      </w:r>
-    </w:p>
-    <w:p>
-      <w:pPr>
-        <w:pStyle w:val="Heading1"/>
-      </w:pPr>
-      <w:r>
-        <w:rPr>
-          <w:rFonts w:ascii="Arial" w:cs="Arial" w:eastAsia="Arial" w:hAnsi="Arial"/>
-        </w:rPr>
-        <w:t xml:space="preserve">7. Yang Perlu Diputuskan Bersama</w:t>
-      </w:r>
-    </w:p>
-    <w:p>
-      <w:pPr>
-        <w:spacing w:after="120" w:line="276"/>
-        <w:jc w:val="both"/>
-      </w:pPr>
-      <w:r>
-        <w:rPr>
-          <w:rFonts w:ascii="Arial" w:cs="Arial" w:eastAsia="Arial" w:hAnsi="Arial"/>
-        </w:rPr>
-        <w:t xml:space="preserve">Enam hal ini perlu disepakati kelompok sebelum naskah permohonan ditulis.</w:t>
-      </w:r>
-    </w:p>
-    <w:p>
-      <w:pPr>
-        <w:spacing w:after="60"/>
-        <w:ind w:left="360"/>
-      </w:pPr>
-      <w:r>
-        <w:rPr>
-          <w:rFonts w:ascii="Arial" w:cs="Arial" w:eastAsia="Arial" w:hAnsi="Arial"/>
-        </w:rPr>
-        <w:t xml:space="preserve">☐  </w:t>
-      </w:r>
-      <w:r>
-        <w:rPr>
-          <w:rFonts w:ascii="Arial" w:cs="Arial" w:eastAsia="Arial" w:hAnsi="Arial"/>
-        </w:rPr>
-        <w:t xml:space="preserve">Pembagian 16 anggota: kuasa hukum, Pemohon I–IV, saksi, ahli, dan penyusun naskah</w:t>
-      </w:r>
-    </w:p>
-    <w:p>
-      <w:pPr>
-        <w:spacing w:after="60"/>
-        <w:ind w:left="360"/>
-      </w:pPr>
-      <w:r>
-        <w:rPr>
-          <w:rFonts w:ascii="Arial" w:cs="Arial" w:eastAsia="Arial" w:hAnsi="Arial"/>
-        </w:rPr>
-        <w:t xml:space="preserve">☐  </w:t>
-      </w:r>
-      <w:r>
-        <w:rPr>
-          <w:rFonts w:ascii="Arial" w:cs="Arial" w:eastAsia="Arial" w:hAnsi="Arial"/>
-        </w:rPr>
-        <w:t xml:space="preserve">Konfirmasi ke dosen: cukup masyarakat (Opsi A) atau ditambah pemerintah daerah (Opsi B) dalam petitum</w:t>
-      </w:r>
-    </w:p>
-    <w:p>
-      <w:pPr>
-        <w:spacing w:after="60"/>
-        <w:ind w:left="360"/>
-      </w:pPr>
-      <w:r>
-        <w:rPr>
-          <w:rFonts w:ascii="Arial" w:cs="Arial" w:eastAsia="Arial" w:hAnsi="Arial"/>
-        </w:rPr>
-        <w:t xml:space="preserve">☐  </w:t>
-      </w:r>
-      <w:r>
-        <w:rPr>
-          <w:rFonts w:ascii="Arial" w:cs="Arial" w:eastAsia="Arial" w:hAnsi="Arial"/>
-        </w:rPr>
-        <w:t xml:space="preserve">Konfirmasi ke dosen: frasa “termasuk fakir miskin” dalam petitum dipertahankan atau dihapus</w:t>
-      </w:r>
-    </w:p>
-    <w:p>
-      <w:pPr>
-        <w:spacing w:after="60"/>
-        <w:ind w:left="360"/>
-      </w:pPr>
-      <w:r>
-        <w:rPr>
-          <w:rFonts w:ascii="Arial" w:cs="Arial" w:eastAsia="Arial" w:hAnsi="Arial"/>
-        </w:rPr>
-        <w:t xml:space="preserve">☐  </w:t>
-      </w:r>
-      <w:r>
-        <w:rPr>
-          <w:rFonts w:ascii="Arial" w:cs="Arial" w:eastAsia="Arial" w:hAnsi="Arial"/>
-        </w:rPr>
-        <w:t xml:space="preserve">Perlu tidaknya Pemohon V, misalnya ibu rumah tangga di kontrakan yang tercatat desil 10, jika peran masih tersisa</w:t>
-      </w:r>
-    </w:p>
-    <w:p>
-      <w:pPr>
-        <w:spacing w:after="60"/>
-        <w:ind w:left="360"/>
-      </w:pPr>
-      <w:r>
-        <w:rPr>
-          <w:rFonts w:ascii="Arial" w:cs="Arial" w:eastAsia="Arial" w:hAnsi="Arial"/>
-        </w:rPr>
-        <w:t xml:space="preserve">☐  </w:t>
-      </w:r>
-      <w:r>
-        <w:rPr>
-          <w:rFonts w:ascii="Arial" w:cs="Arial" w:eastAsia="Arial" w:hAnsi="Arial"/>
-        </w:rPr>
-        <w:t xml:space="preserve">Pembagian tugas mengumpulkan bukti: teks Kepmensos 146/2013 dan 262/2022, Inpres 4/2025, Peraturan BPS 6/2025, Putusan MK 218/PUU-XXIII/2025, berita polemik desil</w:t>
-      </w:r>
-    </w:p>
-    <w:p>
-      <w:pPr>
-        <w:spacing w:after="60"/>
-        <w:ind w:left="360"/>
-      </w:pPr>
-      <w:r>
-        <w:rPr>
-          <w:rFonts w:ascii="Arial" w:cs="Arial" w:eastAsia="Arial" w:hAnsi="Arial"/>
-        </w:rPr>
-        <w:t xml:space="preserve">☐  </w:t>
-      </w:r>
-      <w:r>
-        <w:rPr>
-          <w:rFonts w:ascii="Arial" w:cs="Arial" w:eastAsia="Arial" w:hAnsi="Arial"/>
-        </w:rPr>
-        <w:t xml:space="preserve">Pembaruan fakta desil seminggu sebelum sidang simulasi</w:t>
-      </w:r>
-    </w:p>
-    <w:p>
-      <w:pPr>
-        <w:pStyle w:val="Heading1"/>
-      </w:pPr>
-      <w:r>
-        <w:rPr>
-          <w:rFonts w:ascii="Arial" w:cs="Arial" w:eastAsia="Arial" w:hAnsi="Arial"/>
-        </w:rPr>
-        <w:t xml:space="preserve">8. Sumber dan Catatan Verifikasi</w:t>
-      </w:r>
-    </w:p>
-    <w:p>
-      <w:pPr>
-        <w:spacing w:after="120" w:line="276"/>
-        <w:jc w:val="both"/>
-      </w:pPr>
-      <w:r>
-        <w:rPr>
-          <w:rFonts w:ascii="Arial" w:cs="Arial" w:eastAsia="Arial" w:hAnsi="Arial"/>
-        </w:rPr>
-        <w:t xml:space="preserve">Teks UU 13/2011 sudah dicek langsung dari PDF resmi (LN 2011 No. 83, TLN 5235). Fakta desil diambil dari hasil pencarian berita; sebagian halaman tidak bisa dibuka saat penyusunan, jadi buka dan cocokkan sebelum dikutip.</w:t>
-      </w:r>
-    </w:p>
+        <w:t xml:space="preserve">independen dari pemerintah</w:t>
+      </w:r>
+      <w:r>
+        <w:rPr>
+          <w:rFonts w:ascii="Arial" w:cs="Arial" w:eastAsia="Arial" w:hAnsi="Arial"/>
+        </w:rPr>
+        <w:t xml:space="preserve">, supaya tidak berebut peran dengan tim Pemerintah. Aparat pemerintah, petugas yang dikontrak kementerian, dan ahli yang membela metode resmi adalah wilayah alami Pemerintah.</w:t>
+      </w:r>
+    </w:p>
+    <w:tbl>
+      <w:tblPr>
+        <w:tblW w:type="dxa" w:w="9638"/>
+        <w:tblBorders>
+          <w:top w:val="single" w:color="auto" w:sz="4"/>
+          <w:left w:val="single" w:color="auto" w:sz="4"/>
+          <w:bottom w:val="single" w:color="auto" w:sz="4"/>
+          <w:right w:val="single" w:color="auto" w:sz="4"/>
+          <w:insideH w:val="single" w:color="auto" w:sz="4"/>
+          <w:insideV w:val="single" w:color="auto" w:sz="4"/>
+        </w:tblBorders>
+        <w:tblLayout w:type="fixed"/>
+      </w:tblPr>
+      <w:tblGrid>
+        <w:gridCol w:w="950"/>
+        <w:gridCol w:w="1500"/>
+        <w:gridCol w:w="1900"/>
+        <w:gridCol w:w="3288"/>
+        <w:gridCol w:w="2000"/>
+      </w:tblGrid>
+      <w:tr>
+        <w:trPr>
+          <w:tblHeader/>
+        </w:trPr>
+        <w:tc>
+          <w:tcPr>
+            <w:tcW w:type="dxa" w:w="950"/>
+            <w:tcBorders>
+              <w:top w:val="single" w:color="999999" w:sz="4"/>
+              <w:left w:val="single" w:color="999999" w:sz="4"/>
+              <w:bottom w:val="single" w:color="999999" w:sz="4"/>
+              <w:right w:val="single" w:color="999999" w:sz="4"/>
+            </w:tcBorders>
+            <w:shd w:fill="D9E2F3" w:color="auto" w:val="clear"/>
+            <w:tcMar>
+              <w:top w:type="dxa" w:w="60"/>
+              <w:left w:type="dxa" w:w="100"/>
+              <w:bottom w:type="dxa" w:w="60"/>
+              <w:right w:type="dxa" w:w="100"/>
+            </w:tcMar>
+          </w:tcPr>
+          <w:p>
+            <w:pPr>
+              <w:jc w:val="left"/>
+            </w:pPr>
+            <w:r>
+              <w:rPr>
+                <w:rFonts w:ascii="Arial" w:cs="Arial" w:eastAsia="Arial" w:hAnsi="Arial"/>
+                <w:b/>
+                <w:bCs/>
+                <w:sz w:val="18"/>
+                <w:szCs w:val="18"/>
+              </w:rPr>
+              <w:t xml:space="preserve">Peran</w:t>
+            </w:r>
+          </w:p>
+        </w:tc>
+        <w:tc>
+          <w:tcPr>
+            <w:tcW w:type="dxa" w:w="1500"/>
+            <w:tcBorders>
+              <w:top w:val="single" w:color="999999" w:sz="4"/>
+              <w:left w:val="single" w:color="999999" w:sz="4"/>
+              <w:bottom w:val="single" w:color="999999" w:sz="4"/>
+              <w:right w:val="single" w:color="999999" w:sz="4"/>
+            </w:tcBorders>
+            <w:shd w:fill="D9E2F3" w:color="auto" w:val="clear"/>
+            <w:tcMar>
+              <w:top w:type="dxa" w:w="60"/>
+              <w:left w:type="dxa" w:w="100"/>
+              <w:bottom w:type="dxa" w:w="60"/>
+              <w:right w:type="dxa" w:w="100"/>
+            </w:tcMar>
+          </w:tcPr>
+          <w:p>
+            <w:pPr>
+              <w:jc w:val="left"/>
+            </w:pPr>
+            <w:r>
+              <w:rPr>
+                <w:rFonts w:ascii="Arial" w:cs="Arial" w:eastAsia="Arial" w:hAnsi="Arial"/>
+                <w:b/>
+                <w:bCs/>
+                <w:sz w:val="18"/>
+                <w:szCs w:val="18"/>
+              </w:rPr>
+              <w:t xml:space="preserve">Nama (fiktif)</w:t>
+            </w:r>
+          </w:p>
+        </w:tc>
+        <w:tc>
+          <w:tcPr>
+            <w:tcW w:type="dxa" w:w="1900"/>
+            <w:tcBorders>
+              <w:top w:val="single" w:color="999999" w:sz="4"/>
+              <w:left w:val="single" w:color="999999" w:sz="4"/>
+              <w:bottom w:val="single" w:color="999999" w:sz="4"/>
+              <w:right w:val="single" w:color="999999" w:sz="4"/>
+            </w:tcBorders>
+            <w:shd w:fill="D9E2F3" w:color="auto" w:val="clear"/>
+            <w:tcMar>
+              <w:top w:type="dxa" w:w="60"/>
+              <w:left w:type="dxa" w:w="100"/>
+              <w:bottom w:type="dxa" w:w="60"/>
+              <w:right w:type="dxa" w:w="100"/>
+            </w:tcMar>
+          </w:tcPr>
+          <w:p>
+            <w:pPr>
+              <w:jc w:val="left"/>
+            </w:pPr>
+            <w:r>
+              <w:rPr>
+                <w:rFonts w:ascii="Arial" w:cs="Arial" w:eastAsia="Arial" w:hAnsi="Arial"/>
+                <w:b/>
+                <w:bCs/>
+                <w:sz w:val="18"/>
+                <w:szCs w:val="18"/>
+              </w:rPr>
+              <w:t xml:space="preserve">Latar</w:t>
+            </w:r>
+          </w:p>
+        </w:tc>
+        <w:tc>
+          <w:tcPr>
+            <w:tcW w:type="dxa" w:w="3288"/>
+            <w:tcBorders>
+              <w:top w:val="single" w:color="999999" w:sz="4"/>
+              <w:left w:val="single" w:color="999999" w:sz="4"/>
+              <w:bottom w:val="single" w:color="999999" w:sz="4"/>
+              <w:right w:val="single" w:color="999999" w:sz="4"/>
+            </w:tcBorders>
+            <w:shd w:fill="D9E2F3" w:color="auto" w:val="clear"/>
+            <w:tcMar>
+              <w:top w:type="dxa" w:w="60"/>
+              <w:left w:type="dxa" w:w="100"/>
+              <w:bottom w:type="dxa" w:w="60"/>
+              <w:right w:type="dxa" w:w="100"/>
+            </w:tcMar>
+          </w:tcPr>
+          <w:p>
+            <w:pPr>
+              <w:jc w:val="left"/>
+            </w:pPr>
+            <w:r>
+              <w:rPr>
+                <w:rFonts w:ascii="Arial" w:cs="Arial" w:eastAsia="Arial" w:hAnsi="Arial"/>
+                <w:b/>
+                <w:bCs/>
+                <w:sz w:val="18"/>
+                <w:szCs w:val="18"/>
+              </w:rPr>
+              <w:t xml:space="preserve">Pokok keterangan</w:t>
+            </w:r>
+          </w:p>
+        </w:tc>
+        <w:tc>
+          <w:tcPr>
+            <w:tcW w:type="dxa" w:w="2000"/>
+            <w:tcBorders>
+              <w:top w:val="single" w:color="999999" w:sz="4"/>
+              <w:left w:val="single" w:color="999999" w:sz="4"/>
+              <w:bottom w:val="single" w:color="999999" w:sz="4"/>
+              <w:right w:val="single" w:color="999999" w:sz="4"/>
+            </w:tcBorders>
+            <w:shd w:fill="D9E2F3" w:color="auto" w:val="clear"/>
+            <w:tcMar>
+              <w:top w:type="dxa" w:w="60"/>
+              <w:left w:type="dxa" w:w="100"/>
+              <w:bottom w:type="dxa" w:w="60"/>
+              <w:right w:type="dxa" w:w="100"/>
+            </w:tcMar>
+          </w:tcPr>
+          <w:p>
+            <w:pPr>
+              <w:jc w:val="left"/>
+            </w:pPr>
+            <w:r>
+              <w:rPr>
+                <w:rFonts w:ascii="Arial" w:cs="Arial" w:eastAsia="Arial" w:hAnsi="Arial"/>
+                <w:b/>
+                <w:bCs/>
+                <w:sz w:val="18"/>
+                <w:szCs w:val="18"/>
+              </w:rPr>
+              <w:t xml:space="preserve">Dalil yang dibuktikan</w:t>
+            </w:r>
+          </w:p>
+        </w:tc>
+      </w:tr>
+      <w:tr>
+        <w:trPr>
+          <w:cantSplit/>
+        </w:trPr>
+        <w:tc>
+          <w:tcPr>
+            <w:tcW w:type="dxa" w:w="950"/>
+            <w:tcBorders>
+              <w:top w:val="single" w:color="999999" w:sz="4"/>
+              <w:left w:val="single" w:color="999999" w:sz="4"/>
+              <w:bottom w:val="single" w:color="999999" w:sz="4"/>
+              <w:right w:val="single" w:color="999999" w:sz="4"/>
+            </w:tcBorders>
+            <w:tcMar>
+              <w:top w:type="dxa" w:w="60"/>
+              <w:left w:type="dxa" w:w="100"/>
+              <w:bottom w:type="dxa" w:w="60"/>
+              <w:right w:type="dxa" w:w="100"/>
+            </w:tcMar>
+          </w:tcPr>
+          <w:p>
+            <w:pPr>
+              <w:jc w:val="left"/>
+            </w:pPr>
+            <w:r>
+              <w:rPr>
+                <w:rFonts w:ascii="Arial" w:cs="Arial" w:eastAsia="Arial" w:hAnsi="Arial"/>
+                <w:b w:val="false"/>
+                <w:bCs w:val="false"/>
+                <w:sz w:val="18"/>
+                <w:szCs w:val="18"/>
+              </w:rPr>
+              <w:t xml:space="preserve">Saksi 1</w:t>
+            </w:r>
+          </w:p>
+        </w:tc>
+        <w:tc>
+          <w:tcPr>
+            <w:tcW w:type="dxa" w:w="1500"/>
+            <w:tcBorders>
+              <w:top w:val="single" w:color="999999" w:sz="4"/>
+              <w:left w:val="single" w:color="999999" w:sz="4"/>
+              <w:bottom w:val="single" w:color="999999" w:sz="4"/>
+              <w:right w:val="single" w:color="999999" w:sz="4"/>
+            </w:tcBorders>
+            <w:tcMar>
+              <w:top w:type="dxa" w:w="60"/>
+              <w:left w:type="dxa" w:w="100"/>
+              <w:bottom w:type="dxa" w:w="60"/>
+              <w:right w:type="dxa" w:w="100"/>
+            </w:tcMar>
+          </w:tcPr>
+          <w:p>
+            <w:pPr>
+              <w:jc w:val="left"/>
+            </w:pPr>
+            <w:r>
+              <w:rPr>
+                <w:rFonts w:ascii="Arial" w:cs="Arial" w:eastAsia="Arial" w:hAnsi="Arial"/>
+                <w:b w:val="false"/>
+                <w:bCs w:val="false"/>
+                <w:sz w:val="18"/>
+                <w:szCs w:val="18"/>
+              </w:rPr>
+              <w:t xml:space="preserve">Yuliani Hasibuan</w:t>
+            </w:r>
+          </w:p>
+        </w:tc>
+        <w:tc>
+          <w:tcPr>
+            <w:tcW w:type="dxa" w:w="1900"/>
+            <w:tcBorders>
+              <w:top w:val="single" w:color="999999" w:sz="4"/>
+              <w:left w:val="single" w:color="999999" w:sz="4"/>
+              <w:bottom w:val="single" w:color="999999" w:sz="4"/>
+              <w:right w:val="single" w:color="999999" w:sz="4"/>
+            </w:tcBorders>
+            <w:tcMar>
+              <w:top w:type="dxa" w:w="60"/>
+              <w:left w:type="dxa" w:w="100"/>
+              <w:bottom w:type="dxa" w:w="60"/>
+              <w:right w:type="dxa" w:w="100"/>
+            </w:tcMar>
+          </w:tcPr>
+          <w:p>
+            <w:pPr>
+              <w:jc w:val="left"/>
+            </w:pPr>
+            <w:r>
+              <w:rPr>
+                <w:rFonts w:ascii="Arial" w:cs="Arial" w:eastAsia="Arial" w:hAnsi="Arial"/>
+                <w:b w:val="false"/>
+                <w:bCs w:val="false"/>
+                <w:sz w:val="18"/>
+                <w:szCs w:val="18"/>
+              </w:rPr>
+              <w:t xml:space="preserve">Relawan posko pengaduan warga di Kota Bandung, tidak terkait para Pemohon dan bukan pegawai pemerintah</w:t>
+            </w:r>
+          </w:p>
+        </w:tc>
+        <w:tc>
+          <w:tcPr>
+            <w:tcW w:type="dxa" w:w="3288"/>
+            <w:tcBorders>
+              <w:top w:val="single" w:color="999999" w:sz="4"/>
+              <w:left w:val="single" w:color="999999" w:sz="4"/>
+              <w:bottom w:val="single" w:color="999999" w:sz="4"/>
+              <w:right w:val="single" w:color="999999" w:sz="4"/>
+            </w:tcBorders>
+            <w:tcMar>
+              <w:top w:type="dxa" w:w="60"/>
+              <w:left w:type="dxa" w:w="100"/>
+              <w:bottom w:type="dxa" w:w="60"/>
+              <w:right w:type="dxa" w:w="100"/>
+            </w:tcMar>
+          </w:tcPr>
+          <w:p>
+            <w:pPr>
+              <w:jc w:val="left"/>
+            </w:pPr>
+            <w:r>
+              <w:rPr>
+                <w:rFonts w:ascii="Arial" w:cs="Arial" w:eastAsia="Arial" w:hAnsi="Arial"/>
+                <w:b w:val="false"/>
+                <w:bCs w:val="false"/>
+                <w:sz w:val="18"/>
+                <w:szCs w:val="18"/>
+              </w:rPr>
+              <w:t xml:space="preserve">Menerima banyak aduan warga yang desilnya melonjak; tidak ada kanal untuk menyampaikan keberatan atas kriteria, hanya atas data</w:t>
+            </w:r>
+          </w:p>
+        </w:tc>
+        <w:tc>
+          <w:tcPr>
+            <w:tcW w:type="dxa" w:w="2000"/>
+            <w:tcBorders>
+              <w:top w:val="single" w:color="999999" w:sz="4"/>
+              <w:left w:val="single" w:color="999999" w:sz="4"/>
+              <w:bottom w:val="single" w:color="999999" w:sz="4"/>
+              <w:right w:val="single" w:color="999999" w:sz="4"/>
+            </w:tcBorders>
+            <w:tcMar>
+              <w:top w:type="dxa" w:w="60"/>
+              <w:left w:type="dxa" w:w="100"/>
+              <w:bottom w:type="dxa" w:w="60"/>
+              <w:right w:type="dxa" w:w="100"/>
+            </w:tcMar>
+          </w:tcPr>
+          <w:p>
+            <w:pPr>
+              <w:jc w:val="left"/>
+            </w:pPr>
+            <w:r>
+              <w:rPr>
+                <w:rFonts w:ascii="Arial" w:cs="Arial" w:eastAsia="Arial" w:hAnsi="Arial"/>
+                <w:b w:val="false"/>
+                <w:bCs w:val="false"/>
+                <w:sz w:val="18"/>
+                <w:szCs w:val="18"/>
+              </w:rPr>
+              <w:t xml:space="preserve">Hak didengar dan hak mendapat penjelasan tidak terpenuhi</w:t>
+            </w:r>
+          </w:p>
+        </w:tc>
+      </w:tr>
+      <w:tr>
+        <w:trPr>
+          <w:cantSplit/>
+        </w:trPr>
+        <w:tc>
+          <w:tcPr>
+            <w:tcW w:type="dxa" w:w="950"/>
+            <w:tcBorders>
+              <w:top w:val="single" w:color="999999" w:sz="4"/>
+              <w:left w:val="single" w:color="999999" w:sz="4"/>
+              <w:bottom w:val="single" w:color="999999" w:sz="4"/>
+              <w:right w:val="single" w:color="999999" w:sz="4"/>
+            </w:tcBorders>
+            <w:tcMar>
+              <w:top w:type="dxa" w:w="60"/>
+              <w:left w:type="dxa" w:w="100"/>
+              <w:bottom w:type="dxa" w:w="60"/>
+              <w:right w:type="dxa" w:w="100"/>
+            </w:tcMar>
+          </w:tcPr>
+          <w:p>
+            <w:pPr>
+              <w:jc w:val="left"/>
+            </w:pPr>
+            <w:r>
+              <w:rPr>
+                <w:rFonts w:ascii="Arial" w:cs="Arial" w:eastAsia="Arial" w:hAnsi="Arial"/>
+                <w:b w:val="false"/>
+                <w:bCs w:val="false"/>
+                <w:sz w:val="18"/>
+                <w:szCs w:val="18"/>
+              </w:rPr>
+              <w:t xml:space="preserve">Saksi 2</w:t>
+            </w:r>
+          </w:p>
+        </w:tc>
+        <w:tc>
+          <w:tcPr>
+            <w:tcW w:type="dxa" w:w="1500"/>
+            <w:tcBorders>
+              <w:top w:val="single" w:color="999999" w:sz="4"/>
+              <w:left w:val="single" w:color="999999" w:sz="4"/>
+              <w:bottom w:val="single" w:color="999999" w:sz="4"/>
+              <w:right w:val="single" w:color="999999" w:sz="4"/>
+            </w:tcBorders>
+            <w:tcMar>
+              <w:top w:type="dxa" w:w="60"/>
+              <w:left w:type="dxa" w:w="100"/>
+              <w:bottom w:type="dxa" w:w="60"/>
+              <w:right w:type="dxa" w:w="100"/>
+            </w:tcMar>
+          </w:tcPr>
+          <w:p>
+            <w:pPr>
+              <w:jc w:val="left"/>
+            </w:pPr>
+            <w:r>
+              <w:rPr>
+                <w:rFonts w:ascii="Arial" w:cs="Arial" w:eastAsia="Arial" w:hAnsi="Arial"/>
+                <w:b w:val="false"/>
+                <w:bCs w:val="false"/>
+                <w:sz w:val="18"/>
+                <w:szCs w:val="18"/>
+              </w:rPr>
+              <w:t xml:space="preserve">Mak Onah</w:t>
+            </w:r>
+          </w:p>
+        </w:tc>
+        <w:tc>
+          <w:tcPr>
+            <w:tcW w:type="dxa" w:w="1900"/>
+            <w:tcBorders>
+              <w:top w:val="single" w:color="999999" w:sz="4"/>
+              <w:left w:val="single" w:color="999999" w:sz="4"/>
+              <w:bottom w:val="single" w:color="999999" w:sz="4"/>
+              <w:right w:val="single" w:color="999999" w:sz="4"/>
+            </w:tcBorders>
+            <w:tcMar>
+              <w:top w:type="dxa" w:w="60"/>
+              <w:left w:type="dxa" w:w="100"/>
+              <w:bottom w:type="dxa" w:w="60"/>
+              <w:right w:type="dxa" w:w="100"/>
+            </w:tcMar>
+          </w:tcPr>
+          <w:p>
+            <w:pPr>
+              <w:jc w:val="left"/>
+            </w:pPr>
+            <w:r>
+              <w:rPr>
+                <w:rFonts w:ascii="Arial" w:cs="Arial" w:eastAsia="Arial" w:hAnsi="Arial"/>
+                <w:b w:val="false"/>
+                <w:bCs w:val="false"/>
+                <w:sz w:val="18"/>
+                <w:szCs w:val="18"/>
+              </w:rPr>
+              <w:t xml:space="preserve">Lansia janda, tetangga Pemohon I, penghasilan dari jualan gorengan</w:t>
+            </w:r>
+          </w:p>
+        </w:tc>
+        <w:tc>
+          <w:tcPr>
+            <w:tcW w:type="dxa" w:w="3288"/>
+            <w:tcBorders>
+              <w:top w:val="single" w:color="999999" w:sz="4"/>
+              <w:left w:val="single" w:color="999999" w:sz="4"/>
+              <w:bottom w:val="single" w:color="999999" w:sz="4"/>
+              <w:right w:val="single" w:color="999999" w:sz="4"/>
+            </w:tcBorders>
+            <w:tcMar>
+              <w:top w:type="dxa" w:w="60"/>
+              <w:left w:type="dxa" w:w="100"/>
+              <w:bottom w:type="dxa" w:w="60"/>
+              <w:right w:type="dxa" w:w="100"/>
+            </w:tcMar>
+          </w:tcPr>
+          <w:p>
+            <w:pPr>
+              <w:jc w:val="left"/>
+            </w:pPr>
+            <w:r>
+              <w:rPr>
+                <w:rFonts w:ascii="Arial" w:cs="Arial" w:eastAsia="Arial" w:hAnsi="Arial"/>
+                <w:b w:val="false"/>
+                <w:bCs w:val="false"/>
+                <w:sz w:val="18"/>
+                <w:szCs w:val="18"/>
+              </w:rPr>
+              <w:t xml:space="preserve">Tercoret setelah pembaruan DTSEN; sudah mengajukan sanggah tanpa penjelasan</w:t>
+            </w:r>
+          </w:p>
+        </w:tc>
+        <w:tc>
+          <w:tcPr>
+            <w:tcW w:type="dxa" w:w="2000"/>
+            <w:tcBorders>
+              <w:top w:val="single" w:color="999999" w:sz="4"/>
+              <w:left w:val="single" w:color="999999" w:sz="4"/>
+              <w:bottom w:val="single" w:color="999999" w:sz="4"/>
+              <w:right w:val="single" w:color="999999" w:sz="4"/>
+            </w:tcBorders>
+            <w:tcMar>
+              <w:top w:type="dxa" w:w="60"/>
+              <w:left w:type="dxa" w:w="100"/>
+              <w:bottom w:type="dxa" w:w="60"/>
+              <w:right w:type="dxa" w:w="100"/>
+            </w:tcMar>
+          </w:tcPr>
+          <w:p>
+            <w:pPr>
+              <w:jc w:val="left"/>
+            </w:pPr>
+            <w:r>
+              <w:rPr>
+                <w:rFonts w:ascii="Arial" w:cs="Arial" w:eastAsia="Arial" w:hAnsi="Arial"/>
+                <w:b w:val="false"/>
+                <w:bCs w:val="false"/>
+                <w:sz w:val="18"/>
+                <w:szCs w:val="18"/>
+              </w:rPr>
+              <w:t xml:space="preserve">Kasus Pemohon I bukan kasus tunggal</w:t>
+            </w:r>
+          </w:p>
+        </w:tc>
+      </w:tr>
+      <w:tr>
+        <w:trPr>
+          <w:cantSplit/>
+        </w:trPr>
+        <w:tc>
+          <w:tcPr>
+            <w:tcW w:type="dxa" w:w="950"/>
+            <w:tcBorders>
+              <w:top w:val="single" w:color="999999" w:sz="4"/>
+              <w:left w:val="single" w:color="999999" w:sz="4"/>
+              <w:bottom w:val="single" w:color="999999" w:sz="4"/>
+              <w:right w:val="single" w:color="999999" w:sz="4"/>
+            </w:tcBorders>
+            <w:tcMar>
+              <w:top w:type="dxa" w:w="60"/>
+              <w:left w:type="dxa" w:w="100"/>
+              <w:bottom w:type="dxa" w:w="60"/>
+              <w:right w:type="dxa" w:w="100"/>
+            </w:tcMar>
+          </w:tcPr>
+          <w:p>
+            <w:pPr>
+              <w:jc w:val="left"/>
+            </w:pPr>
+            <w:r>
+              <w:rPr>
+                <w:rFonts w:ascii="Arial" w:cs="Arial" w:eastAsia="Arial" w:hAnsi="Arial"/>
+                <w:b w:val="false"/>
+                <w:bCs w:val="false"/>
+                <w:sz w:val="18"/>
+                <w:szCs w:val="18"/>
+              </w:rPr>
+              <w:t xml:space="preserve">Saksi 3</w:t>
+            </w:r>
+          </w:p>
+        </w:tc>
+        <w:tc>
+          <w:tcPr>
+            <w:tcW w:type="dxa" w:w="1500"/>
+            <w:tcBorders>
+              <w:top w:val="single" w:color="999999" w:sz="4"/>
+              <w:left w:val="single" w:color="999999" w:sz="4"/>
+              <w:bottom w:val="single" w:color="999999" w:sz="4"/>
+              <w:right w:val="single" w:color="999999" w:sz="4"/>
+            </w:tcBorders>
+            <w:tcMar>
+              <w:top w:type="dxa" w:w="60"/>
+              <w:left w:type="dxa" w:w="100"/>
+              <w:bottom w:type="dxa" w:w="60"/>
+              <w:right w:type="dxa" w:w="100"/>
+            </w:tcMar>
+          </w:tcPr>
+          <w:p>
+            <w:pPr>
+              <w:jc w:val="left"/>
+            </w:pPr>
+            <w:r>
+              <w:rPr>
+                <w:rFonts w:ascii="Arial" w:cs="Arial" w:eastAsia="Arial" w:hAnsi="Arial"/>
+                <w:b w:val="false"/>
+                <w:bCs w:val="false"/>
+                <w:sz w:val="18"/>
+                <w:szCs w:val="18"/>
+              </w:rPr>
+              <w:t xml:space="preserve">Daeng Sultan</w:t>
+            </w:r>
+          </w:p>
+        </w:tc>
+        <w:tc>
+          <w:tcPr>
+            <w:tcW w:type="dxa" w:w="1900"/>
+            <w:tcBorders>
+              <w:top w:val="single" w:color="999999" w:sz="4"/>
+              <w:left w:val="single" w:color="999999" w:sz="4"/>
+              <w:bottom w:val="single" w:color="999999" w:sz="4"/>
+              <w:right w:val="single" w:color="999999" w:sz="4"/>
+            </w:tcBorders>
+            <w:tcMar>
+              <w:top w:type="dxa" w:w="60"/>
+              <w:left w:type="dxa" w:w="100"/>
+              <w:bottom w:type="dxa" w:w="60"/>
+              <w:right w:type="dxa" w:w="100"/>
+            </w:tcMar>
+          </w:tcPr>
+          <w:p>
+            <w:pPr>
+              <w:jc w:val="left"/>
+            </w:pPr>
+            <w:r>
+              <w:rPr>
+                <w:rFonts w:ascii="Arial" w:cs="Arial" w:eastAsia="Arial" w:hAnsi="Arial"/>
+                <w:b w:val="false"/>
+                <w:bCs w:val="false"/>
+                <w:sz w:val="18"/>
+                <w:szCs w:val="18"/>
+              </w:rPr>
+              <w:t xml:space="preserve">Ketua kelompok usaha bersama nelayan di Kab. Kepulauan Selayar</w:t>
+            </w:r>
+          </w:p>
+        </w:tc>
+        <w:tc>
+          <w:tcPr>
+            <w:tcW w:type="dxa" w:w="3288"/>
+            <w:tcBorders>
+              <w:top w:val="single" w:color="999999" w:sz="4"/>
+              <w:left w:val="single" w:color="999999" w:sz="4"/>
+              <w:bottom w:val="single" w:color="999999" w:sz="4"/>
+              <w:right w:val="single" w:color="999999" w:sz="4"/>
+            </w:tcBorders>
+            <w:tcMar>
+              <w:top w:type="dxa" w:w="60"/>
+              <w:left w:type="dxa" w:w="100"/>
+              <w:bottom w:type="dxa" w:w="60"/>
+              <w:right w:type="dxa" w:w="100"/>
+            </w:tcMar>
+          </w:tcPr>
+          <w:p>
+            <w:pPr>
+              <w:jc w:val="left"/>
+            </w:pPr>
+            <w:r>
+              <w:rPr>
+                <w:rFonts w:ascii="Arial" w:cs="Arial" w:eastAsia="Arial" w:hAnsi="Arial"/>
+                <w:b w:val="false"/>
+                <w:bCs w:val="false"/>
+                <w:sz w:val="18"/>
+                <w:szCs w:val="18"/>
+              </w:rPr>
+              <w:t xml:space="preserve">Kondisi rumah panggung dan penghasilan musiman nelayan; kelompoknya tidak pernah dimintai pendapat soal kriteria</w:t>
+            </w:r>
+          </w:p>
+        </w:tc>
+        <w:tc>
+          <w:tcPr>
+            <w:tcW w:type="dxa" w:w="2000"/>
+            <w:tcBorders>
+              <w:top w:val="single" w:color="999999" w:sz="4"/>
+              <w:left w:val="single" w:color="999999" w:sz="4"/>
+              <w:bottom w:val="single" w:color="999999" w:sz="4"/>
+              <w:right w:val="single" w:color="999999" w:sz="4"/>
+            </w:tcBorders>
+            <w:tcMar>
+              <w:top w:type="dxa" w:w="60"/>
+              <w:left w:type="dxa" w:w="100"/>
+              <w:bottom w:type="dxa" w:w="60"/>
+              <w:right w:type="dxa" w:w="100"/>
+            </w:tcMar>
+          </w:tcPr>
+          <w:p>
+            <w:pPr>
+              <w:jc w:val="left"/>
+            </w:pPr>
+            <w:r>
+              <w:rPr>
+                <w:rFonts w:ascii="Arial" w:cs="Arial" w:eastAsia="Arial" w:hAnsi="Arial"/>
+                <w:b w:val="false"/>
+                <w:bCs w:val="false"/>
+                <w:sz w:val="18"/>
+                <w:szCs w:val="18"/>
+              </w:rPr>
+              <w:t xml:space="preserve">Kearifan lokal tidak terbaca tanpa partisipasi</w:t>
+            </w:r>
+          </w:p>
+        </w:tc>
+      </w:tr>
+      <w:tr>
+        <w:trPr>
+          <w:cantSplit/>
+        </w:trPr>
+        <w:tc>
+          <w:tcPr>
+            <w:tcW w:type="dxa" w:w="950"/>
+            <w:tcBorders>
+              <w:top w:val="single" w:color="999999" w:sz="4"/>
+              <w:left w:val="single" w:color="999999" w:sz="4"/>
+              <w:bottom w:val="single" w:color="999999" w:sz="4"/>
+              <w:right w:val="single" w:color="999999" w:sz="4"/>
+            </w:tcBorders>
+            <w:tcMar>
+              <w:top w:type="dxa" w:w="60"/>
+              <w:left w:type="dxa" w:w="100"/>
+              <w:bottom w:type="dxa" w:w="60"/>
+              <w:right w:type="dxa" w:w="100"/>
+            </w:tcMar>
+          </w:tcPr>
+          <w:p>
+            <w:pPr>
+              <w:jc w:val="left"/>
+            </w:pPr>
+            <w:r>
+              <w:rPr>
+                <w:rFonts w:ascii="Arial" w:cs="Arial" w:eastAsia="Arial" w:hAnsi="Arial"/>
+                <w:b w:val="false"/>
+                <w:bCs w:val="false"/>
+                <w:sz w:val="18"/>
+                <w:szCs w:val="18"/>
+              </w:rPr>
+              <w:t xml:space="preserve">Ahli 1</w:t>
+            </w:r>
+          </w:p>
+        </w:tc>
+        <w:tc>
+          <w:tcPr>
+            <w:tcW w:type="dxa" w:w="1500"/>
+            <w:tcBorders>
+              <w:top w:val="single" w:color="999999" w:sz="4"/>
+              <w:left w:val="single" w:color="999999" w:sz="4"/>
+              <w:bottom w:val="single" w:color="999999" w:sz="4"/>
+              <w:right w:val="single" w:color="999999" w:sz="4"/>
+            </w:tcBorders>
+            <w:tcMar>
+              <w:top w:type="dxa" w:w="60"/>
+              <w:left w:type="dxa" w:w="100"/>
+              <w:bottom w:type="dxa" w:w="60"/>
+              <w:right w:type="dxa" w:w="100"/>
+            </w:tcMar>
+          </w:tcPr>
+          <w:p>
+            <w:pPr>
+              <w:jc w:val="left"/>
+            </w:pPr>
+            <w:r>
+              <w:rPr>
+                <w:rFonts w:ascii="Arial" w:cs="Arial" w:eastAsia="Arial" w:hAnsi="Arial"/>
+                <w:b w:val="false"/>
+                <w:bCs w:val="false"/>
+                <w:sz w:val="18"/>
+                <w:szCs w:val="18"/>
+              </w:rPr>
+              <w:t xml:space="preserve">Prof. Dr. Aryani Kusumastuti, S.H., M.H.</w:t>
+            </w:r>
+          </w:p>
+        </w:tc>
+        <w:tc>
+          <w:tcPr>
+            <w:tcW w:type="dxa" w:w="1900"/>
+            <w:tcBorders>
+              <w:top w:val="single" w:color="999999" w:sz="4"/>
+              <w:left w:val="single" w:color="999999" w:sz="4"/>
+              <w:bottom w:val="single" w:color="999999" w:sz="4"/>
+              <w:right w:val="single" w:color="999999" w:sz="4"/>
+            </w:tcBorders>
+            <w:tcMar>
+              <w:top w:type="dxa" w:w="60"/>
+              <w:left w:type="dxa" w:w="100"/>
+              <w:bottom w:type="dxa" w:w="60"/>
+              <w:right w:type="dxa" w:w="100"/>
+            </w:tcMar>
+          </w:tcPr>
+          <w:p>
+            <w:pPr>
+              <w:jc w:val="left"/>
+            </w:pPr>
+            <w:r>
+              <w:rPr>
+                <w:rFonts w:ascii="Arial" w:cs="Arial" w:eastAsia="Arial" w:hAnsi="Arial"/>
+                <w:b w:val="false"/>
+                <w:bCs w:val="false"/>
+                <w:sz w:val="18"/>
+                <w:szCs w:val="18"/>
+              </w:rPr>
+              <w:t xml:space="preserve">Hukum Tata Negara, akademisi</w:t>
+            </w:r>
+          </w:p>
+        </w:tc>
+        <w:tc>
+          <w:tcPr>
+            <w:tcW w:type="dxa" w:w="3288"/>
+            <w:tcBorders>
+              <w:top w:val="single" w:color="999999" w:sz="4"/>
+              <w:left w:val="single" w:color="999999" w:sz="4"/>
+              <w:bottom w:val="single" w:color="999999" w:sz="4"/>
+              <w:right w:val="single" w:color="999999" w:sz="4"/>
+            </w:tcBorders>
+            <w:tcMar>
+              <w:top w:type="dxa" w:w="60"/>
+              <w:left w:type="dxa" w:w="100"/>
+              <w:bottom w:type="dxa" w:w="60"/>
+              <w:right w:type="dxa" w:w="100"/>
+            </w:tcMar>
+          </w:tcPr>
+          <w:p>
+            <w:pPr>
+              <w:jc w:val="left"/>
+            </w:pPr>
+            <w:r>
+              <w:rPr>
+                <w:rFonts w:ascii="Arial" w:cs="Arial" w:eastAsia="Arial" w:hAnsi="Arial"/>
+                <w:b w:val="false"/>
+                <w:bCs w:val="false"/>
+                <w:sz w:val="18"/>
+                <w:szCs w:val="18"/>
+              </w:rPr>
+              <w:t xml:space="preserve">Partisipasi bermakna (Putusan 91/PUU-XVIII/2020) secara analogis; expressio unius est exclusio alterius; kontradiksi Pasal 4 huruf c dan Pasal 8 ayat (7) dengan Pasal 8 ayat (2); batas open legal policy; alasan putusan bersyarat; hak partisipasi dalam Kovenan Hak Ekosob (UU 11/2005)</w:t>
+            </w:r>
+          </w:p>
+        </w:tc>
+        <w:tc>
+          <w:tcPr>
+            <w:tcW w:type="dxa" w:w="2000"/>
+            <w:tcBorders>
+              <w:top w:val="single" w:color="999999" w:sz="4"/>
+              <w:left w:val="single" w:color="999999" w:sz="4"/>
+              <w:bottom w:val="single" w:color="999999" w:sz="4"/>
+              <w:right w:val="single" w:color="999999" w:sz="4"/>
+            </w:tcBorders>
+            <w:tcMar>
+              <w:top w:type="dxa" w:w="60"/>
+              <w:left w:type="dxa" w:w="100"/>
+              <w:bottom w:type="dxa" w:w="60"/>
+              <w:right w:type="dxa" w:w="100"/>
+            </w:tcMar>
+          </w:tcPr>
+          <w:p>
+            <w:pPr>
+              <w:jc w:val="left"/>
+            </w:pPr>
+            <w:r>
+              <w:rPr>
+                <w:rFonts w:ascii="Arial" w:cs="Arial" w:eastAsia="Arial" w:hAnsi="Arial"/>
+                <w:b w:val="false"/>
+                <w:bCs w:val="false"/>
+                <w:sz w:val="18"/>
+                <w:szCs w:val="18"/>
+              </w:rPr>
+              <w:t xml:space="preserve">Inti konstitusionalitas</w:t>
+            </w:r>
+          </w:p>
+        </w:tc>
+      </w:tr>
+      <w:tr>
+        <w:trPr>
+          <w:cantSplit/>
+        </w:trPr>
+        <w:tc>
+          <w:tcPr>
+            <w:tcW w:type="dxa" w:w="950"/>
+            <w:tcBorders>
+              <w:top w:val="single" w:color="999999" w:sz="4"/>
+              <w:left w:val="single" w:color="999999" w:sz="4"/>
+              <w:bottom w:val="single" w:color="999999" w:sz="4"/>
+              <w:right w:val="single" w:color="999999" w:sz="4"/>
+            </w:tcBorders>
+            <w:tcMar>
+              <w:top w:type="dxa" w:w="60"/>
+              <w:left w:type="dxa" w:w="100"/>
+              <w:bottom w:type="dxa" w:w="60"/>
+              <w:right w:type="dxa" w:w="100"/>
+            </w:tcMar>
+          </w:tcPr>
+          <w:p>
+            <w:pPr>
+              <w:jc w:val="left"/>
+            </w:pPr>
+            <w:r>
+              <w:rPr>
+                <w:rFonts w:ascii="Arial" w:cs="Arial" w:eastAsia="Arial" w:hAnsi="Arial"/>
+                <w:b w:val="false"/>
+                <w:bCs w:val="false"/>
+                <w:sz w:val="18"/>
+                <w:szCs w:val="18"/>
+              </w:rPr>
+              <w:t xml:space="preserve">Ahli 2</w:t>
+            </w:r>
+          </w:p>
+        </w:tc>
+        <w:tc>
+          <w:tcPr>
+            <w:tcW w:type="dxa" w:w="1500"/>
+            <w:tcBorders>
+              <w:top w:val="single" w:color="999999" w:sz="4"/>
+              <w:left w:val="single" w:color="999999" w:sz="4"/>
+              <w:bottom w:val="single" w:color="999999" w:sz="4"/>
+              <w:right w:val="single" w:color="999999" w:sz="4"/>
+            </w:tcBorders>
+            <w:tcMar>
+              <w:top w:type="dxa" w:w="60"/>
+              <w:left w:type="dxa" w:w="100"/>
+              <w:bottom w:type="dxa" w:w="60"/>
+              <w:right w:type="dxa" w:w="100"/>
+            </w:tcMar>
+          </w:tcPr>
+          <w:p>
+            <w:pPr>
+              <w:jc w:val="left"/>
+            </w:pPr>
+            <w:r>
+              <w:rPr>
+                <w:rFonts w:ascii="Arial" w:cs="Arial" w:eastAsia="Arial" w:hAnsi="Arial"/>
+                <w:b w:val="false"/>
+                <w:bCs w:val="false"/>
+                <w:sz w:val="18"/>
+                <w:szCs w:val="18"/>
+              </w:rPr>
+              <w:t xml:space="preserve">Dr. Bonifasius Tarigan, S.H., LL.M.</w:t>
+            </w:r>
+          </w:p>
+        </w:tc>
+        <w:tc>
+          <w:tcPr>
+            <w:tcW w:type="dxa" w:w="1900"/>
+            <w:tcBorders>
+              <w:top w:val="single" w:color="999999" w:sz="4"/>
+              <w:left w:val="single" w:color="999999" w:sz="4"/>
+              <w:bottom w:val="single" w:color="999999" w:sz="4"/>
+              <w:right w:val="single" w:color="999999" w:sz="4"/>
+            </w:tcBorders>
+            <w:tcMar>
+              <w:top w:type="dxa" w:w="60"/>
+              <w:left w:type="dxa" w:w="100"/>
+              <w:bottom w:type="dxa" w:w="60"/>
+              <w:right w:type="dxa" w:w="100"/>
+            </w:tcMar>
+          </w:tcPr>
+          <w:p>
+            <w:pPr>
+              <w:jc w:val="left"/>
+            </w:pPr>
+            <w:r>
+              <w:rPr>
+                <w:rFonts w:ascii="Arial" w:cs="Arial" w:eastAsia="Arial" w:hAnsi="Arial"/>
+                <w:b w:val="false"/>
+                <w:bCs w:val="false"/>
+                <w:sz w:val="18"/>
+                <w:szCs w:val="18"/>
+              </w:rPr>
+              <w:t xml:space="preserve">Hukum Administrasi Negara, akademisi</w:t>
+            </w:r>
+          </w:p>
+        </w:tc>
+        <w:tc>
+          <w:tcPr>
+            <w:tcW w:type="dxa" w:w="3288"/>
+            <w:tcBorders>
+              <w:top w:val="single" w:color="999999" w:sz="4"/>
+              <w:left w:val="single" w:color="999999" w:sz="4"/>
+              <w:bottom w:val="single" w:color="999999" w:sz="4"/>
+              <w:right w:val="single" w:color="999999" w:sz="4"/>
+            </w:tcBorders>
+            <w:tcMar>
+              <w:top w:type="dxa" w:w="60"/>
+              <w:left w:type="dxa" w:w="100"/>
+              <w:bottom w:type="dxa" w:w="60"/>
+              <w:right w:type="dxa" w:w="100"/>
+            </w:tcMar>
+          </w:tcPr>
+          <w:p>
+            <w:pPr>
+              <w:jc w:val="left"/>
+            </w:pPr>
+            <w:r>
+              <w:rPr>
+                <w:rFonts w:ascii="Arial" w:cs="Arial" w:eastAsia="Arial" w:hAnsi="Arial"/>
+                <w:b w:val="false"/>
+                <w:bCs w:val="false"/>
+                <w:sz w:val="18"/>
+                <w:szCs w:val="18"/>
+              </w:rPr>
+              <w:t xml:space="preserve">Kriteria bersifat mengatur tetapi berbentuk Keputusan, sehingga lolos dari jaminan partisipasi Pasal 96 UU 12/2011; asas keterbukaan; pembanding kewajiban partisipasi dalam standar pelayanan UU 25/2009</w:t>
+            </w:r>
+          </w:p>
+        </w:tc>
+        <w:tc>
+          <w:tcPr>
+            <w:tcW w:type="dxa" w:w="2000"/>
+            <w:tcBorders>
+              <w:top w:val="single" w:color="999999" w:sz="4"/>
+              <w:left w:val="single" w:color="999999" w:sz="4"/>
+              <w:bottom w:val="single" w:color="999999" w:sz="4"/>
+              <w:right w:val="single" w:color="999999" w:sz="4"/>
+            </w:tcBorders>
+            <w:tcMar>
+              <w:top w:type="dxa" w:w="60"/>
+              <w:left w:type="dxa" w:w="100"/>
+              <w:bottom w:type="dxa" w:w="60"/>
+              <w:right w:type="dxa" w:w="100"/>
+            </w:tcMar>
+          </w:tcPr>
+          <w:p>
+            <w:pPr>
+              <w:jc w:val="left"/>
+            </w:pPr>
+            <w:r>
+              <w:rPr>
+                <w:rFonts w:ascii="Arial" w:cs="Arial" w:eastAsia="Arial" w:hAnsi="Arial"/>
+                <w:b w:val="false"/>
+                <w:bCs w:val="false"/>
+                <w:sz w:val="18"/>
+                <w:szCs w:val="18"/>
+              </w:rPr>
+              <w:t xml:space="preserve">Kekosongan jaminan partisipasi</w:t>
+            </w:r>
+          </w:p>
+        </w:tc>
+      </w:tr>
+      <w:tr>
+        <w:trPr>
+          <w:cantSplit/>
+        </w:trPr>
+        <w:tc>
+          <w:tcPr>
+            <w:tcW w:type="dxa" w:w="950"/>
+            <w:tcBorders>
+              <w:top w:val="single" w:color="999999" w:sz="4"/>
+              <w:left w:val="single" w:color="999999" w:sz="4"/>
+              <w:bottom w:val="single" w:color="999999" w:sz="4"/>
+              <w:right w:val="single" w:color="999999" w:sz="4"/>
+            </w:tcBorders>
+            <w:tcMar>
+              <w:top w:type="dxa" w:w="60"/>
+              <w:left w:type="dxa" w:w="100"/>
+              <w:bottom w:type="dxa" w:w="60"/>
+              <w:right w:type="dxa" w:w="100"/>
+            </w:tcMar>
+          </w:tcPr>
+          <w:p>
+            <w:pPr>
+              <w:jc w:val="left"/>
+            </w:pPr>
+            <w:r>
+              <w:rPr>
+                <w:rFonts w:ascii="Arial" w:cs="Arial" w:eastAsia="Arial" w:hAnsi="Arial"/>
+                <w:b w:val="false"/>
+                <w:bCs w:val="false"/>
+                <w:sz w:val="18"/>
+                <w:szCs w:val="18"/>
+              </w:rPr>
+              <w:t xml:space="preserve">Ahli 3</w:t>
+            </w:r>
+          </w:p>
+        </w:tc>
+        <w:tc>
+          <w:tcPr>
+            <w:tcW w:type="dxa" w:w="1500"/>
+            <w:tcBorders>
+              <w:top w:val="single" w:color="999999" w:sz="4"/>
+              <w:left w:val="single" w:color="999999" w:sz="4"/>
+              <w:bottom w:val="single" w:color="999999" w:sz="4"/>
+              <w:right w:val="single" w:color="999999" w:sz="4"/>
+            </w:tcBorders>
+            <w:tcMar>
+              <w:top w:type="dxa" w:w="60"/>
+              <w:left w:type="dxa" w:w="100"/>
+              <w:bottom w:type="dxa" w:w="60"/>
+              <w:right w:type="dxa" w:w="100"/>
+            </w:tcMar>
+          </w:tcPr>
+          <w:p>
+            <w:pPr>
+              <w:jc w:val="left"/>
+            </w:pPr>
+            <w:r>
+              <w:rPr>
+                <w:rFonts w:ascii="Arial" w:cs="Arial" w:eastAsia="Arial" w:hAnsi="Arial"/>
+                <w:b w:val="false"/>
+                <w:bCs w:val="false"/>
+                <w:sz w:val="18"/>
+                <w:szCs w:val="18"/>
+              </w:rPr>
+              <w:t xml:space="preserve">Dr. Maya Anggraini, M.Sc.</w:t>
+            </w:r>
+          </w:p>
+        </w:tc>
+        <w:tc>
+          <w:tcPr>
+            <w:tcW w:type="dxa" w:w="1900"/>
+            <w:tcBorders>
+              <w:top w:val="single" w:color="999999" w:sz="4"/>
+              <w:left w:val="single" w:color="999999" w:sz="4"/>
+              <w:bottom w:val="single" w:color="999999" w:sz="4"/>
+              <w:right w:val="single" w:color="999999" w:sz="4"/>
+            </w:tcBorders>
+            <w:tcMar>
+              <w:top w:type="dxa" w:w="60"/>
+              <w:left w:type="dxa" w:w="100"/>
+              <w:bottom w:type="dxa" w:w="60"/>
+              <w:right w:type="dxa" w:w="100"/>
+            </w:tcMar>
+          </w:tcPr>
+          <w:p>
+            <w:pPr>
+              <w:jc w:val="left"/>
+            </w:pPr>
+            <w:r>
+              <w:rPr>
+                <w:rFonts w:ascii="Arial" w:cs="Arial" w:eastAsia="Arial" w:hAnsi="Arial"/>
+                <w:b w:val="false"/>
+                <w:bCs w:val="false"/>
+                <w:sz w:val="18"/>
+                <w:szCs w:val="18"/>
+              </w:rPr>
+              <w:t xml:space="preserve">Ekonom kebijakan sosial di lembaga riset independen (fiktif)</w:t>
+            </w:r>
+          </w:p>
+        </w:tc>
+        <w:tc>
+          <w:tcPr>
+            <w:tcW w:type="dxa" w:w="3288"/>
+            <w:tcBorders>
+              <w:top w:val="single" w:color="999999" w:sz="4"/>
+              <w:left w:val="single" w:color="999999" w:sz="4"/>
+              <w:bottom w:val="single" w:color="999999" w:sz="4"/>
+              <w:right w:val="single" w:color="999999" w:sz="4"/>
+            </w:tcBorders>
+            <w:tcMar>
+              <w:top w:type="dxa" w:w="60"/>
+              <w:left w:type="dxa" w:w="100"/>
+              <w:bottom w:type="dxa" w:w="60"/>
+              <w:right w:type="dxa" w:w="100"/>
+            </w:tcMar>
+          </w:tcPr>
+          <w:p>
+            <w:pPr>
+              <w:jc w:val="left"/>
+            </w:pPr>
+            <w:r>
+              <w:rPr>
+                <w:rFonts w:ascii="Arial" w:cs="Arial" w:eastAsia="Arial" w:hAnsi="Arial"/>
+                <w:b w:val="false"/>
+                <w:bCs w:val="false"/>
+                <w:sz w:val="18"/>
+                <w:szCs w:val="18"/>
+              </w:rPr>
+              <w:t xml:space="preserve">Bukti salah sasaran (exclusion dan inclusion error); desil relatif berbeda dengan garis kemiskinan absolut; penargetan berbasis komunitas (Alatas dkk. 2012) dengan kelebihan dan kekurangannya; perlunya publikasi variabel dan bobot</w:t>
+            </w:r>
+          </w:p>
+        </w:tc>
+        <w:tc>
+          <w:tcPr>
+            <w:tcW w:type="dxa" w:w="2000"/>
+            <w:tcBorders>
+              <w:top w:val="single" w:color="999999" w:sz="4"/>
+              <w:left w:val="single" w:color="999999" w:sz="4"/>
+              <w:bottom w:val="single" w:color="999999" w:sz="4"/>
+              <w:right w:val="single" w:color="999999" w:sz="4"/>
+            </w:tcBorders>
+            <w:tcMar>
+              <w:top w:type="dxa" w:w="60"/>
+              <w:left w:type="dxa" w:w="100"/>
+              <w:bottom w:type="dxa" w:w="60"/>
+              <w:right w:type="dxa" w:w="100"/>
+            </w:tcMar>
+          </w:tcPr>
+          <w:p>
+            <w:pPr>
+              <w:jc w:val="left"/>
+            </w:pPr>
+            <w:r>
+              <w:rPr>
+                <w:rFonts w:ascii="Arial" w:cs="Arial" w:eastAsia="Arial" w:hAnsi="Arial"/>
+                <w:b w:val="false"/>
+                <w:bCs w:val="false"/>
+                <w:sz w:val="18"/>
+                <w:szCs w:val="18"/>
+              </w:rPr>
+              <w:t xml:space="preserve">Kriteria tertutup menghasilkan salah sasaran</w:t>
+            </w:r>
+          </w:p>
+        </w:tc>
+      </w:tr>
+      <w:tr>
+        <w:trPr>
+          <w:cantSplit/>
+        </w:trPr>
+        <w:tc>
+          <w:tcPr>
+            <w:tcW w:type="dxa" w:w="950"/>
+            <w:tcBorders>
+              <w:top w:val="single" w:color="999999" w:sz="4"/>
+              <w:left w:val="single" w:color="999999" w:sz="4"/>
+              <w:bottom w:val="single" w:color="999999" w:sz="4"/>
+              <w:right w:val="single" w:color="999999" w:sz="4"/>
+            </w:tcBorders>
+            <w:tcMar>
+              <w:top w:type="dxa" w:w="60"/>
+              <w:left w:type="dxa" w:w="100"/>
+              <w:bottom w:type="dxa" w:w="60"/>
+              <w:right w:type="dxa" w:w="100"/>
+            </w:tcMar>
+          </w:tcPr>
+          <w:p>
+            <w:pPr>
+              <w:jc w:val="left"/>
+            </w:pPr>
+            <w:r>
+              <w:rPr>
+                <w:rFonts w:ascii="Arial" w:cs="Arial" w:eastAsia="Arial" w:hAnsi="Arial"/>
+                <w:b w:val="false"/>
+                <w:bCs w:val="false"/>
+                <w:sz w:val="18"/>
+                <w:szCs w:val="18"/>
+              </w:rPr>
+              <w:t xml:space="preserve">Ahli 4</w:t>
+            </w:r>
+          </w:p>
+        </w:tc>
+        <w:tc>
+          <w:tcPr>
+            <w:tcW w:type="dxa" w:w="1500"/>
+            <w:tcBorders>
+              <w:top w:val="single" w:color="999999" w:sz="4"/>
+              <w:left w:val="single" w:color="999999" w:sz="4"/>
+              <w:bottom w:val="single" w:color="999999" w:sz="4"/>
+              <w:right w:val="single" w:color="999999" w:sz="4"/>
+            </w:tcBorders>
+            <w:tcMar>
+              <w:top w:type="dxa" w:w="60"/>
+              <w:left w:type="dxa" w:w="100"/>
+              <w:bottom w:type="dxa" w:w="60"/>
+              <w:right w:type="dxa" w:w="100"/>
+            </w:tcMar>
+          </w:tcPr>
+          <w:p>
+            <w:pPr>
+              <w:jc w:val="left"/>
+            </w:pPr>
+            <w:r>
+              <w:rPr>
+                <w:rFonts w:ascii="Arial" w:cs="Arial" w:eastAsia="Arial" w:hAnsi="Arial"/>
+                <w:b w:val="false"/>
+                <w:bCs w:val="false"/>
+                <w:sz w:val="18"/>
+                <w:szCs w:val="18"/>
+              </w:rPr>
+              <w:t xml:space="preserve">Dr. Andi Nurhayati, M.Si.</w:t>
+            </w:r>
+          </w:p>
+        </w:tc>
+        <w:tc>
+          <w:tcPr>
+            <w:tcW w:type="dxa" w:w="1900"/>
+            <w:tcBorders>
+              <w:top w:val="single" w:color="999999" w:sz="4"/>
+              <w:left w:val="single" w:color="999999" w:sz="4"/>
+              <w:bottom w:val="single" w:color="999999" w:sz="4"/>
+              <w:right w:val="single" w:color="999999" w:sz="4"/>
+            </w:tcBorders>
+            <w:tcMar>
+              <w:top w:type="dxa" w:w="60"/>
+              <w:left w:type="dxa" w:w="100"/>
+              <w:bottom w:type="dxa" w:w="60"/>
+              <w:right w:type="dxa" w:w="100"/>
+            </w:tcMar>
+          </w:tcPr>
+          <w:p>
+            <w:pPr>
+              <w:jc w:val="left"/>
+            </w:pPr>
+            <w:r>
+              <w:rPr>
+                <w:rFonts w:ascii="Arial" w:cs="Arial" w:eastAsia="Arial" w:hAnsi="Arial"/>
+                <w:b w:val="false"/>
+                <w:bCs w:val="false"/>
+                <w:sz w:val="18"/>
+                <w:szCs w:val="18"/>
+              </w:rPr>
+              <w:t xml:space="preserve">Sosiolog pedesaan dan pesisir, akademisi</w:t>
+            </w:r>
+          </w:p>
+        </w:tc>
+        <w:tc>
+          <w:tcPr>
+            <w:tcW w:type="dxa" w:w="3288"/>
+            <w:tcBorders>
+              <w:top w:val="single" w:color="999999" w:sz="4"/>
+              <w:left w:val="single" w:color="999999" w:sz="4"/>
+              <w:bottom w:val="single" w:color="999999" w:sz="4"/>
+              <w:right w:val="single" w:color="999999" w:sz="4"/>
+            </w:tcBorders>
+            <w:tcMar>
+              <w:top w:type="dxa" w:w="60"/>
+              <w:left w:type="dxa" w:w="100"/>
+              <w:bottom w:type="dxa" w:w="60"/>
+              <w:right w:type="dxa" w:w="100"/>
+            </w:tcMar>
+          </w:tcPr>
+          <w:p>
+            <w:pPr>
+              <w:jc w:val="left"/>
+            </w:pPr>
+            <w:r>
+              <w:rPr>
+                <w:rFonts w:ascii="Arial" w:cs="Arial" w:eastAsia="Arial" w:hAnsi="Arial"/>
+                <w:b w:val="false"/>
+                <w:bCs w:val="false"/>
+                <w:sz w:val="18"/>
+                <w:szCs w:val="18"/>
+              </w:rPr>
+              <w:t xml:space="preserve">Kemiskinan bersifat kontekstual; kearifan lokal dalam bentuk rumah dan pola penghasilan; metode penilaian kemiskinan partisipatif</w:t>
+            </w:r>
+          </w:p>
+        </w:tc>
+        <w:tc>
+          <w:tcPr>
+            <w:tcW w:type="dxa" w:w="2000"/>
+            <w:tcBorders>
+              <w:top w:val="single" w:color="999999" w:sz="4"/>
+              <w:left w:val="single" w:color="999999" w:sz="4"/>
+              <w:bottom w:val="single" w:color="999999" w:sz="4"/>
+              <w:right w:val="single" w:color="999999" w:sz="4"/>
+            </w:tcBorders>
+            <w:tcMar>
+              <w:top w:type="dxa" w:w="60"/>
+              <w:left w:type="dxa" w:w="100"/>
+              <w:bottom w:type="dxa" w:w="60"/>
+              <w:right w:type="dxa" w:w="100"/>
+            </w:tcMar>
+          </w:tcPr>
+          <w:p>
+            <w:pPr>
+              <w:jc w:val="left"/>
+            </w:pPr>
+            <w:r>
+              <w:rPr>
+                <w:rFonts w:ascii="Arial" w:cs="Arial" w:eastAsia="Arial" w:hAnsi="Arial"/>
+                <w:b w:val="false"/>
+                <w:bCs w:val="false"/>
+                <w:sz w:val="18"/>
+                <w:szCs w:val="18"/>
+              </w:rPr>
+              <w:t xml:space="preserve">Pasal 20 dan 23 UU 13/2011 hanya bisa dijalankan bila warga didengar</w:t>
+            </w:r>
+          </w:p>
+        </w:tc>
+      </w:tr>
+    </w:tbl>
     <w:p>
       <w:pPr>
         <w:spacing w:after="60" w:before="120"/>
@@ -6596,7 +7664,7 @@
           <w:b/>
           <w:bCs/>
         </w:rPr>
-        <w:t xml:space="preserve">Perlu dicek ulang:</w:t>
+        <w:t xml:space="preserve">Yang sengaja dikeluarkan dari tim kita:</w:t>
       </w:r>
     </w:p>
     <w:p>
@@ -6611,8 +7679,16 @@
       <w:r>
         <w:rPr>
           <w:rFonts w:ascii="Arial" w:cs="Arial" w:eastAsia="Arial" w:hAnsi="Arial"/>
-        </w:rPr>
-        <w:t xml:space="preserve">Isi lengkap Kepmensos 262/HUK/2022 (daftar 9 indikator)</w:t>
+          <w:b/>
+          <w:bCs/>
+        </w:rPr>
+        <w:t xml:space="preserve">Kepala desa:</w:t>
+      </w:r>
+      <w:r>
+        <w:rPr>
+          <w:rFonts w:ascii="Arial" w:cs="Arial" w:eastAsia="Arial" w:hAnsi="Arial"/>
+        </w:rPr>
+        <w:t xml:space="preserve"> aparat pemerintahan desa, lebih wajar menjadi saksi Pemerintah tentang berjalannya musyawarah desa.</w:t>
       </w:r>
     </w:p>
     <w:p>
@@ -6627,8 +7703,16 @@
       <w:r>
         <w:rPr>
           <w:rFonts w:ascii="Arial" w:cs="Arial" w:eastAsia="Arial" w:hAnsi="Arial"/>
-        </w:rPr>
-        <w:t xml:space="preserve">Nomor pasal UU 25/2009 tentang pelibatan masyarakat dalam penyusunan standar pelayanan</w:t>
+          <w:b/>
+          <w:bCs/>
+        </w:rPr>
+        <w:t xml:space="preserve">Pendamping PKH:</w:t>
+      </w:r>
+      <w:r>
+        <w:rPr>
+          <w:rFonts w:ascii="Arial" w:cs="Arial" w:eastAsia="Arial" w:hAnsi="Arial"/>
+        </w:rPr>
+        <w:t xml:space="preserve"> dikontrak Kemensos, sehingga keterangannya mudah dianggap konflik kepentingan dan lebih cocok bagi Pemerintah.</w:t>
       </w:r>
     </w:p>
     <w:p>
@@ -6643,8 +7727,938 @@
       <w:r>
         <w:rPr>
           <w:rFonts w:ascii="Arial" w:cs="Arial" w:eastAsia="Arial" w:hAnsi="Arial"/>
-        </w:rPr>
-        <w:t xml:space="preserve">Apakah pemeringkatan desil dilakukan secara nasional atau per wilayah</w:t>
+          <w:b/>
+          <w:bCs/>
+        </w:rPr>
+        <w:t xml:space="preserve">Ahli statistik yang menjelaskan cara kerja Proxy Means Test:</w:t>
+      </w:r>
+      <w:r>
+        <w:rPr>
+          <w:rFonts w:ascii="Arial" w:cs="Arial" w:eastAsia="Arial" w:hAnsi="Arial"/>
+        </w:rPr>
+        <w:t xml:space="preserve"> wilayah alami ahli Pemerintah atau BPS. Ahli 3 kita tidak membela atau merinci metodenya, tetapi menilai dampaknya.</w:t>
+      </w:r>
+    </w:p>
+    <w:p>
+      <w:pPr>
+        <w:spacing w:after="120" w:line="276"/>
+        <w:jc w:val="both"/>
+      </w:pPr>
+      <w:r>
+        <w:rPr>
+          <w:rFonts w:ascii="Arial" w:cs="Arial" w:eastAsia="Arial" w:hAnsi="Arial"/>
+        </w:rPr>
+        <w:t xml:space="preserve">Ahli 3 wajib menyebut kedua sisi riset Alatas dkk.: berbasis komunitas lebih sesuai persepsi lokal, tetapi sedikit kalah akurat menurut konsumsi. Posisi kita: partisipasi </w:t>
+      </w:r>
+      <w:r>
+        <w:rPr>
+          <w:rFonts w:ascii="Arial" w:cs="Arial" w:eastAsia="Arial" w:hAnsi="Arial"/>
+          <w:b/>
+          <w:bCs/>
+        </w:rPr>
+        <w:t xml:space="preserve">melengkapi</w:t>
+      </w:r>
+      <w:r>
+        <w:rPr>
+          <w:rFonts w:ascii="Arial" w:cs="Arial" w:eastAsia="Arial" w:hAnsi="Arial"/>
+        </w:rPr>
+        <w:t xml:space="preserve"> metode statistik, bukan menggantikannya.</w:t>
+      </w:r>
+    </w:p>
+    <w:p>
+      <w:pPr>
+        <w:pStyle w:val="Heading1"/>
+      </w:pPr>
+      <w:r>
+        <w:rPr>
+          <w:rFonts w:ascii="Arial" w:cs="Arial" w:eastAsia="Arial" w:hAnsi="Arial"/>
+        </w:rPr>
+        <w:t xml:space="preserve">8. Perkiraan Ahli Pemerintah dan Cara Menjawabnya</w:t>
+      </w:r>
+    </w:p>
+    <w:p>
+      <w:pPr>
+        <w:spacing w:after="120" w:line="276"/>
+        <w:jc w:val="both"/>
+      </w:pPr>
+      <w:r>
+        <w:rPr>
+          <w:rFonts w:ascii="Arial" w:cs="Arial" w:eastAsia="Arial" w:hAnsi="Arial"/>
+        </w:rPr>
+        <w:t xml:space="preserve">Tim Pemerintah kemungkinan membawa empat jenis ahli; kuasa hukum kita menyiapkan pertanyaan untuk masing-masing.</w:t>
+      </w:r>
+    </w:p>
+    <w:tbl>
+      <w:tblPr>
+        <w:tblW w:type="dxa" w:w="9638"/>
+        <w:tblBorders>
+          <w:top w:val="single" w:color="auto" w:sz="4"/>
+          <w:left w:val="single" w:color="auto" w:sz="4"/>
+          <w:bottom w:val="single" w:color="auto" w:sz="4"/>
+          <w:right w:val="single" w:color="auto" w:sz="4"/>
+          <w:insideH w:val="single" w:color="auto" w:sz="4"/>
+          <w:insideV w:val="single" w:color="auto" w:sz="4"/>
+        </w:tblBorders>
+        <w:tblLayout w:type="fixed"/>
+      </w:tblPr>
+      <w:tblGrid>
+        <w:gridCol w:w="2100"/>
+        <w:gridCol w:w="2600"/>
+        <w:gridCol w:w="3238"/>
+        <w:gridCol w:w="1700"/>
+      </w:tblGrid>
+      <w:tr>
+        <w:trPr>
+          <w:tblHeader/>
+        </w:trPr>
+        <w:tc>
+          <w:tcPr>
+            <w:tcW w:type="dxa" w:w="2100"/>
+            <w:tcBorders>
+              <w:top w:val="single" w:color="999999" w:sz="4"/>
+              <w:left w:val="single" w:color="999999" w:sz="4"/>
+              <w:bottom w:val="single" w:color="999999" w:sz="4"/>
+              <w:right w:val="single" w:color="999999" w:sz="4"/>
+            </w:tcBorders>
+            <w:shd w:fill="D9E2F3" w:color="auto" w:val="clear"/>
+            <w:tcMar>
+              <w:top w:type="dxa" w:w="60"/>
+              <w:left w:type="dxa" w:w="100"/>
+              <w:bottom w:type="dxa" w:w="60"/>
+              <w:right w:type="dxa" w:w="100"/>
+            </w:tcMar>
+          </w:tcPr>
+          <w:p>
+            <w:pPr>
+              <w:jc w:val="left"/>
+            </w:pPr>
+            <w:r>
+              <w:rPr>
+                <w:rFonts w:ascii="Arial" w:cs="Arial" w:eastAsia="Arial" w:hAnsi="Arial"/>
+                <w:b/>
+                <w:bCs/>
+                <w:sz w:val="18"/>
+                <w:szCs w:val="18"/>
+              </w:rPr>
+              <w:t xml:space="preserve">Kemungkinan ahli Pemerintah</w:t>
+            </w:r>
+          </w:p>
+        </w:tc>
+        <w:tc>
+          <w:tcPr>
+            <w:tcW w:type="dxa" w:w="2600"/>
+            <w:tcBorders>
+              <w:top w:val="single" w:color="999999" w:sz="4"/>
+              <w:left w:val="single" w:color="999999" w:sz="4"/>
+              <w:bottom w:val="single" w:color="999999" w:sz="4"/>
+              <w:right w:val="single" w:color="999999" w:sz="4"/>
+            </w:tcBorders>
+            <w:shd w:fill="D9E2F3" w:color="auto" w:val="clear"/>
+            <w:tcMar>
+              <w:top w:type="dxa" w:w="60"/>
+              <w:left w:type="dxa" w:w="100"/>
+              <w:bottom w:type="dxa" w:w="60"/>
+              <w:right w:type="dxa" w:w="100"/>
+            </w:tcMar>
+          </w:tcPr>
+          <w:p>
+            <w:pPr>
+              <w:jc w:val="left"/>
+            </w:pPr>
+            <w:r>
+              <w:rPr>
+                <w:rFonts w:ascii="Arial" w:cs="Arial" w:eastAsia="Arial" w:hAnsi="Arial"/>
+                <w:b/>
+                <w:bCs/>
+                <w:sz w:val="18"/>
+                <w:szCs w:val="18"/>
+              </w:rPr>
+              <w:t xml:space="preserve">Dalil yang akan dibawa</w:t>
+            </w:r>
+          </w:p>
+        </w:tc>
+        <w:tc>
+          <w:tcPr>
+            <w:tcW w:type="dxa" w:w="3238"/>
+            <w:tcBorders>
+              <w:top w:val="single" w:color="999999" w:sz="4"/>
+              <w:left w:val="single" w:color="999999" w:sz="4"/>
+              <w:bottom w:val="single" w:color="999999" w:sz="4"/>
+              <w:right w:val="single" w:color="999999" w:sz="4"/>
+            </w:tcBorders>
+            <w:shd w:fill="D9E2F3" w:color="auto" w:val="clear"/>
+            <w:tcMar>
+              <w:top w:type="dxa" w:w="60"/>
+              <w:left w:type="dxa" w:w="100"/>
+              <w:bottom w:type="dxa" w:w="60"/>
+              <w:right w:type="dxa" w:w="100"/>
+            </w:tcMar>
+          </w:tcPr>
+          <w:p>
+            <w:pPr>
+              <w:jc w:val="left"/>
+            </w:pPr>
+            <w:r>
+              <w:rPr>
+                <w:rFonts w:ascii="Arial" w:cs="Arial" w:eastAsia="Arial" w:hAnsi="Arial"/>
+                <w:b/>
+                <w:bCs/>
+                <w:sz w:val="18"/>
+                <w:szCs w:val="18"/>
+              </w:rPr>
+              <w:t xml:space="preserve">Jawaban kita</w:t>
+            </w:r>
+          </w:p>
+        </w:tc>
+        <w:tc>
+          <w:tcPr>
+            <w:tcW w:type="dxa" w:w="1700"/>
+            <w:tcBorders>
+              <w:top w:val="single" w:color="999999" w:sz="4"/>
+              <w:left w:val="single" w:color="999999" w:sz="4"/>
+              <w:bottom w:val="single" w:color="999999" w:sz="4"/>
+              <w:right w:val="single" w:color="999999" w:sz="4"/>
+            </w:tcBorders>
+            <w:shd w:fill="D9E2F3" w:color="auto" w:val="clear"/>
+            <w:tcMar>
+              <w:top w:type="dxa" w:w="60"/>
+              <w:left w:type="dxa" w:w="100"/>
+              <w:bottom w:type="dxa" w:w="60"/>
+              <w:right w:type="dxa" w:w="100"/>
+            </w:tcMar>
+          </w:tcPr>
+          <w:p>
+            <w:pPr>
+              <w:jc w:val="left"/>
+            </w:pPr>
+            <w:r>
+              <w:rPr>
+                <w:rFonts w:ascii="Arial" w:cs="Arial" w:eastAsia="Arial" w:hAnsi="Arial"/>
+                <w:b/>
+                <w:bCs/>
+                <w:sz w:val="18"/>
+                <w:szCs w:val="18"/>
+              </w:rPr>
+              <w:t xml:space="preserve">Ahli kita yang menjawab</w:t>
+            </w:r>
+          </w:p>
+        </w:tc>
+      </w:tr>
+      <w:tr>
+        <w:trPr>
+          <w:cantSplit/>
+        </w:trPr>
+        <w:tc>
+          <w:tcPr>
+            <w:tcW w:type="dxa" w:w="2100"/>
+            <w:tcBorders>
+              <w:top w:val="single" w:color="999999" w:sz="4"/>
+              <w:left w:val="single" w:color="999999" w:sz="4"/>
+              <w:bottom w:val="single" w:color="999999" w:sz="4"/>
+              <w:right w:val="single" w:color="999999" w:sz="4"/>
+            </w:tcBorders>
+            <w:tcMar>
+              <w:top w:type="dxa" w:w="60"/>
+              <w:left w:type="dxa" w:w="100"/>
+              <w:bottom w:type="dxa" w:w="60"/>
+              <w:right w:type="dxa" w:w="100"/>
+            </w:tcMar>
+          </w:tcPr>
+          <w:p>
+            <w:pPr>
+              <w:jc w:val="left"/>
+            </w:pPr>
+            <w:r>
+              <w:rPr>
+                <w:rFonts w:ascii="Arial" w:cs="Arial" w:eastAsia="Arial" w:hAnsi="Arial"/>
+                <w:b w:val="false"/>
+                <w:bCs w:val="false"/>
+                <w:sz w:val="18"/>
+                <w:szCs w:val="18"/>
+              </w:rPr>
+              <w:t xml:space="preserve">Ahli statistik (akademisi statistik atau berlatar BPS)</w:t>
+            </w:r>
+          </w:p>
+        </w:tc>
+        <w:tc>
+          <w:tcPr>
+            <w:tcW w:type="dxa" w:w="2600"/>
+            <w:tcBorders>
+              <w:top w:val="single" w:color="999999" w:sz="4"/>
+              <w:left w:val="single" w:color="999999" w:sz="4"/>
+              <w:bottom w:val="single" w:color="999999" w:sz="4"/>
+              <w:right w:val="single" w:color="999999" w:sz="4"/>
+            </w:tcBorders>
+            <w:tcMar>
+              <w:top w:type="dxa" w:w="60"/>
+              <w:left w:type="dxa" w:w="100"/>
+              <w:bottom w:type="dxa" w:w="60"/>
+              <w:right w:type="dxa" w:w="100"/>
+            </w:tcMar>
+          </w:tcPr>
+          <w:p>
+            <w:pPr>
+              <w:jc w:val="left"/>
+            </w:pPr>
+            <w:r>
+              <w:rPr>
+                <w:rFonts w:ascii="Arial" w:cs="Arial" w:eastAsia="Arial" w:hAnsi="Arial"/>
+                <w:b w:val="false"/>
+                <w:bCs w:val="false"/>
+                <w:sz w:val="18"/>
+                <w:szCs w:val="18"/>
+              </w:rPr>
+              <w:t xml:space="preserve">Proxy Means Test adalah standar internasional dan objektif; penargetan berbasis komunitas rawan dikuasai elite</w:t>
+            </w:r>
+          </w:p>
+        </w:tc>
+        <w:tc>
+          <w:tcPr>
+            <w:tcW w:type="dxa" w:w="3238"/>
+            <w:tcBorders>
+              <w:top w:val="single" w:color="999999" w:sz="4"/>
+              <w:left w:val="single" w:color="999999" w:sz="4"/>
+              <w:bottom w:val="single" w:color="999999" w:sz="4"/>
+              <w:right w:val="single" w:color="999999" w:sz="4"/>
+            </w:tcBorders>
+            <w:tcMar>
+              <w:top w:type="dxa" w:w="60"/>
+              <w:left w:type="dxa" w:w="100"/>
+              <w:bottom w:type="dxa" w:w="60"/>
+              <w:right w:type="dxa" w:w="100"/>
+            </w:tcMar>
+          </w:tcPr>
+          <w:p>
+            <w:pPr>
+              <w:jc w:val="left"/>
+            </w:pPr>
+            <w:r>
+              <w:rPr>
+                <w:rFonts w:ascii="Arial" w:cs="Arial" w:eastAsia="Arial" w:hAnsi="Arial"/>
+                <w:b w:val="false"/>
+                <w:bCs w:val="false"/>
+                <w:sz w:val="18"/>
+                <w:szCs w:val="18"/>
+              </w:rPr>
+              <w:t xml:space="preserve">Kita tidak menolak PMT; kita meminta masyarakat didengar soal indikator. Riset Alatas dkk. menilai penargetan komunitas tidak didominasi elite [cek]</w:t>
+            </w:r>
+          </w:p>
+        </w:tc>
+        <w:tc>
+          <w:tcPr>
+            <w:tcW w:type="dxa" w:w="1700"/>
+            <w:tcBorders>
+              <w:top w:val="single" w:color="999999" w:sz="4"/>
+              <w:left w:val="single" w:color="999999" w:sz="4"/>
+              <w:bottom w:val="single" w:color="999999" w:sz="4"/>
+              <w:right w:val="single" w:color="999999" w:sz="4"/>
+            </w:tcBorders>
+            <w:tcMar>
+              <w:top w:type="dxa" w:w="60"/>
+              <w:left w:type="dxa" w:w="100"/>
+              <w:bottom w:type="dxa" w:w="60"/>
+              <w:right w:type="dxa" w:w="100"/>
+            </w:tcMar>
+          </w:tcPr>
+          <w:p>
+            <w:pPr>
+              <w:jc w:val="left"/>
+            </w:pPr>
+            <w:r>
+              <w:rPr>
+                <w:rFonts w:ascii="Arial" w:cs="Arial" w:eastAsia="Arial" w:hAnsi="Arial"/>
+                <w:b w:val="false"/>
+                <w:bCs w:val="false"/>
+                <w:sz w:val="18"/>
+                <w:szCs w:val="18"/>
+              </w:rPr>
+              <w:t xml:space="preserve">Ahli 3</w:t>
+            </w:r>
+          </w:p>
+        </w:tc>
+      </w:tr>
+      <w:tr>
+        <w:trPr>
+          <w:cantSplit/>
+        </w:trPr>
+        <w:tc>
+          <w:tcPr>
+            <w:tcW w:type="dxa" w:w="2100"/>
+            <w:tcBorders>
+              <w:top w:val="single" w:color="999999" w:sz="4"/>
+              <w:left w:val="single" w:color="999999" w:sz="4"/>
+              <w:bottom w:val="single" w:color="999999" w:sz="4"/>
+              <w:right w:val="single" w:color="999999" w:sz="4"/>
+            </w:tcBorders>
+            <w:tcMar>
+              <w:top w:type="dxa" w:w="60"/>
+              <w:left w:type="dxa" w:w="100"/>
+              <w:bottom w:type="dxa" w:w="60"/>
+              <w:right w:type="dxa" w:w="100"/>
+            </w:tcMar>
+          </w:tcPr>
+          <w:p>
+            <w:pPr>
+              <w:jc w:val="left"/>
+            </w:pPr>
+            <w:r>
+              <w:rPr>
+                <w:rFonts w:ascii="Arial" w:cs="Arial" w:eastAsia="Arial" w:hAnsi="Arial"/>
+                <w:b w:val="false"/>
+                <w:bCs w:val="false"/>
+                <w:sz w:val="18"/>
+                <w:szCs w:val="18"/>
+              </w:rPr>
+              <w:t xml:space="preserve">Ahli hukum tata negara atau perundang-undangan</w:t>
+            </w:r>
+          </w:p>
+        </w:tc>
+        <w:tc>
+          <w:tcPr>
+            <w:tcW w:type="dxa" w:w="2600"/>
+            <w:tcBorders>
+              <w:top w:val="single" w:color="999999" w:sz="4"/>
+              <w:left w:val="single" w:color="999999" w:sz="4"/>
+              <w:bottom w:val="single" w:color="999999" w:sz="4"/>
+              <w:right w:val="single" w:color="999999" w:sz="4"/>
+            </w:tcBorders>
+            <w:tcMar>
+              <w:top w:type="dxa" w:w="60"/>
+              <w:left w:type="dxa" w:w="100"/>
+              <w:bottom w:type="dxa" w:w="60"/>
+              <w:right w:type="dxa" w:w="100"/>
+            </w:tcMar>
+          </w:tcPr>
+          <w:p>
+            <w:pPr>
+              <w:jc w:val="left"/>
+            </w:pPr>
+            <w:r>
+              <w:rPr>
+                <w:rFonts w:ascii="Arial" w:cs="Arial" w:eastAsia="Arial" w:hAnsi="Arial"/>
+                <w:b w:val="false"/>
+                <w:bCs w:val="false"/>
+                <w:sz w:val="18"/>
+                <w:szCs w:val="18"/>
+              </w:rPr>
+              <w:t xml:space="preserve">Open legal policy; koordinasi adalah urusan antarinstansi; partisipasi sudah dijamin Pasal 41 UU 13/2011 dan Pasal 96 UU 12/2011</w:t>
+            </w:r>
+          </w:p>
+        </w:tc>
+        <w:tc>
+          <w:tcPr>
+            <w:tcW w:type="dxa" w:w="3238"/>
+            <w:tcBorders>
+              <w:top w:val="single" w:color="999999" w:sz="4"/>
+              <w:left w:val="single" w:color="999999" w:sz="4"/>
+              <w:bottom w:val="single" w:color="999999" w:sz="4"/>
+              <w:right w:val="single" w:color="999999" w:sz="4"/>
+            </w:tcBorders>
+            <w:tcMar>
+              <w:top w:type="dxa" w:w="60"/>
+              <w:left w:type="dxa" w:w="100"/>
+              <w:bottom w:type="dxa" w:w="60"/>
+              <w:right w:type="dxa" w:w="100"/>
+            </w:tcMar>
+          </w:tcPr>
+          <w:p>
+            <w:pPr>
+              <w:jc w:val="left"/>
+            </w:pPr>
+            <w:r>
+              <w:rPr>
+                <w:rFonts w:ascii="Arial" w:cs="Arial" w:eastAsia="Arial" w:hAnsi="Arial"/>
+                <w:b w:val="false"/>
+                <w:bCs w:val="false"/>
+                <w:sz w:val="18"/>
+                <w:szCs w:val="18"/>
+              </w:rPr>
+              <w:t xml:space="preserve">Pasal 41 hanya di hilir; Pasal 96 tidak menjangkau Keputusan Menteri; open legal policy dibatasi rasionalitas</w:t>
+            </w:r>
+          </w:p>
+        </w:tc>
+        <w:tc>
+          <w:tcPr>
+            <w:tcW w:type="dxa" w:w="1700"/>
+            <w:tcBorders>
+              <w:top w:val="single" w:color="999999" w:sz="4"/>
+              <w:left w:val="single" w:color="999999" w:sz="4"/>
+              <w:bottom w:val="single" w:color="999999" w:sz="4"/>
+              <w:right w:val="single" w:color="999999" w:sz="4"/>
+            </w:tcBorders>
+            <w:tcMar>
+              <w:top w:type="dxa" w:w="60"/>
+              <w:left w:type="dxa" w:w="100"/>
+              <w:bottom w:type="dxa" w:w="60"/>
+              <w:right w:type="dxa" w:w="100"/>
+            </w:tcMar>
+          </w:tcPr>
+          <w:p>
+            <w:pPr>
+              <w:jc w:val="left"/>
+            </w:pPr>
+            <w:r>
+              <w:rPr>
+                <w:rFonts w:ascii="Arial" w:cs="Arial" w:eastAsia="Arial" w:hAnsi="Arial"/>
+                <w:b w:val="false"/>
+                <w:bCs w:val="false"/>
+                <w:sz w:val="18"/>
+                <w:szCs w:val="18"/>
+              </w:rPr>
+              <w:t xml:space="preserve">Ahli 1 dan Ahli 2</w:t>
+            </w:r>
+          </w:p>
+        </w:tc>
+      </w:tr>
+      <w:tr>
+        <w:trPr>
+          <w:cantSplit/>
+        </w:trPr>
+        <w:tc>
+          <w:tcPr>
+            <w:tcW w:type="dxa" w:w="2100"/>
+            <w:tcBorders>
+              <w:top w:val="single" w:color="999999" w:sz="4"/>
+              <w:left w:val="single" w:color="999999" w:sz="4"/>
+              <w:bottom w:val="single" w:color="999999" w:sz="4"/>
+              <w:right w:val="single" w:color="999999" w:sz="4"/>
+            </w:tcBorders>
+            <w:tcMar>
+              <w:top w:type="dxa" w:w="60"/>
+              <w:left w:type="dxa" w:w="100"/>
+              <w:bottom w:type="dxa" w:w="60"/>
+              <w:right w:type="dxa" w:w="100"/>
+            </w:tcMar>
+          </w:tcPr>
+          <w:p>
+            <w:pPr>
+              <w:jc w:val="left"/>
+            </w:pPr>
+            <w:r>
+              <w:rPr>
+                <w:rFonts w:ascii="Arial" w:cs="Arial" w:eastAsia="Arial" w:hAnsi="Arial"/>
+                <w:b w:val="false"/>
+                <w:bCs w:val="false"/>
+                <w:sz w:val="18"/>
+                <w:szCs w:val="18"/>
+              </w:rPr>
+              <w:t xml:space="preserve">Ahli kebijakan sosial atau administrasi publik</w:t>
+            </w:r>
+          </w:p>
+        </w:tc>
+        <w:tc>
+          <w:tcPr>
+            <w:tcW w:type="dxa" w:w="2600"/>
+            <w:tcBorders>
+              <w:top w:val="single" w:color="999999" w:sz="4"/>
+              <w:left w:val="single" w:color="999999" w:sz="4"/>
+              <w:bottom w:val="single" w:color="999999" w:sz="4"/>
+              <w:right w:val="single" w:color="999999" w:sz="4"/>
+            </w:tcBorders>
+            <w:tcMar>
+              <w:top w:type="dxa" w:w="60"/>
+              <w:left w:type="dxa" w:w="100"/>
+              <w:bottom w:type="dxa" w:w="60"/>
+              <w:right w:type="dxa" w:w="100"/>
+            </w:tcMar>
+          </w:tcPr>
+          <w:p>
+            <w:pPr>
+              <w:jc w:val="left"/>
+            </w:pPr>
+            <w:r>
+              <w:rPr>
+                <w:rFonts w:ascii="Arial" w:cs="Arial" w:eastAsia="Arial" w:hAnsi="Arial"/>
+                <w:b w:val="false"/>
+                <w:bCs w:val="false"/>
+                <w:sz w:val="18"/>
+                <w:szCs w:val="18"/>
+              </w:rPr>
+              <w:t xml:space="preserve">Standar nasional perlu untuk APBN dan konsistensi; partisipasi memperlambat penyaluran</w:t>
+            </w:r>
+          </w:p>
+        </w:tc>
+        <w:tc>
+          <w:tcPr>
+            <w:tcW w:type="dxa" w:w="3238"/>
+            <w:tcBorders>
+              <w:top w:val="single" w:color="999999" w:sz="4"/>
+              <w:left w:val="single" w:color="999999" w:sz="4"/>
+              <w:bottom w:val="single" w:color="999999" w:sz="4"/>
+              <w:right w:val="single" w:color="999999" w:sz="4"/>
+            </w:tcBorders>
+            <w:tcMar>
+              <w:top w:type="dxa" w:w="60"/>
+              <w:left w:type="dxa" w:w="100"/>
+              <w:bottom w:type="dxa" w:w="60"/>
+              <w:right w:type="dxa" w:w="100"/>
+            </w:tcMar>
+          </w:tcPr>
+          <w:p>
+            <w:pPr>
+              <w:jc w:val="left"/>
+            </w:pPr>
+            <w:r>
+              <w:rPr>
+                <w:rFonts w:ascii="Arial" w:cs="Arial" w:eastAsia="Arial" w:hAnsi="Arial"/>
+                <w:b w:val="false"/>
+                <w:bCs w:val="false"/>
+                <w:sz w:val="18"/>
+                <w:szCs w:val="18"/>
+              </w:rPr>
+              <w:t xml:space="preserve">Petitum tidak menghapus standar nasional; kanal sanggah data sudah berjalan, jadi partisipasi terbukti bisa; partisipasi bukan hak veto</w:t>
+            </w:r>
+          </w:p>
+        </w:tc>
+        <w:tc>
+          <w:tcPr>
+            <w:tcW w:type="dxa" w:w="1700"/>
+            <w:tcBorders>
+              <w:top w:val="single" w:color="999999" w:sz="4"/>
+              <w:left w:val="single" w:color="999999" w:sz="4"/>
+              <w:bottom w:val="single" w:color="999999" w:sz="4"/>
+              <w:right w:val="single" w:color="999999" w:sz="4"/>
+            </w:tcBorders>
+            <w:tcMar>
+              <w:top w:type="dxa" w:w="60"/>
+              <w:left w:type="dxa" w:w="100"/>
+              <w:bottom w:type="dxa" w:w="60"/>
+              <w:right w:type="dxa" w:w="100"/>
+            </w:tcMar>
+          </w:tcPr>
+          <w:p>
+            <w:pPr>
+              <w:jc w:val="left"/>
+            </w:pPr>
+            <w:r>
+              <w:rPr>
+                <w:rFonts w:ascii="Arial" w:cs="Arial" w:eastAsia="Arial" w:hAnsi="Arial"/>
+                <w:b w:val="false"/>
+                <w:bCs w:val="false"/>
+                <w:sz w:val="18"/>
+                <w:szCs w:val="18"/>
+              </w:rPr>
+              <w:t xml:space="preserve">Ahli 3 dan Ahli 4</w:t>
+            </w:r>
+          </w:p>
+        </w:tc>
+      </w:tr>
+      <w:tr>
+        <w:trPr>
+          <w:cantSplit/>
+        </w:trPr>
+        <w:tc>
+          <w:tcPr>
+            <w:tcW w:type="dxa" w:w="2100"/>
+            <w:tcBorders>
+              <w:top w:val="single" w:color="999999" w:sz="4"/>
+              <w:left w:val="single" w:color="999999" w:sz="4"/>
+              <w:bottom w:val="single" w:color="999999" w:sz="4"/>
+              <w:right w:val="single" w:color="999999" w:sz="4"/>
+            </w:tcBorders>
+            <w:tcMar>
+              <w:top w:type="dxa" w:w="60"/>
+              <w:left w:type="dxa" w:w="100"/>
+              <w:bottom w:type="dxa" w:w="60"/>
+              <w:right w:type="dxa" w:w="100"/>
+            </w:tcMar>
+          </w:tcPr>
+          <w:p>
+            <w:pPr>
+              <w:jc w:val="left"/>
+            </w:pPr>
+            <w:r>
+              <w:rPr>
+                <w:rFonts w:ascii="Arial" w:cs="Arial" w:eastAsia="Arial" w:hAnsi="Arial"/>
+                <w:b w:val="false"/>
+                <w:bCs w:val="false"/>
+                <w:sz w:val="18"/>
+                <w:szCs w:val="18"/>
+              </w:rPr>
+              <w:t xml:space="preserve">Ahli keuangan negara atau fiskal</w:t>
+            </w:r>
+          </w:p>
+        </w:tc>
+        <w:tc>
+          <w:tcPr>
+            <w:tcW w:type="dxa" w:w="2600"/>
+            <w:tcBorders>
+              <w:top w:val="single" w:color="999999" w:sz="4"/>
+              <w:left w:val="single" w:color="999999" w:sz="4"/>
+              <w:bottom w:val="single" w:color="999999" w:sz="4"/>
+              <w:right w:val="single" w:color="999999" w:sz="4"/>
+            </w:tcBorders>
+            <w:tcMar>
+              <w:top w:type="dxa" w:w="60"/>
+              <w:left w:type="dxa" w:w="100"/>
+              <w:bottom w:type="dxa" w:w="60"/>
+              <w:right w:type="dxa" w:w="100"/>
+            </w:tcMar>
+          </w:tcPr>
+          <w:p>
+            <w:pPr>
+              <w:jc w:val="left"/>
+            </w:pPr>
+            <w:r>
+              <w:rPr>
+                <w:rFonts w:ascii="Arial" w:cs="Arial" w:eastAsia="Arial" w:hAnsi="Arial"/>
+                <w:b w:val="false"/>
+                <w:bCs w:val="false"/>
+                <w:sz w:val="18"/>
+                <w:szCs w:val="18"/>
+              </w:rPr>
+              <w:t xml:space="preserve">Penargetan ketat mencegah pemborosan anggaran</w:t>
+            </w:r>
+          </w:p>
+        </w:tc>
+        <w:tc>
+          <w:tcPr>
+            <w:tcW w:type="dxa" w:w="3238"/>
+            <w:tcBorders>
+              <w:top w:val="single" w:color="999999" w:sz="4"/>
+              <w:left w:val="single" w:color="999999" w:sz="4"/>
+              <w:bottom w:val="single" w:color="999999" w:sz="4"/>
+              <w:right w:val="single" w:color="999999" w:sz="4"/>
+            </w:tcBorders>
+            <w:tcMar>
+              <w:top w:type="dxa" w:w="60"/>
+              <w:left w:type="dxa" w:w="100"/>
+              <w:bottom w:type="dxa" w:w="60"/>
+              <w:right w:type="dxa" w:w="100"/>
+            </w:tcMar>
+          </w:tcPr>
+          <w:p>
+            <w:pPr>
+              <w:jc w:val="left"/>
+            </w:pPr>
+            <w:r>
+              <w:rPr>
+                <w:rFonts w:ascii="Arial" w:cs="Arial" w:eastAsia="Arial" w:hAnsi="Arial"/>
+                <w:b w:val="false"/>
+                <w:bCs w:val="false"/>
+                <w:sz w:val="18"/>
+                <w:szCs w:val="18"/>
+              </w:rPr>
+              <w:t xml:space="preserve">Salah sasaran justru memboroskan anggaran; BPK dan CORE mencatat kesalahan besar</w:t>
+            </w:r>
+          </w:p>
+        </w:tc>
+        <w:tc>
+          <w:tcPr>
+            <w:tcW w:type="dxa" w:w="1700"/>
+            <w:tcBorders>
+              <w:top w:val="single" w:color="999999" w:sz="4"/>
+              <w:left w:val="single" w:color="999999" w:sz="4"/>
+              <w:bottom w:val="single" w:color="999999" w:sz="4"/>
+              <w:right w:val="single" w:color="999999" w:sz="4"/>
+            </w:tcBorders>
+            <w:tcMar>
+              <w:top w:type="dxa" w:w="60"/>
+              <w:left w:type="dxa" w:w="100"/>
+              <w:bottom w:type="dxa" w:w="60"/>
+              <w:right w:type="dxa" w:w="100"/>
+            </w:tcMar>
+          </w:tcPr>
+          <w:p>
+            <w:pPr>
+              <w:jc w:val="left"/>
+            </w:pPr>
+            <w:r>
+              <w:rPr>
+                <w:rFonts w:ascii="Arial" w:cs="Arial" w:eastAsia="Arial" w:hAnsi="Arial"/>
+                <w:b w:val="false"/>
+                <w:bCs w:val="false"/>
+                <w:sz w:val="18"/>
+                <w:szCs w:val="18"/>
+              </w:rPr>
+              <w:t xml:space="preserve">Ahli 3</w:t>
+            </w:r>
+          </w:p>
+        </w:tc>
+      </w:tr>
+    </w:tbl>
+    <w:p>
+      <w:pPr>
+        <w:spacing w:after="120"/>
+      </w:pPr>
+    </w:p>
+    <w:p>
+      <w:pPr>
+        <w:spacing w:after="120" w:line="276"/>
+        <w:jc w:val="both"/>
+      </w:pPr>
+      <w:r>
+        <w:rPr>
+          <w:rFonts w:ascii="Arial" w:cs="Arial" w:eastAsia="Arial" w:hAnsi="Arial"/>
+        </w:rPr>
+        <w:t xml:space="preserve">DPR biasanya memberi keterangan tentang maksud pembentuk UU. Cari naskah akademik dan risalah pembahasan RUU Penanganan Fakir Miskin 2011: jika partisipasi masyarakat pernah dibahas lalu dihapus, itu bahan kuat untuk kita [cek].</w:t>
+      </w:r>
+    </w:p>
+    <w:p>
+      <w:pPr>
+        <w:pStyle w:val="Heading1"/>
+      </w:pPr>
+      <w:r>
+        <w:rPr>
+          <w:rFonts w:ascii="Arial" w:cs="Arial" w:eastAsia="Arial" w:hAnsi="Arial"/>
+        </w:rPr>
+        <w:t xml:space="preserve">9. Yang Perlu Diputuskan Bersama</w:t>
+      </w:r>
+    </w:p>
+    <w:p>
+      <w:pPr>
+        <w:spacing w:after="120" w:line="276"/>
+        <w:jc w:val="both"/>
+      </w:pPr>
+      <w:r>
+        <w:rPr>
+          <w:rFonts w:ascii="Arial" w:cs="Arial" w:eastAsia="Arial" w:hAnsi="Arial"/>
+        </w:rPr>
+        <w:t xml:space="preserve">Enam hal ini perlu disepakati kelompok sebelum naskah permohonan ditulis.</w:t>
+      </w:r>
+    </w:p>
+    <w:p>
+      <w:pPr>
+        <w:spacing w:after="60"/>
+        <w:ind w:left="360"/>
+      </w:pPr>
+      <w:r>
+        <w:rPr>
+          <w:rFonts w:ascii="Arial" w:cs="Arial" w:eastAsia="Arial" w:hAnsi="Arial"/>
+        </w:rPr>
+        <w:t xml:space="preserve">☐  </w:t>
+      </w:r>
+      <w:r>
+        <w:rPr>
+          <w:rFonts w:ascii="Arial" w:cs="Arial" w:eastAsia="Arial" w:hAnsi="Arial"/>
+        </w:rPr>
+        <w:t xml:space="preserve">Sepakati usulan pembagian 16 anggota (5 kuasa hukum, 4 Pemohon prinsipal, 3 saksi, 4 ahli) dan cek ke tim Pemerintah atau dosen agar jenis saksi dan ahli tidak bertabrakan</w:t>
+      </w:r>
+    </w:p>
+    <w:p>
+      <w:pPr>
+        <w:spacing w:after="60"/>
+        <w:ind w:left="360"/>
+      </w:pPr>
+      <w:r>
+        <w:rPr>
+          <w:rFonts w:ascii="Arial" w:cs="Arial" w:eastAsia="Arial" w:hAnsi="Arial"/>
+        </w:rPr>
+        <w:t xml:space="preserve">☐  </w:t>
+      </w:r>
+      <w:r>
+        <w:rPr>
+          <w:rFonts w:ascii="Arial" w:cs="Arial" w:eastAsia="Arial" w:hAnsi="Arial"/>
+        </w:rPr>
+        <w:t xml:space="preserve">Konfirmasi ke dosen: cukup masyarakat (Opsi A) atau ditambah pemerintah daerah (Opsi B) dalam petitum</w:t>
+      </w:r>
+    </w:p>
+    <w:p>
+      <w:pPr>
+        <w:spacing w:after="60"/>
+        <w:ind w:left="360"/>
+      </w:pPr>
+      <w:r>
+        <w:rPr>
+          <w:rFonts w:ascii="Arial" w:cs="Arial" w:eastAsia="Arial" w:hAnsi="Arial"/>
+        </w:rPr>
+        <w:t xml:space="preserve">☐  </w:t>
+      </w:r>
+      <w:r>
+        <w:rPr>
+          <w:rFonts w:ascii="Arial" w:cs="Arial" w:eastAsia="Arial" w:hAnsi="Arial"/>
+        </w:rPr>
+        <w:t xml:space="preserve">Konfirmasi ke dosen: frasa “termasuk fakir miskin” dalam petitum dipertahankan atau dihapus</w:t>
+      </w:r>
+    </w:p>
+    <w:p>
+      <w:pPr>
+        <w:spacing w:after="60"/>
+        <w:ind w:left="360"/>
+      </w:pPr>
+      <w:r>
+        <w:rPr>
+          <w:rFonts w:ascii="Arial" w:cs="Arial" w:eastAsia="Arial" w:hAnsi="Arial"/>
+        </w:rPr>
+        <w:t xml:space="preserve">☐  </w:t>
+      </w:r>
+      <w:r>
+        <w:rPr>
+          <w:rFonts w:ascii="Arial" w:cs="Arial" w:eastAsia="Arial" w:hAnsi="Arial"/>
+        </w:rPr>
+        <w:t xml:space="preserve">Perlu tidaknya Pemohon V, misalnya ibu rumah tangga di kontrakan yang tercatat desil 10, jika peran masih tersisa</w:t>
+      </w:r>
+    </w:p>
+    <w:p>
+      <w:pPr>
+        <w:spacing w:after="60"/>
+        <w:ind w:left="360"/>
+      </w:pPr>
+      <w:r>
+        <w:rPr>
+          <w:rFonts w:ascii="Arial" w:cs="Arial" w:eastAsia="Arial" w:hAnsi="Arial"/>
+        </w:rPr>
+        <w:t xml:space="preserve">☐  </w:t>
+      </w:r>
+      <w:r>
+        <w:rPr>
+          <w:rFonts w:ascii="Arial" w:cs="Arial" w:eastAsia="Arial" w:hAnsi="Arial"/>
+        </w:rPr>
+        <w:t xml:space="preserve">Pembagian tugas mengumpulkan bukti: teks Kepmensos 146/2013 dan 262/2022, Inpres 4/2025, Peraturan BPS 6/2025, Putusan MK 218/PUU-XXIII/2025, berita polemik desil</w:t>
+      </w:r>
+    </w:p>
+    <w:p>
+      <w:pPr>
+        <w:spacing w:after="60"/>
+        <w:ind w:left="360"/>
+      </w:pPr>
+      <w:r>
+        <w:rPr>
+          <w:rFonts w:ascii="Arial" w:cs="Arial" w:eastAsia="Arial" w:hAnsi="Arial"/>
+        </w:rPr>
+        <w:t xml:space="preserve">☐  </w:t>
+      </w:r>
+      <w:r>
+        <w:rPr>
+          <w:rFonts w:ascii="Arial" w:cs="Arial" w:eastAsia="Arial" w:hAnsi="Arial"/>
+        </w:rPr>
+        <w:t xml:space="preserve">Pembaruan fakta desil seminggu sebelum sidang simulasi</w:t>
+      </w:r>
+    </w:p>
+    <w:p>
+      <w:pPr>
+        <w:pStyle w:val="Heading1"/>
+      </w:pPr>
+      <w:r>
+        <w:rPr>
+          <w:rFonts w:ascii="Arial" w:cs="Arial" w:eastAsia="Arial" w:hAnsi="Arial"/>
+        </w:rPr>
+        <w:t xml:space="preserve">10. Sumber dan Catatan Verifikasi</w:t>
+      </w:r>
+    </w:p>
+    <w:p>
+      <w:pPr>
+        <w:spacing w:after="120" w:line="276"/>
+        <w:jc w:val="both"/>
+      </w:pPr>
+      <w:r>
+        <w:rPr>
+          <w:rFonts w:ascii="Arial" w:cs="Arial" w:eastAsia="Arial" w:hAnsi="Arial"/>
+        </w:rPr>
+        <w:t xml:space="preserve">Teks UU 13/2011 sudah dicek langsung dari PDF resmi (LN 2011 No. 83, TLN 5235). Fakta desil diambil dari hasil pencarian berita; sebagian halaman tidak bisa dibuka saat penyusunan, jadi buka dan cocokkan sebelum dikutip.</w:t>
+      </w:r>
+    </w:p>
+    <w:p>
+      <w:pPr>
+        <w:spacing w:after="60" w:before="120"/>
+      </w:pPr>
+      <w:r>
+        <w:rPr>
+          <w:rFonts w:ascii="Arial" w:cs="Arial" w:eastAsia="Arial" w:hAnsi="Arial"/>
+          <w:b/>
+          <w:bCs/>
+        </w:rPr>
+        <w:t xml:space="preserve">Perlu dicek ulang:</w:t>
       </w:r>
     </w:p>
     <w:p>
@@ -6660,6 +8674,54 @@
         <w:rPr>
           <w:rFonts w:ascii="Arial" w:cs="Arial" w:eastAsia="Arial" w:hAnsi="Arial"/>
         </w:rPr>
+        <w:t xml:space="preserve">Isi lengkap Kepmensos 262/HUK/2022 (daftar 9 indikator)</w:t>
+      </w:r>
+    </w:p>
+    <w:p>
+      <w:pPr>
+        <w:pStyle w:val="ListParagraph"/>
+        <w:numPr>
+          <w:ilvl w:val="0"/>
+          <w:numId w:val="3"/>
+        </w:numPr>
+        <w:spacing w:after="60"/>
+      </w:pPr>
+      <w:r>
+        <w:rPr>
+          <w:rFonts w:ascii="Arial" w:cs="Arial" w:eastAsia="Arial" w:hAnsi="Arial"/>
+        </w:rPr>
+        <w:t xml:space="preserve">Nomor pasal UU 25/2009 tentang pelibatan masyarakat dalam penyusunan standar pelayanan</w:t>
+      </w:r>
+    </w:p>
+    <w:p>
+      <w:pPr>
+        <w:pStyle w:val="ListParagraph"/>
+        <w:numPr>
+          <w:ilvl w:val="0"/>
+          <w:numId w:val="3"/>
+        </w:numPr>
+        <w:spacing w:after="60"/>
+      </w:pPr>
+      <w:r>
+        <w:rPr>
+          <w:rFonts w:ascii="Arial" w:cs="Arial" w:eastAsia="Arial" w:hAnsi="Arial"/>
+        </w:rPr>
+        <w:t xml:space="preserve">Apakah pemeringkatan desil dilakukan secara nasional atau per wilayah</w:t>
+      </w:r>
+    </w:p>
+    <w:p>
+      <w:pPr>
+        <w:pStyle w:val="ListParagraph"/>
+        <w:numPr>
+          <w:ilvl w:val="0"/>
+          <w:numId w:val="3"/>
+        </w:numPr>
+        <w:spacing w:after="60"/>
+      </w:pPr>
+      <w:r>
+        <w:rPr>
+          <w:rFonts w:ascii="Arial" w:cs="Arial" w:eastAsia="Arial" w:hAnsi="Arial"/>
+        </w:rPr>
         <w:t xml:space="preserve">Belum adanya pengujian Pasal 8–11 UU 13/2011 di MK (cek daftar perkara di mkri.id)</w:t>
       </w:r>
     </w:p>
@@ -6685,7 +8747,7 @@
         </w:numPr>
         <w:spacing w:after="40"/>
       </w:pPr>
-      <w:hyperlink w:history="1" r:id="rIdgkgpjmuploh2vdarlhu5k">
+      <w:hyperlink w:history="1" r:id="rIdnho-vouksdoxvp2zsqm6u">
         <w:r>
           <w:rPr>
             <w:rStyle w:val="Hyperlink"/>
@@ -6706,7 +8768,7 @@
         </w:numPr>
         <w:spacing w:after="40"/>
       </w:pPr>
-      <w:hyperlink w:history="1" r:id="rIdusxgsz84_3kawmef7itvx">
+      <w:hyperlink w:history="1" r:id="rIdd61vm7eiucinn420f5zst">
         <w:r>
           <w:rPr>
             <w:rStyle w:val="Hyperlink"/>
@@ -6727,7 +8789,7 @@
         </w:numPr>
         <w:spacing w:after="40"/>
       </w:pPr>
-      <w:hyperlink w:history="1" r:id="rIdcztbrial3qitzbitokkvt">
+      <w:hyperlink w:history="1" r:id="rIdmyzvbhzcboq2ctwniyyc_">
         <w:r>
           <w:rPr>
             <w:rStyle w:val="Hyperlink"/>
@@ -6748,7 +8810,7 @@
         </w:numPr>
         <w:spacing w:after="40"/>
       </w:pPr>
-      <w:hyperlink w:history="1" r:id="rIduedalicel1gde2ztibyhe">
+      <w:hyperlink w:history="1" r:id="rIdeodin6b2mckz63kwfgzdc">
         <w:r>
           <w:rPr>
             <w:rStyle w:val="Hyperlink"/>
@@ -6769,7 +8831,7 @@
         </w:numPr>
         <w:spacing w:after="40"/>
       </w:pPr>
-      <w:hyperlink w:history="1" r:id="rId5b2s7ailxtzsgwkvwv2mq">
+      <w:hyperlink w:history="1" r:id="rIdtquzzedrpmbznbtvx-ce3">
         <w:r>
           <w:rPr>
             <w:rStyle w:val="Hyperlink"/>
@@ -6790,7 +8852,7 @@
         </w:numPr>
         <w:spacing w:after="40"/>
       </w:pPr>
-      <w:hyperlink w:history="1" r:id="rIdmgxuxhtyi4wvogsabowlu">
+      <w:hyperlink w:history="1" r:id="rId2_9jrat48plrqk0oqzoat">
         <w:r>
           <w:rPr>
             <w:rStyle w:val="Hyperlink"/>
@@ -6811,7 +8873,7 @@
         </w:numPr>
         <w:spacing w:after="40"/>
       </w:pPr>
-      <w:hyperlink w:history="1" r:id="rIdn6rwavndl6stmktnyz7qx">
+      <w:hyperlink w:history="1" r:id="rIdpkapyzstzcyrxfjm3pa-u">
         <w:r>
           <w:rPr>
             <w:rStyle w:val="Hyperlink"/>
@@ -6832,7 +8894,7 @@
         </w:numPr>
         <w:spacing w:after="40"/>
       </w:pPr>
-      <w:hyperlink w:history="1" r:id="rIdwl6e04e8zw0ebuwlxgz9a">
+      <w:hyperlink w:history="1" r:id="rIdavqx6odotujsgrjyr_lef">
         <w:r>
           <w:rPr>
             <w:rStyle w:val="Hyperlink"/>
@@ -6853,7 +8915,7 @@
         </w:numPr>
         <w:spacing w:after="40"/>
       </w:pPr>
-      <w:hyperlink w:history="1" r:id="rId2dbyol2pdtow438kvjd_2">
+      <w:hyperlink w:history="1" r:id="rIdlefe905gqsaq4xime3swm">
         <w:r>
           <w:rPr>
             <w:rStyle w:val="Hyperlink"/>
@@ -6874,7 +8936,7 @@
         </w:numPr>
         <w:spacing w:after="40"/>
       </w:pPr>
-      <w:hyperlink w:history="1" r:id="rIdj35qlz8vstpgzrzosxgze">
+      <w:hyperlink w:history="1" r:id="rId0whmcbsskk1gxj5hunnne">
         <w:r>
           <w:rPr>
             <w:rStyle w:val="Hyperlink"/>
@@ -6895,7 +8957,7 @@
         </w:numPr>
         <w:spacing w:after="40"/>
       </w:pPr>
-      <w:hyperlink w:history="1" r:id="rIdp21ddjm7v2ouvglvvv-pz">
+      <w:hyperlink w:history="1" r:id="rIdznq9xxai9cb7t_kk1gme4">
         <w:r>
           <w:rPr>
             <w:rStyle w:val="Hyperlink"/>
@@ -6916,7 +8978,7 @@
         </w:numPr>
         <w:spacing w:after="40"/>
       </w:pPr>
-      <w:hyperlink w:history="1" r:id="rIduhhucswe6niwyitcu4hji">
+      <w:hyperlink w:history="1" r:id="rId--lwnyhphw0idzoytqkgt">
         <w:r>
           <w:rPr>
             <w:rStyle w:val="Hyperlink"/>
@@ -6937,7 +8999,7 @@
         </w:numPr>
         <w:spacing w:after="40"/>
       </w:pPr>
-      <w:hyperlink w:history="1" r:id="rIdpqhffsoo7ydlfpjao5v3b">
+      <w:hyperlink w:history="1" r:id="rIdo531jagokf7bnyuyqii5v">
         <w:r>
           <w:rPr>
             <w:rStyle w:val="Hyperlink"/>
@@ -6958,7 +9020,7 @@
         </w:numPr>
         <w:spacing w:after="40"/>
       </w:pPr>
-      <w:hyperlink w:history="1" r:id="rId8kfgh_xip7tp_3_e6nuft">
+      <w:hyperlink w:history="1" r:id="rIds3bz4qb7jl1y2htklcxbe">
         <w:r>
           <w:rPr>
             <w:rStyle w:val="Hyperlink"/>
@@ -6979,7 +9041,7 @@
         </w:numPr>
         <w:spacing w:after="40"/>
       </w:pPr>
-      <w:hyperlink w:history="1" r:id="rIdatpl-fdvnj4wvirftipxw">
+      <w:hyperlink w:history="1" r:id="rIdqipyce_goiij-t3t4r74a">
         <w:r>
           <w:rPr>
             <w:rStyle w:val="Hyperlink"/>

</xml_diff>

<commit_message>
Update reference doc: one legal counsel, seven principal petitioners, four witnesses
Co-Authored-By: Claude Opus 5.5 <noreply@anthropic.com>
Claude-Session: https://claude.ai/code/session_017oEPUMkR5nJuWbwJeQ76i8
</commit_message>
<xml_diff>
--- a/Acuan_Kelompok_Pemohon_UU13_2011.docx
+++ b/Acuan_Kelompok_Pemohon_UU13_2011.docx
@@ -2520,7 +2520,21 @@
         <w:rPr>
           <w:rFonts w:ascii="Arial" w:cs="Arial" w:eastAsia="Arial" w:hAnsi="Arial"/>
         </w:rPr>
-        <w:t xml:space="preserve">Empat pemohon mewakili empat wajah masalah: warga yang tercoret desil, petugas lapangan, warga wilayah pesisir, dan organisasi advokasi. Semua fiktif; NIK ditulis bertanda x.</w:t>
+        <w:t xml:space="preserve">Enam pemohon mewakili enam wajah masalah: warga yang tercoret desil, petugas lapangan, warga pesisir, organisasi advokasi, keluarga yang salah peringkat, dan penyandang disabilitas. Pemohon IV diwakili dua pengurus, sehingga Pemohon prinsipal berjumlah </w:t>
+      </w:r>
+      <w:r>
+        <w:rPr>
+          <w:rFonts w:ascii="Arial" w:cs="Arial" w:eastAsia="Arial" w:hAnsi="Arial"/>
+          <w:b/>
+          <w:bCs/>
+        </w:rPr>
+        <w:t xml:space="preserve">tujuh orang</w:t>
+      </w:r>
+      <w:r>
+        <w:rPr>
+          <w:rFonts w:ascii="Arial" w:cs="Arial" w:eastAsia="Arial" w:hAnsi="Arial"/>
+        </w:rPr>
+        <w:t xml:space="preserve">. Semua fiktif; NIK ditulis bertanda x.</w:t>
       </w:r>
     </w:p>
     <w:tbl>
@@ -3304,7 +3318,7 @@
                 <w:sz w:val="18"/>
                 <w:szCs w:val="18"/>
               </w:rPr>
-              <w:t xml:space="preserve">Badan hukum perkumpulan (akta notaris + SK Kemenkumham); diwakili Ketua dan Sekretaris sesuai AD/ART</w:t>
+              <w:t xml:space="preserve">Badan hukum perkumpulan (akta notaris + SK Kemenkumham); diwakili Ketua Hendra Wijaya dan Sekretaris Nadia Putri sesuai AD/ART</w:t>
             </w:r>
           </w:p>
         </w:tc>
@@ -3369,6 +3383,336 @@
                 <w:szCs w:val="18"/>
               </w:rPr>
               <w:t xml:space="preserve">Organisasi advokasi yang pintunya tertutup di hulu</w:t>
+            </w:r>
+          </w:p>
+        </w:tc>
+      </w:tr>
+      <w:tr>
+        <w:trPr>
+          <w:cantSplit/>
+        </w:trPr>
+        <w:tc>
+          <w:tcPr>
+            <w:tcW w:type="dxa" w:w="900"/>
+            <w:tcBorders>
+              <w:top w:val="single" w:color="999999" w:sz="4"/>
+              <w:left w:val="single" w:color="999999" w:sz="4"/>
+              <w:bottom w:val="single" w:color="999999" w:sz="4"/>
+              <w:right w:val="single" w:color="999999" w:sz="4"/>
+            </w:tcBorders>
+            <w:tcMar>
+              <w:top w:type="dxa" w:w="60"/>
+              <w:left w:type="dxa" w:w="100"/>
+              <w:bottom w:type="dxa" w:w="60"/>
+              <w:right w:type="dxa" w:w="100"/>
+            </w:tcMar>
+          </w:tcPr>
+          <w:p>
+            <w:pPr>
+              <w:jc w:val="left"/>
+            </w:pPr>
+            <w:r>
+              <w:rPr>
+                <w:rFonts w:ascii="Arial" w:cs="Arial" w:eastAsia="Arial" w:hAnsi="Arial"/>
+                <w:b w:val="false"/>
+                <w:bCs w:val="false"/>
+                <w:sz w:val="18"/>
+                <w:szCs w:val="18"/>
+              </w:rPr>
+              <w:t xml:space="preserve">V</w:t>
+            </w:r>
+          </w:p>
+        </w:tc>
+        <w:tc>
+          <w:tcPr>
+            <w:tcW w:type="dxa" w:w="1650"/>
+            <w:tcBorders>
+              <w:top w:val="single" w:color="999999" w:sz="4"/>
+              <w:left w:val="single" w:color="999999" w:sz="4"/>
+              <w:bottom w:val="single" w:color="999999" w:sz="4"/>
+              <w:right w:val="single" w:color="999999" w:sz="4"/>
+            </w:tcBorders>
+            <w:tcMar>
+              <w:top w:type="dxa" w:w="60"/>
+              <w:left w:type="dxa" w:w="100"/>
+              <w:bottom w:type="dxa" w:w="60"/>
+              <w:right w:type="dxa" w:w="100"/>
+            </w:tcMar>
+          </w:tcPr>
+          <w:p>
+            <w:pPr>
+              <w:jc w:val="left"/>
+            </w:pPr>
+            <w:r>
+              <w:rPr>
+                <w:rFonts w:ascii="Arial" w:cs="Arial" w:eastAsia="Arial" w:hAnsi="Arial"/>
+                <w:b w:val="false"/>
+                <w:bCs w:val="false"/>
+                <w:sz w:val="18"/>
+                <w:szCs w:val="18"/>
+              </w:rPr>
+              <w:t xml:space="preserve">Rahmawati</w:t>
+            </w:r>
+          </w:p>
+        </w:tc>
+        <w:tc>
+          <w:tcPr>
+            <w:tcW w:type="dxa" w:w="3288"/>
+            <w:tcBorders>
+              <w:top w:val="single" w:color="999999" w:sz="4"/>
+              <w:left w:val="single" w:color="999999" w:sz="4"/>
+              <w:bottom w:val="single" w:color="999999" w:sz="4"/>
+              <w:right w:val="single" w:color="999999" w:sz="4"/>
+            </w:tcBorders>
+            <w:tcMar>
+              <w:top w:type="dxa" w:w="60"/>
+              <w:left w:type="dxa" w:w="100"/>
+              <w:bottom w:type="dxa" w:w="60"/>
+              <w:right w:type="dxa" w:w="100"/>
+            </w:tcMar>
+          </w:tcPr>
+          <w:p>
+            <w:pPr>
+              <w:jc w:val="left"/>
+            </w:pPr>
+            <w:r>
+              <w:rPr>
+                <w:rFonts w:ascii="Arial" w:cs="Arial" w:eastAsia="Arial" w:hAnsi="Arial"/>
+                <w:b w:val="false"/>
+                <w:bCs w:val="false"/>
+                <w:sz w:val="18"/>
+                <w:szCs w:val="18"/>
+              </w:rPr>
+              <w:t xml:space="preserve">33 tahun, ibu rumah tangga, 2 anak; kontrakan tipe 36 di Kec. Tambun Selatan, Kab. Bekasi; suami buruh pabrik kontrak berpenghasilan ±Rp3 juta per bulan; NIK 3216xxxxxxxxxxxx</w:t>
+            </w:r>
+          </w:p>
+        </w:tc>
+        <w:tc>
+          <w:tcPr>
+            <w:tcW w:type="dxa" w:w="1600"/>
+            <w:tcBorders>
+              <w:top w:val="single" w:color="999999" w:sz="4"/>
+              <w:left w:val="single" w:color="999999" w:sz="4"/>
+              <w:bottom w:val="single" w:color="999999" w:sz="4"/>
+              <w:right w:val="single" w:color="999999" w:sz="4"/>
+            </w:tcBorders>
+            <w:tcMar>
+              <w:top w:type="dxa" w:w="60"/>
+              <w:left w:type="dxa" w:w="100"/>
+              <w:bottom w:type="dxa" w:w="60"/>
+              <w:right w:type="dxa" w:w="100"/>
+            </w:tcMar>
+          </w:tcPr>
+          <w:p>
+            <w:pPr>
+              <w:jc w:val="left"/>
+            </w:pPr>
+            <w:r>
+              <w:rPr>
+                <w:rFonts w:ascii="Arial" w:cs="Arial" w:eastAsia="Arial" w:hAnsi="Arial"/>
+                <w:b w:val="false"/>
+                <w:bCs w:val="false"/>
+                <w:sz w:val="18"/>
+                <w:szCs w:val="18"/>
+              </w:rPr>
+              <w:t xml:space="preserve">Perorangan WNI</w:t>
+            </w:r>
+          </w:p>
+        </w:tc>
+        <w:tc>
+          <w:tcPr>
+            <w:tcW w:type="dxa" w:w="2200"/>
+            <w:tcBorders>
+              <w:top w:val="single" w:color="999999" w:sz="4"/>
+              <w:left w:val="single" w:color="999999" w:sz="4"/>
+              <w:bottom w:val="single" w:color="999999" w:sz="4"/>
+              <w:right w:val="single" w:color="999999" w:sz="4"/>
+            </w:tcBorders>
+            <w:tcMar>
+              <w:top w:type="dxa" w:w="60"/>
+              <w:left w:type="dxa" w:w="100"/>
+              <w:bottom w:type="dxa" w:w="60"/>
+              <w:right w:type="dxa" w:w="100"/>
+            </w:tcMar>
+          </w:tcPr>
+          <w:p>
+            <w:pPr>
+              <w:jc w:val="left"/>
+            </w:pPr>
+            <w:r>
+              <w:rPr>
+                <w:rFonts w:ascii="Arial" w:cs="Arial" w:eastAsia="Arial" w:hAnsi="Arial"/>
+                <w:b w:val="false"/>
+                <w:bCs w:val="false"/>
+                <w:sz w:val="18"/>
+                <w:szCs w:val="18"/>
+              </w:rPr>
+              <w:t xml:space="preserve">Tercatat desil 10, sekelompok dengan keluarga terkaya</w:t>
+            </w:r>
+          </w:p>
+        </w:tc>
+      </w:tr>
+      <w:tr>
+        <w:trPr>
+          <w:cantSplit/>
+        </w:trPr>
+        <w:tc>
+          <w:tcPr>
+            <w:tcW w:type="dxa" w:w="900"/>
+            <w:tcBorders>
+              <w:top w:val="single" w:color="999999" w:sz="4"/>
+              <w:left w:val="single" w:color="999999" w:sz="4"/>
+              <w:bottom w:val="single" w:color="999999" w:sz="4"/>
+              <w:right w:val="single" w:color="999999" w:sz="4"/>
+            </w:tcBorders>
+            <w:tcMar>
+              <w:top w:type="dxa" w:w="60"/>
+              <w:left w:type="dxa" w:w="100"/>
+              <w:bottom w:type="dxa" w:w="60"/>
+              <w:right w:type="dxa" w:w="100"/>
+            </w:tcMar>
+          </w:tcPr>
+          <w:p>
+            <w:pPr>
+              <w:jc w:val="left"/>
+            </w:pPr>
+            <w:r>
+              <w:rPr>
+                <w:rFonts w:ascii="Arial" w:cs="Arial" w:eastAsia="Arial" w:hAnsi="Arial"/>
+                <w:b w:val="false"/>
+                <w:bCs w:val="false"/>
+                <w:sz w:val="18"/>
+                <w:szCs w:val="18"/>
+              </w:rPr>
+              <w:t xml:space="preserve">VI</w:t>
+            </w:r>
+          </w:p>
+        </w:tc>
+        <w:tc>
+          <w:tcPr>
+            <w:tcW w:type="dxa" w:w="1650"/>
+            <w:tcBorders>
+              <w:top w:val="single" w:color="999999" w:sz="4"/>
+              <w:left w:val="single" w:color="999999" w:sz="4"/>
+              <w:bottom w:val="single" w:color="999999" w:sz="4"/>
+              <w:right w:val="single" w:color="999999" w:sz="4"/>
+            </w:tcBorders>
+            <w:tcMar>
+              <w:top w:type="dxa" w:w="60"/>
+              <w:left w:type="dxa" w:w="100"/>
+              <w:bottom w:type="dxa" w:w="60"/>
+              <w:right w:type="dxa" w:w="100"/>
+            </w:tcMar>
+          </w:tcPr>
+          <w:p>
+            <w:pPr>
+              <w:jc w:val="left"/>
+            </w:pPr>
+            <w:r>
+              <w:rPr>
+                <w:rFonts w:ascii="Arial" w:cs="Arial" w:eastAsia="Arial" w:hAnsi="Arial"/>
+                <w:b w:val="false"/>
+                <w:bCs w:val="false"/>
+                <w:sz w:val="18"/>
+                <w:szCs w:val="18"/>
+              </w:rPr>
+              <w:t xml:space="preserve">Bambang Setiadi</w:t>
+            </w:r>
+          </w:p>
+        </w:tc>
+        <w:tc>
+          <w:tcPr>
+            <w:tcW w:type="dxa" w:w="3288"/>
+            <w:tcBorders>
+              <w:top w:val="single" w:color="999999" w:sz="4"/>
+              <w:left w:val="single" w:color="999999" w:sz="4"/>
+              <w:bottom w:val="single" w:color="999999" w:sz="4"/>
+              <w:right w:val="single" w:color="999999" w:sz="4"/>
+            </w:tcBorders>
+            <w:tcMar>
+              <w:top w:type="dxa" w:w="60"/>
+              <w:left w:type="dxa" w:w="100"/>
+              <w:bottom w:type="dxa" w:w="60"/>
+              <w:right w:type="dxa" w:w="100"/>
+            </w:tcMar>
+          </w:tcPr>
+          <w:p>
+            <w:pPr>
+              <w:jc w:val="left"/>
+            </w:pPr>
+            <w:r>
+              <w:rPr>
+                <w:rFonts w:ascii="Arial" w:cs="Arial" w:eastAsia="Arial" w:hAnsi="Arial"/>
+                <w:b w:val="false"/>
+                <w:bCs w:val="false"/>
+                <w:sz w:val="18"/>
+                <w:szCs w:val="18"/>
+              </w:rPr>
+              <w:t xml:space="preserve">47 tahun, penyandang disabilitas fisik (pengguna kursi roda) sejak kecelakaan kerja; tidak bekerja; menumpang di rumah adiknya di Kab. Sleman; NIK 3404xxxxxxxxxxxx</w:t>
+            </w:r>
+          </w:p>
+        </w:tc>
+        <w:tc>
+          <w:tcPr>
+            <w:tcW w:type="dxa" w:w="1600"/>
+            <w:tcBorders>
+              <w:top w:val="single" w:color="999999" w:sz="4"/>
+              <w:left w:val="single" w:color="999999" w:sz="4"/>
+              <w:bottom w:val="single" w:color="999999" w:sz="4"/>
+              <w:right w:val="single" w:color="999999" w:sz="4"/>
+            </w:tcBorders>
+            <w:tcMar>
+              <w:top w:type="dxa" w:w="60"/>
+              <w:left w:type="dxa" w:w="100"/>
+              <w:bottom w:type="dxa" w:w="60"/>
+              <w:right w:type="dxa" w:w="100"/>
+            </w:tcMar>
+          </w:tcPr>
+          <w:p>
+            <w:pPr>
+              <w:jc w:val="left"/>
+            </w:pPr>
+            <w:r>
+              <w:rPr>
+                <w:rFonts w:ascii="Arial" w:cs="Arial" w:eastAsia="Arial" w:hAnsi="Arial"/>
+                <w:b w:val="false"/>
+                <w:bCs w:val="false"/>
+                <w:sz w:val="18"/>
+                <w:szCs w:val="18"/>
+              </w:rPr>
+              <w:t xml:space="preserve">Perorangan WNI</w:t>
+            </w:r>
+          </w:p>
+        </w:tc>
+        <w:tc>
+          <w:tcPr>
+            <w:tcW w:type="dxa" w:w="2200"/>
+            <w:tcBorders>
+              <w:top w:val="single" w:color="999999" w:sz="4"/>
+              <w:left w:val="single" w:color="999999" w:sz="4"/>
+              <w:bottom w:val="single" w:color="999999" w:sz="4"/>
+              <w:right w:val="single" w:color="999999" w:sz="4"/>
+            </w:tcBorders>
+            <w:tcMar>
+              <w:top w:type="dxa" w:w="60"/>
+              <w:left w:type="dxa" w:w="100"/>
+              <w:bottom w:type="dxa" w:w="60"/>
+              <w:right w:type="dxa" w:w="100"/>
+            </w:tcMar>
+          </w:tcPr>
+          <w:p>
+            <w:pPr>
+              <w:jc w:val="left"/>
+            </w:pPr>
+            <w:r>
+              <w:rPr>
+                <w:rFonts w:ascii="Arial" w:cs="Arial" w:eastAsia="Arial" w:hAnsi="Arial"/>
+                <w:b w:val="false"/>
+                <w:bCs w:val="false"/>
+                <w:sz w:val="18"/>
+                <w:szCs w:val="18"/>
+              </w:rPr>
+              <w:t xml:space="preserve">Kebutuhan khusus disabilitas tidak terbaca kriteria berbasis rumah tangga</w:t>
             </w:r>
           </w:p>
         </w:tc>
@@ -4526,6 +4870,647 @@
     </w:tbl>
     <w:p>
       <w:pPr>
+        <w:spacing w:after="60" w:before="120"/>
+      </w:pPr>
+      <w:r>
+        <w:rPr>
+          <w:rFonts w:ascii="Arial" w:cs="Arial" w:eastAsia="Arial" w:hAnsi="Arial"/>
+          <w:b/>
+          <w:bCs/>
+        </w:rPr>
+        <w:t xml:space="preserve">Matriks untuk Pemohon V dan VI:</w:t>
+      </w:r>
+    </w:p>
+    <w:tbl>
+      <w:tblPr>
+        <w:tblW w:type="dxa" w:w="9638"/>
+        <w:tblBorders>
+          <w:top w:val="single" w:color="auto" w:sz="4"/>
+          <w:left w:val="single" w:color="auto" w:sz="4"/>
+          <w:bottom w:val="single" w:color="auto" w:sz="4"/>
+          <w:right w:val="single" w:color="auto" w:sz="4"/>
+          <w:insideH w:val="single" w:color="auto" w:sz="4"/>
+          <w:insideV w:val="single" w:color="auto" w:sz="4"/>
+        </w:tblBorders>
+        <w:tblLayout w:type="fixed"/>
+      </w:tblPr>
+      <w:tblGrid>
+        <w:gridCol w:w="2238"/>
+        <w:gridCol w:w="3700"/>
+        <w:gridCol w:w="3700"/>
+      </w:tblGrid>
+      <w:tr>
+        <w:trPr>
+          <w:tblHeader/>
+        </w:trPr>
+        <w:tc>
+          <w:tcPr>
+            <w:tcW w:type="dxa" w:w="2238"/>
+            <w:tcBorders>
+              <w:top w:val="single" w:color="999999" w:sz="4"/>
+              <w:left w:val="single" w:color="999999" w:sz="4"/>
+              <w:bottom w:val="single" w:color="999999" w:sz="4"/>
+              <w:right w:val="single" w:color="999999" w:sz="4"/>
+            </w:tcBorders>
+            <w:shd w:fill="D9E2F3" w:color="auto" w:val="clear"/>
+            <w:tcMar>
+              <w:top w:type="dxa" w:w="60"/>
+              <w:left w:type="dxa" w:w="100"/>
+              <w:bottom w:type="dxa" w:w="60"/>
+              <w:right w:type="dxa" w:w="100"/>
+            </w:tcMar>
+          </w:tcPr>
+          <w:p>
+            <w:pPr>
+              <w:jc w:val="left"/>
+            </w:pPr>
+            <w:r>
+              <w:rPr>
+                <w:rFonts w:ascii="Arial" w:cs="Arial" w:eastAsia="Arial" w:hAnsi="Arial"/>
+                <w:b/>
+                <w:bCs/>
+                <w:sz w:val="18"/>
+                <w:szCs w:val="18"/>
+              </w:rPr>
+              <w:t xml:space="preserve">Syarat</w:t>
+            </w:r>
+          </w:p>
+        </w:tc>
+        <w:tc>
+          <w:tcPr>
+            <w:tcW w:type="dxa" w:w="3700"/>
+            <w:tcBorders>
+              <w:top w:val="single" w:color="999999" w:sz="4"/>
+              <w:left w:val="single" w:color="999999" w:sz="4"/>
+              <w:bottom w:val="single" w:color="999999" w:sz="4"/>
+              <w:right w:val="single" w:color="999999" w:sz="4"/>
+            </w:tcBorders>
+            <w:shd w:fill="D9E2F3" w:color="auto" w:val="clear"/>
+            <w:tcMar>
+              <w:top w:type="dxa" w:w="60"/>
+              <w:left w:type="dxa" w:w="100"/>
+              <w:bottom w:type="dxa" w:w="60"/>
+              <w:right w:type="dxa" w:w="100"/>
+            </w:tcMar>
+          </w:tcPr>
+          <w:p>
+            <w:pPr>
+              <w:jc w:val="left"/>
+            </w:pPr>
+            <w:r>
+              <w:rPr>
+                <w:rFonts w:ascii="Arial" w:cs="Arial" w:eastAsia="Arial" w:hAnsi="Arial"/>
+                <w:b/>
+                <w:bCs/>
+                <w:sz w:val="18"/>
+                <w:szCs w:val="18"/>
+              </w:rPr>
+              <w:t xml:space="preserve">Pemohon V (Rahmawati)</w:t>
+            </w:r>
+          </w:p>
+        </w:tc>
+        <w:tc>
+          <w:tcPr>
+            <w:tcW w:type="dxa" w:w="3700"/>
+            <w:tcBorders>
+              <w:top w:val="single" w:color="999999" w:sz="4"/>
+              <w:left w:val="single" w:color="999999" w:sz="4"/>
+              <w:bottom w:val="single" w:color="999999" w:sz="4"/>
+              <w:right w:val="single" w:color="999999" w:sz="4"/>
+            </w:tcBorders>
+            <w:shd w:fill="D9E2F3" w:color="auto" w:val="clear"/>
+            <w:tcMar>
+              <w:top w:type="dxa" w:w="60"/>
+              <w:left w:type="dxa" w:w="100"/>
+              <w:bottom w:type="dxa" w:w="60"/>
+              <w:right w:type="dxa" w:w="100"/>
+            </w:tcMar>
+          </w:tcPr>
+          <w:p>
+            <w:pPr>
+              <w:jc w:val="left"/>
+            </w:pPr>
+            <w:r>
+              <w:rPr>
+                <w:rFonts w:ascii="Arial" w:cs="Arial" w:eastAsia="Arial" w:hAnsi="Arial"/>
+                <w:b/>
+                <w:bCs/>
+                <w:sz w:val="18"/>
+                <w:szCs w:val="18"/>
+              </w:rPr>
+              <w:t xml:space="preserve">Pemohon VI (Bambang)</w:t>
+            </w:r>
+          </w:p>
+        </w:tc>
+      </w:tr>
+      <w:tr>
+        <w:trPr>
+          <w:cantSplit/>
+        </w:trPr>
+        <w:tc>
+          <w:tcPr>
+            <w:tcW w:type="dxa" w:w="2238"/>
+            <w:tcBorders>
+              <w:top w:val="single" w:color="999999" w:sz="4"/>
+              <w:left w:val="single" w:color="999999" w:sz="4"/>
+              <w:bottom w:val="single" w:color="999999" w:sz="4"/>
+              <w:right w:val="single" w:color="999999" w:sz="4"/>
+            </w:tcBorders>
+            <w:tcMar>
+              <w:top w:type="dxa" w:w="60"/>
+              <w:left w:type="dxa" w:w="100"/>
+              <w:bottom w:type="dxa" w:w="60"/>
+              <w:right w:type="dxa" w:w="100"/>
+            </w:tcMar>
+          </w:tcPr>
+          <w:p>
+            <w:pPr>
+              <w:jc w:val="left"/>
+            </w:pPr>
+            <w:r>
+              <w:rPr>
+                <w:rFonts w:ascii="Arial" w:cs="Arial" w:eastAsia="Arial" w:hAnsi="Arial"/>
+                <w:b w:val="false"/>
+                <w:bCs w:val="false"/>
+                <w:sz w:val="18"/>
+                <w:szCs w:val="18"/>
+              </w:rPr>
+              <w:t xml:space="preserve">1. Hak konstitusional</w:t>
+            </w:r>
+          </w:p>
+        </w:tc>
+        <w:tc>
+          <w:tcPr>
+            <w:tcW w:type="dxa" w:w="3700"/>
+            <w:tcBorders>
+              <w:top w:val="single" w:color="999999" w:sz="4"/>
+              <w:left w:val="single" w:color="999999" w:sz="4"/>
+              <w:bottom w:val="single" w:color="999999" w:sz="4"/>
+              <w:right w:val="single" w:color="999999" w:sz="4"/>
+            </w:tcBorders>
+            <w:tcMar>
+              <w:top w:type="dxa" w:w="60"/>
+              <w:left w:type="dxa" w:w="100"/>
+              <w:bottom w:type="dxa" w:w="60"/>
+              <w:right w:type="dxa" w:w="100"/>
+            </w:tcMar>
+          </w:tcPr>
+          <w:p>
+            <w:pPr>
+              <w:jc w:val="left"/>
+            </w:pPr>
+            <w:r>
+              <w:rPr>
+                <w:rFonts w:ascii="Arial" w:cs="Arial" w:eastAsia="Arial" w:hAnsi="Arial"/>
+                <w:b w:val="false"/>
+                <w:bCs w:val="false"/>
+                <w:sz w:val="18"/>
+                <w:szCs w:val="18"/>
+              </w:rPr>
+              <w:t xml:space="preserve">28C(2), 28D(3), 28D(1), 28I(2)</w:t>
+            </w:r>
+          </w:p>
+        </w:tc>
+        <w:tc>
+          <w:tcPr>
+            <w:tcW w:type="dxa" w:w="3700"/>
+            <w:tcBorders>
+              <w:top w:val="single" w:color="999999" w:sz="4"/>
+              <w:left w:val="single" w:color="999999" w:sz="4"/>
+              <w:bottom w:val="single" w:color="999999" w:sz="4"/>
+              <w:right w:val="single" w:color="999999" w:sz="4"/>
+            </w:tcBorders>
+            <w:tcMar>
+              <w:top w:type="dxa" w:w="60"/>
+              <w:left w:type="dxa" w:w="100"/>
+              <w:bottom w:type="dxa" w:w="60"/>
+              <w:right w:type="dxa" w:w="100"/>
+            </w:tcMar>
+          </w:tcPr>
+          <w:p>
+            <w:pPr>
+              <w:jc w:val="left"/>
+            </w:pPr>
+            <w:r>
+              <w:rPr>
+                <w:rFonts w:ascii="Arial" w:cs="Arial" w:eastAsia="Arial" w:hAnsi="Arial"/>
+                <w:b w:val="false"/>
+                <w:bCs w:val="false"/>
+                <w:sz w:val="18"/>
+                <w:szCs w:val="18"/>
+              </w:rPr>
+              <w:t xml:space="preserve">28C(2), 28D(3), 28H(2), 28I(2), 34(2)</w:t>
+            </w:r>
+          </w:p>
+        </w:tc>
+      </w:tr>
+      <w:tr>
+        <w:trPr>
+          <w:cantSplit/>
+        </w:trPr>
+        <w:tc>
+          <w:tcPr>
+            <w:tcW w:type="dxa" w:w="2238"/>
+            <w:tcBorders>
+              <w:top w:val="single" w:color="999999" w:sz="4"/>
+              <w:left w:val="single" w:color="999999" w:sz="4"/>
+              <w:bottom w:val="single" w:color="999999" w:sz="4"/>
+              <w:right w:val="single" w:color="999999" w:sz="4"/>
+            </w:tcBorders>
+            <w:tcMar>
+              <w:top w:type="dxa" w:w="60"/>
+              <w:left w:type="dxa" w:w="100"/>
+              <w:bottom w:type="dxa" w:w="60"/>
+              <w:right w:type="dxa" w:w="100"/>
+            </w:tcMar>
+          </w:tcPr>
+          <w:p>
+            <w:pPr>
+              <w:jc w:val="left"/>
+            </w:pPr>
+            <w:r>
+              <w:rPr>
+                <w:rFonts w:ascii="Arial" w:cs="Arial" w:eastAsia="Arial" w:hAnsi="Arial"/>
+                <w:b w:val="false"/>
+                <w:bCs w:val="false"/>
+                <w:sz w:val="18"/>
+                <w:szCs w:val="18"/>
+              </w:rPr>
+              <w:t xml:space="preserve">2. Dirugikan oleh Pasal 8(2)</w:t>
+            </w:r>
+          </w:p>
+        </w:tc>
+        <w:tc>
+          <w:tcPr>
+            <w:tcW w:type="dxa" w:w="3700"/>
+            <w:tcBorders>
+              <w:top w:val="single" w:color="999999" w:sz="4"/>
+              <w:left w:val="single" w:color="999999" w:sz="4"/>
+              <w:bottom w:val="single" w:color="999999" w:sz="4"/>
+              <w:right w:val="single" w:color="999999" w:sz="4"/>
+            </w:tcBorders>
+            <w:tcMar>
+              <w:top w:type="dxa" w:w="60"/>
+              <w:left w:type="dxa" w:w="100"/>
+              <w:bottom w:type="dxa" w:w="60"/>
+              <w:right w:type="dxa" w:w="100"/>
+            </w:tcMar>
+          </w:tcPr>
+          <w:p>
+            <w:pPr>
+              <w:jc w:val="left"/>
+            </w:pPr>
+            <w:r>
+              <w:rPr>
+                <w:rFonts w:ascii="Arial" w:cs="Arial" w:eastAsia="Arial" w:hAnsi="Arial"/>
+                <w:b w:val="false"/>
+                <w:bCs w:val="false"/>
+                <w:sz w:val="18"/>
+                <w:szCs w:val="18"/>
+              </w:rPr>
+              <w:t xml:space="preserve">Tidak pernah didengar soal variabel yang menempatkannya di desil 10</w:t>
+            </w:r>
+          </w:p>
+        </w:tc>
+        <w:tc>
+          <w:tcPr>
+            <w:tcW w:type="dxa" w:w="3700"/>
+            <w:tcBorders>
+              <w:top w:val="single" w:color="999999" w:sz="4"/>
+              <w:left w:val="single" w:color="999999" w:sz="4"/>
+              <w:bottom w:val="single" w:color="999999" w:sz="4"/>
+              <w:right w:val="single" w:color="999999" w:sz="4"/>
+            </w:tcBorders>
+            <w:tcMar>
+              <w:top w:type="dxa" w:w="60"/>
+              <w:left w:type="dxa" w:w="100"/>
+              <w:bottom w:type="dxa" w:w="60"/>
+              <w:right w:type="dxa" w:w="100"/>
+            </w:tcMar>
+          </w:tcPr>
+          <w:p>
+            <w:pPr>
+              <w:jc w:val="left"/>
+            </w:pPr>
+            <w:r>
+              <w:rPr>
+                <w:rFonts w:ascii="Arial" w:cs="Arial" w:eastAsia="Arial" w:hAnsi="Arial"/>
+                <w:b w:val="false"/>
+                <w:bCs w:val="false"/>
+                <w:sz w:val="18"/>
+                <w:szCs w:val="18"/>
+              </w:rPr>
+              <w:t xml:space="preserve">Penyandang disabilitas dan organisasinya tidak dilibatkan dalam kriteria, padahal kebutuhannya khusus</w:t>
+            </w:r>
+          </w:p>
+        </w:tc>
+      </w:tr>
+      <w:tr>
+        <w:trPr>
+          <w:cantSplit/>
+        </w:trPr>
+        <w:tc>
+          <w:tcPr>
+            <w:tcW w:type="dxa" w:w="2238"/>
+            <w:tcBorders>
+              <w:top w:val="single" w:color="999999" w:sz="4"/>
+              <w:left w:val="single" w:color="999999" w:sz="4"/>
+              <w:bottom w:val="single" w:color="999999" w:sz="4"/>
+              <w:right w:val="single" w:color="999999" w:sz="4"/>
+            </w:tcBorders>
+            <w:tcMar>
+              <w:top w:type="dxa" w:w="60"/>
+              <w:left w:type="dxa" w:w="100"/>
+              <w:bottom w:type="dxa" w:w="60"/>
+              <w:right w:type="dxa" w:w="100"/>
+            </w:tcMar>
+          </w:tcPr>
+          <w:p>
+            <w:pPr>
+              <w:jc w:val="left"/>
+            </w:pPr>
+            <w:r>
+              <w:rPr>
+                <w:rFonts w:ascii="Arial" w:cs="Arial" w:eastAsia="Arial" w:hAnsi="Arial"/>
+                <w:b w:val="false"/>
+                <w:bCs w:val="false"/>
+                <w:sz w:val="18"/>
+                <w:szCs w:val="18"/>
+              </w:rPr>
+              <w:t xml:space="preserve">3. Spesifik dan aktual</w:t>
+            </w:r>
+          </w:p>
+        </w:tc>
+        <w:tc>
+          <w:tcPr>
+            <w:tcW w:type="dxa" w:w="3700"/>
+            <w:tcBorders>
+              <w:top w:val="single" w:color="999999" w:sz="4"/>
+              <w:left w:val="single" w:color="999999" w:sz="4"/>
+              <w:bottom w:val="single" w:color="999999" w:sz="4"/>
+              <w:right w:val="single" w:color="999999" w:sz="4"/>
+            </w:tcBorders>
+            <w:tcMar>
+              <w:top w:type="dxa" w:w="60"/>
+              <w:left w:type="dxa" w:w="100"/>
+              <w:bottom w:type="dxa" w:w="60"/>
+              <w:right w:type="dxa" w:w="100"/>
+            </w:tcMar>
+          </w:tcPr>
+          <w:p>
+            <w:pPr>
+              <w:jc w:val="left"/>
+            </w:pPr>
+            <w:r>
+              <w:rPr>
+                <w:rFonts w:ascii="Arial" w:cs="Arial" w:eastAsia="Arial" w:hAnsi="Arial"/>
+                <w:b w:val="false"/>
+                <w:bCs w:val="false"/>
+                <w:sz w:val="18"/>
+                <w:szCs w:val="18"/>
+              </w:rPr>
+              <w:t xml:space="preserve">Aktual: tercatat desil 10, tertutup dari bansos yang memakai desil</w:t>
+            </w:r>
+          </w:p>
+        </w:tc>
+        <w:tc>
+          <w:tcPr>
+            <w:tcW w:type="dxa" w:w="3700"/>
+            <w:tcBorders>
+              <w:top w:val="single" w:color="999999" w:sz="4"/>
+              <w:left w:val="single" w:color="999999" w:sz="4"/>
+              <w:bottom w:val="single" w:color="999999" w:sz="4"/>
+              <w:right w:val="single" w:color="999999" w:sz="4"/>
+            </w:tcBorders>
+            <w:tcMar>
+              <w:top w:type="dxa" w:w="60"/>
+              <w:left w:type="dxa" w:w="100"/>
+              <w:bottom w:type="dxa" w:w="60"/>
+              <w:right w:type="dxa" w:w="100"/>
+            </w:tcMar>
+          </w:tcPr>
+          <w:p>
+            <w:pPr>
+              <w:jc w:val="left"/>
+            </w:pPr>
+            <w:r>
+              <w:rPr>
+                <w:rFonts w:ascii="Arial" w:cs="Arial" w:eastAsia="Arial" w:hAnsi="Arial"/>
+                <w:b w:val="false"/>
+                <w:bCs w:val="false"/>
+                <w:sz w:val="18"/>
+                <w:szCs w:val="18"/>
+              </w:rPr>
+              <w:t xml:space="preserve">Aktual: keluarganya tercatat desil 6, ia tidak menerima bantuan</w:t>
+            </w:r>
+          </w:p>
+        </w:tc>
+      </w:tr>
+      <w:tr>
+        <w:trPr>
+          <w:cantSplit/>
+        </w:trPr>
+        <w:tc>
+          <w:tcPr>
+            <w:tcW w:type="dxa" w:w="2238"/>
+            <w:tcBorders>
+              <w:top w:val="single" w:color="999999" w:sz="4"/>
+              <w:left w:val="single" w:color="999999" w:sz="4"/>
+              <w:bottom w:val="single" w:color="999999" w:sz="4"/>
+              <w:right w:val="single" w:color="999999" w:sz="4"/>
+            </w:tcBorders>
+            <w:tcMar>
+              <w:top w:type="dxa" w:w="60"/>
+              <w:left w:type="dxa" w:w="100"/>
+              <w:bottom w:type="dxa" w:w="60"/>
+              <w:right w:type="dxa" w:w="100"/>
+            </w:tcMar>
+          </w:tcPr>
+          <w:p>
+            <w:pPr>
+              <w:jc w:val="left"/>
+            </w:pPr>
+            <w:r>
+              <w:rPr>
+                <w:rFonts w:ascii="Arial" w:cs="Arial" w:eastAsia="Arial" w:hAnsi="Arial"/>
+                <w:b w:val="false"/>
+                <w:bCs w:val="false"/>
+                <w:sz w:val="18"/>
+                <w:szCs w:val="18"/>
+              </w:rPr>
+              <w:t xml:space="preserve">4. Hubungan sebab-akibat</w:t>
+            </w:r>
+          </w:p>
+        </w:tc>
+        <w:tc>
+          <w:tcPr>
+            <w:tcW w:type="dxa" w:w="3700"/>
+            <w:tcBorders>
+              <w:top w:val="single" w:color="999999" w:sz="4"/>
+              <w:left w:val="single" w:color="999999" w:sz="4"/>
+              <w:bottom w:val="single" w:color="999999" w:sz="4"/>
+              <w:right w:val="single" w:color="999999" w:sz="4"/>
+            </w:tcBorders>
+            <w:tcMar>
+              <w:top w:type="dxa" w:w="60"/>
+              <w:left w:type="dxa" w:w="100"/>
+              <w:bottom w:type="dxa" w:w="60"/>
+              <w:right w:type="dxa" w:w="100"/>
+            </w:tcMar>
+          </w:tcPr>
+          <w:p>
+            <w:pPr>
+              <w:jc w:val="left"/>
+            </w:pPr>
+            <w:r>
+              <w:rPr>
+                <w:rFonts w:ascii="Arial" w:cs="Arial" w:eastAsia="Arial" w:hAnsi="Arial"/>
+                <w:b w:val="false"/>
+                <w:bCs w:val="false"/>
+                <w:sz w:val="18"/>
+                <w:szCs w:val="18"/>
+              </w:rPr>
+              <w:t xml:space="preserve">Pasal 8(2) → kriteria tanpa partisipasi → peringkat relatif tanpa penjelasan → desil 10</w:t>
+            </w:r>
+          </w:p>
+        </w:tc>
+        <w:tc>
+          <w:tcPr>
+            <w:tcW w:type="dxa" w:w="3700"/>
+            <w:tcBorders>
+              <w:top w:val="single" w:color="999999" w:sz="4"/>
+              <w:left w:val="single" w:color="999999" w:sz="4"/>
+              <w:bottom w:val="single" w:color="999999" w:sz="4"/>
+              <w:right w:val="single" w:color="999999" w:sz="4"/>
+            </w:tcBorders>
+            <w:tcMar>
+              <w:top w:type="dxa" w:w="60"/>
+              <w:left w:type="dxa" w:w="100"/>
+              <w:bottom w:type="dxa" w:w="60"/>
+              <w:right w:type="dxa" w:w="100"/>
+            </w:tcMar>
+          </w:tcPr>
+          <w:p>
+            <w:pPr>
+              <w:jc w:val="left"/>
+            </w:pPr>
+            <w:r>
+              <w:rPr>
+                <w:rFonts w:ascii="Arial" w:cs="Arial" w:eastAsia="Arial" w:hAnsi="Arial"/>
+                <w:b w:val="false"/>
+                <w:bCs w:val="false"/>
+                <w:sz w:val="18"/>
+                <w:szCs w:val="18"/>
+              </w:rPr>
+              <w:t xml:space="preserve">Pasal 8(2) → kriteria berbasis rumah tangga tanpa suara penyandang disabilitas → biaya disabilitas tidak terbaca</w:t>
+            </w:r>
+          </w:p>
+        </w:tc>
+      </w:tr>
+      <w:tr>
+        <w:trPr>
+          <w:cantSplit/>
+        </w:trPr>
+        <w:tc>
+          <w:tcPr>
+            <w:tcW w:type="dxa" w:w="2238"/>
+            <w:tcBorders>
+              <w:top w:val="single" w:color="999999" w:sz="4"/>
+              <w:left w:val="single" w:color="999999" w:sz="4"/>
+              <w:bottom w:val="single" w:color="999999" w:sz="4"/>
+              <w:right w:val="single" w:color="999999" w:sz="4"/>
+            </w:tcBorders>
+            <w:tcMar>
+              <w:top w:type="dxa" w:w="60"/>
+              <w:left w:type="dxa" w:w="100"/>
+              <w:bottom w:type="dxa" w:w="60"/>
+              <w:right w:type="dxa" w:w="100"/>
+            </w:tcMar>
+          </w:tcPr>
+          <w:p>
+            <w:pPr>
+              <w:jc w:val="left"/>
+            </w:pPr>
+            <w:r>
+              <w:rPr>
+                <w:rFonts w:ascii="Arial" w:cs="Arial" w:eastAsia="Arial" w:hAnsi="Arial"/>
+                <w:b w:val="false"/>
+                <w:bCs w:val="false"/>
+                <w:sz w:val="18"/>
+                <w:szCs w:val="18"/>
+              </w:rPr>
+              <w:t xml:space="preserve">5. Pulih bila dikabulkan</w:t>
+            </w:r>
+          </w:p>
+        </w:tc>
+        <w:tc>
+          <w:tcPr>
+            <w:tcW w:type="dxa" w:w="3700"/>
+            <w:tcBorders>
+              <w:top w:val="single" w:color="999999" w:sz="4"/>
+              <w:left w:val="single" w:color="999999" w:sz="4"/>
+              <w:bottom w:val="single" w:color="999999" w:sz="4"/>
+              <w:right w:val="single" w:color="999999" w:sz="4"/>
+            </w:tcBorders>
+            <w:tcMar>
+              <w:top w:type="dxa" w:w="60"/>
+              <w:left w:type="dxa" w:w="100"/>
+              <w:bottom w:type="dxa" w:w="60"/>
+              <w:right w:type="dxa" w:w="100"/>
+            </w:tcMar>
+          </w:tcPr>
+          <w:p>
+            <w:pPr>
+              <w:jc w:val="left"/>
+            </w:pPr>
+            <w:r>
+              <w:rPr>
+                <w:rFonts w:ascii="Arial" w:cs="Arial" w:eastAsia="Arial" w:hAnsi="Arial"/>
+                <w:b w:val="false"/>
+                <w:bCs w:val="false"/>
+                <w:sz w:val="18"/>
+                <w:szCs w:val="18"/>
+              </w:rPr>
+              <w:t xml:space="preserve">Berhak didengar dan mendapat penjelasan soal kriteria</w:t>
+            </w:r>
+          </w:p>
+        </w:tc>
+        <w:tc>
+          <w:tcPr>
+            <w:tcW w:type="dxa" w:w="3700"/>
+            <w:tcBorders>
+              <w:top w:val="single" w:color="999999" w:sz="4"/>
+              <w:left w:val="single" w:color="999999" w:sz="4"/>
+              <w:bottom w:val="single" w:color="999999" w:sz="4"/>
+              <w:right w:val="single" w:color="999999" w:sz="4"/>
+            </w:tcBorders>
+            <w:tcMar>
+              <w:top w:type="dxa" w:w="60"/>
+              <w:left w:type="dxa" w:w="100"/>
+              <w:bottom w:type="dxa" w:w="60"/>
+              <w:right w:type="dxa" w:w="100"/>
+            </w:tcMar>
+          </w:tcPr>
+          <w:p>
+            <w:pPr>
+              <w:jc w:val="left"/>
+            </w:pPr>
+            <w:r>
+              <w:rPr>
+                <w:rFonts w:ascii="Arial" w:cs="Arial" w:eastAsia="Arial" w:hAnsi="Arial"/>
+                <w:b w:val="false"/>
+                <w:bCs w:val="false"/>
+                <w:sz w:val="18"/>
+                <w:szCs w:val="18"/>
+              </w:rPr>
+              <w:t xml:space="preserve">Kebutuhan penyandang disabilitas dapat disampaikan saat kriteria disusun</w:t>
+            </w:r>
+          </w:p>
+        </w:tc>
+      </w:tr>
+    </w:tbl>
+    <w:p>
+      <w:pPr>
         <w:spacing w:after="120"/>
       </w:pPr>
     </w:p>
@@ -5292,13 +6277,167 @@
     </w:p>
     <w:p>
       <w:pPr>
-        <w:pStyle w:val="Heading1"/>
-      </w:pPr>
-      <w:r>
-        <w:rPr>
-          <w:rFonts w:ascii="Arial" w:cs="Arial" w:eastAsia="Arial" w:hAnsi="Arial"/>
-        </w:rPr>
-        <w:t xml:space="preserve">6. Pihak dalam Sidang dan Pembagian Peran</w:t>
+        <w:pStyle w:val="Heading2"/>
+      </w:pPr>
+      <w:r>
+        <w:rPr>
+          <w:rFonts w:ascii="Arial" w:cs="Arial" w:eastAsia="Arial" w:hAnsi="Arial"/>
+        </w:rPr>
+        <w:t xml:space="preserve">Pemohon V — Rahmawati</w:t>
+      </w:r>
+    </w:p>
+    <w:p>
+      <w:pPr>
+        <w:spacing w:after="60" w:before="120"/>
+      </w:pPr>
+      <w:r>
+        <w:rPr>
+          <w:rFonts w:ascii="Arial" w:cs="Arial" w:eastAsia="Arial" w:hAnsi="Arial"/>
+          <w:b/>
+          <w:bCs/>
+        </w:rPr>
+        <w:t xml:space="preserve">Kronologi:</w:t>
+      </w:r>
+    </w:p>
+    <w:p>
+      <w:pPr>
+        <w:pStyle w:val="ListParagraph"/>
+        <w:numPr>
+          <w:ilvl w:val="0"/>
+          <w:numId w:val="8"/>
+        </w:numPr>
+        <w:spacing w:after="60"/>
+      </w:pPr>
+      <w:r>
+        <w:rPr>
+          <w:rFonts w:ascii="Arial" w:cs="Arial" w:eastAsia="Arial" w:hAnsi="Arial"/>
+        </w:rPr>
+        <w:t xml:space="preserve">2024: keluarganya pindah ke kontrakan tipe 36 di Kab. Bekasi karena suaminya mendapat kontrak kerja di pabrik.</w:t>
+      </w:r>
+    </w:p>
+    <w:p>
+      <w:pPr>
+        <w:pStyle w:val="ListParagraph"/>
+        <w:numPr>
+          <w:ilvl w:val="0"/>
+          <w:numId w:val="8"/>
+        </w:numPr>
+        <w:spacing w:after="60"/>
+      </w:pPr>
+      <w:r>
+        <w:rPr>
+          <w:rFonts w:ascii="Arial" w:cs="Arial" w:eastAsia="Arial" w:hAnsi="Arial"/>
+        </w:rPr>
+        <w:t xml:space="preserve">2025: suaminya berganti-ganti kontrak; penghasilan ±Rp3 juta per bulan untuk empat orang.</w:t>
+      </w:r>
+    </w:p>
+    <w:p>
+      <w:pPr>
+        <w:pStyle w:val="ListParagraph"/>
+        <w:numPr>
+          <w:ilvl w:val="0"/>
+          <w:numId w:val="8"/>
+        </w:numPr>
+        <w:spacing w:after="60"/>
+      </w:pPr>
+      <w:r>
+        <w:rPr>
+          <w:rFonts w:ascii="Arial" w:cs="Arial" w:eastAsia="Arial" w:hAnsi="Arial"/>
+        </w:rPr>
+        <w:t xml:space="preserve">Agustus 2026: saat dicek di situs DTSEN, keluarganya tercatat di desil 10, kelompok 10% paling sejahtera.</w:t>
+      </w:r>
+    </w:p>
+    <w:p>
+      <w:pPr>
+        <w:pStyle w:val="ListParagraph"/>
+        <w:numPr>
+          <w:ilvl w:val="0"/>
+          <w:numId w:val="8"/>
+        </w:numPr>
+        <w:spacing w:after="60"/>
+      </w:pPr>
+      <w:r>
+        <w:rPr>
+          <w:rFonts w:ascii="Arial" w:cs="Arial" w:eastAsia="Arial" w:hAnsi="Arial"/>
+        </w:rPr>
+        <w:t xml:space="preserve">Ia bertanya ke kelurahan; jawabannya desil ditentukan BPS dan bersifat relatif.</w:t>
+      </w:r>
+    </w:p>
+    <w:p>
+      <w:pPr>
+        <w:pStyle w:val="ListParagraph"/>
+        <w:numPr>
+          <w:ilvl w:val="0"/>
+          <w:numId w:val="8"/>
+        </w:numPr>
+        <w:spacing w:after="60"/>
+      </w:pPr>
+      <w:r>
+        <w:rPr>
+          <w:rFonts w:ascii="Arial" w:cs="Arial" w:eastAsia="Arial" w:hAnsi="Arial"/>
+        </w:rPr>
+        <w:t xml:space="preserve">Ia mengajukan sanggah; sampai sekarang tidak ada penjelasan variabel mana yang membuatnya masuk desil 10.</w:t>
+      </w:r>
+    </w:p>
+    <w:p>
+      <w:pPr>
+        <w:spacing w:after="60" w:before="120"/>
+      </w:pPr>
+      <w:r>
+        <w:rPr>
+          <w:rFonts w:ascii="Arial" w:cs="Arial" w:eastAsia="Arial" w:hAnsi="Arial"/>
+          <w:b/>
+          <w:bCs/>
+        </w:rPr>
+        <w:t xml:space="preserve">Poin keterangan di sidang:</w:t>
+      </w:r>
+    </w:p>
+    <w:p>
+      <w:pPr>
+        <w:pStyle w:val="ListParagraph"/>
+        <w:numPr>
+          <w:ilvl w:val="0"/>
+          <w:numId w:val="3"/>
+        </w:numPr>
+        <w:spacing w:after="60"/>
+      </w:pPr>
+      <w:r>
+        <w:rPr>
+          <w:rFonts w:ascii="Arial" w:cs="Arial" w:eastAsia="Arial" w:hAnsi="Arial"/>
+        </w:rPr>
+        <w:t xml:space="preserve">Ia berada di desil yang sama dengan keluarga yang pengeluarannya puluhan kali lipat; menurut CORE, pengeluaran kelompok desil 10 berkisar Rp3,1 juta sampai Rp192 juta.</w:t>
+      </w:r>
+    </w:p>
+    <w:p>
+      <w:pPr>
+        <w:pStyle w:val="ListParagraph"/>
+        <w:numPr>
+          <w:ilvl w:val="0"/>
+          <w:numId w:val="3"/>
+        </w:numPr>
+        <w:spacing w:after="60"/>
+      </w:pPr>
+      <w:r>
+        <w:rPr>
+          <w:rFonts w:ascii="Arial" w:cs="Arial" w:eastAsia="Arial" w:hAnsi="Arial"/>
+        </w:rPr>
+        <w:t xml:space="preserve">BPS menyebut desil bukan ukuran kemiskinan, tetapi desil itulah yang menutup aksesnya ke bantuan.</w:t>
+      </w:r>
+    </w:p>
+    <w:p>
+      <w:pPr>
+        <w:pStyle w:val="ListParagraph"/>
+        <w:numPr>
+          <w:ilvl w:val="0"/>
+          <w:numId w:val="3"/>
+        </w:numPr>
+        <w:spacing w:after="60"/>
+      </w:pPr>
+      <w:r>
+        <w:rPr>
+          <w:rFonts w:ascii="Arial" w:cs="Arial" w:eastAsia="Arial" w:hAnsi="Arial"/>
+        </w:rPr>
+        <w:t xml:space="preserve">Ia tidak pernah punya kesempatan didengar tentang indikator yang dipakai.</w:t>
       </w:r>
     </w:p>
     <w:p>
@@ -5309,8 +6448,238 @@
       <w:r>
         <w:rPr>
           <w:rFonts w:ascii="Arial" w:cs="Arial" w:eastAsia="Arial" w:hAnsi="Arial"/>
-        </w:rPr>
-        <w:t xml:space="preserve">Sidang simulasi melibatkan 41 orang dalam tiga kelompok; 16 anggota Pemohon pas dibagi menjadi 5 kuasa hukum, 4 Pemohon prinsipal, 3 saksi, dan 4 ahli.</w:t>
+          <w:b/>
+          <w:bCs/>
+        </w:rPr>
+        <w:t xml:space="preserve">Bukti:</w:t>
+      </w:r>
+      <w:r>
+        <w:rPr>
+          <w:rFonts w:ascii="Arial" w:cs="Arial" w:eastAsia="Arial" w:hAnsi="Arial"/>
+        </w:rPr>
+        <w:t xml:space="preserve"> KTP, KK, perjanjian sewa, slip gaji suami, tangkapan layar hasil cek DTSEN, bukti pengajuan sanggah.</w:t>
+      </w:r>
+    </w:p>
+    <w:p>
+      <w:pPr>
+        <w:pStyle w:val="Heading2"/>
+      </w:pPr>
+      <w:r>
+        <w:rPr>
+          <w:rFonts w:ascii="Arial" w:cs="Arial" w:eastAsia="Arial" w:hAnsi="Arial"/>
+        </w:rPr>
+        <w:t xml:space="preserve">Pemohon VI — Bambang Setiadi</w:t>
+      </w:r>
+    </w:p>
+    <w:p>
+      <w:pPr>
+        <w:spacing w:after="60" w:before="120"/>
+      </w:pPr>
+      <w:r>
+        <w:rPr>
+          <w:rFonts w:ascii="Arial" w:cs="Arial" w:eastAsia="Arial" w:hAnsi="Arial"/>
+          <w:b/>
+          <w:bCs/>
+        </w:rPr>
+        <w:t xml:space="preserve">Kronologi:</w:t>
+      </w:r>
+    </w:p>
+    <w:p>
+      <w:pPr>
+        <w:pStyle w:val="ListParagraph"/>
+        <w:numPr>
+          <w:ilvl w:val="0"/>
+          <w:numId w:val="9"/>
+        </w:numPr>
+        <w:spacing w:after="60"/>
+      </w:pPr>
+      <w:r>
+        <w:rPr>
+          <w:rFonts w:ascii="Arial" w:cs="Arial" w:eastAsia="Arial" w:hAnsi="Arial"/>
+        </w:rPr>
+        <w:t xml:space="preserve">2021: mengalami kecelakaan kerja di proyek bangunan dan sejak itu memakai kursi roda.</w:t>
+      </w:r>
+    </w:p>
+    <w:p>
+      <w:pPr>
+        <w:pStyle w:val="ListParagraph"/>
+        <w:numPr>
+          <w:ilvl w:val="0"/>
+          <w:numId w:val="9"/>
+        </w:numPr>
+        <w:spacing w:after="60"/>
+      </w:pPr>
+      <w:r>
+        <w:rPr>
+          <w:rFonts w:ascii="Arial" w:cs="Arial" w:eastAsia="Arial" w:hAnsi="Arial"/>
+        </w:rPr>
+        <w:t xml:space="preserve">2022: tidak bisa bekerja lagi, lalu menumpang di rumah adiknya di Kab. Sleman.</w:t>
+      </w:r>
+    </w:p>
+    <w:p>
+      <w:pPr>
+        <w:pStyle w:val="ListParagraph"/>
+        <w:numPr>
+          <w:ilvl w:val="0"/>
+          <w:numId w:val="9"/>
+        </w:numPr>
+        <w:spacing w:after="60"/>
+      </w:pPr>
+      <w:r>
+        <w:rPr>
+          <w:rFonts w:ascii="Arial" w:cs="Arial" w:eastAsia="Arial" w:hAnsi="Arial"/>
+        </w:rPr>
+        <w:t xml:space="preserve">Dalam data, ia tercatat satu keluarga dengan adiknya yang punya rumah layak dan sepeda motor.</w:t>
+      </w:r>
+    </w:p>
+    <w:p>
+      <w:pPr>
+        <w:pStyle w:val="ListParagraph"/>
+        <w:numPr>
+          <w:ilvl w:val="0"/>
+          <w:numId w:val="9"/>
+        </w:numPr>
+        <w:spacing w:after="60"/>
+      </w:pPr>
+      <w:r>
+        <w:rPr>
+          <w:rFonts w:ascii="Arial" w:cs="Arial" w:eastAsia="Arial" w:hAnsi="Arial"/>
+        </w:rPr>
+        <w:t xml:space="preserve">2026: keluarganya tercatat di desil 6, sehingga ia tidak menerima bantuan apa pun.</w:t>
+      </w:r>
+    </w:p>
+    <w:p>
+      <w:pPr>
+        <w:pStyle w:val="ListParagraph"/>
+        <w:numPr>
+          <w:ilvl w:val="0"/>
+          <w:numId w:val="9"/>
+        </w:numPr>
+        <w:spacing w:after="60"/>
+      </w:pPr>
+      <w:r>
+        <w:rPr>
+          <w:rFonts w:ascii="Arial" w:cs="Arial" w:eastAsia="Arial" w:hAnsi="Arial"/>
+        </w:rPr>
+        <w:t xml:space="preserve">Organisasi penyandang disabilitas di kabupatennya tidak pernah diajak membahas kriteria.</w:t>
+      </w:r>
+    </w:p>
+    <w:p>
+      <w:pPr>
+        <w:spacing w:after="60" w:before="120"/>
+      </w:pPr>
+      <w:r>
+        <w:rPr>
+          <w:rFonts w:ascii="Arial" w:cs="Arial" w:eastAsia="Arial" w:hAnsi="Arial"/>
+          <w:b/>
+          <w:bCs/>
+        </w:rPr>
+        <w:t xml:space="preserve">Poin keterangan di sidang:</w:t>
+      </w:r>
+    </w:p>
+    <w:p>
+      <w:pPr>
+        <w:pStyle w:val="ListParagraph"/>
+        <w:numPr>
+          <w:ilvl w:val="0"/>
+          <w:numId w:val="3"/>
+        </w:numPr>
+        <w:spacing w:after="60"/>
+      </w:pPr>
+      <w:r>
+        <w:rPr>
+          <w:rFonts w:ascii="Arial" w:cs="Arial" w:eastAsia="Arial" w:hAnsi="Arial"/>
+        </w:rPr>
+        <w:t xml:space="preserve">Biaya tambahan karena disabilitas (alat bantu, terapi, transportasi) tidak terlihat dari kondisi rumah.</w:t>
+      </w:r>
+    </w:p>
+    <w:p>
+      <w:pPr>
+        <w:pStyle w:val="ListParagraph"/>
+        <w:numPr>
+          <w:ilvl w:val="0"/>
+          <w:numId w:val="3"/>
+        </w:numPr>
+        <w:spacing w:after="60"/>
+      </w:pPr>
+      <w:r>
+        <w:rPr>
+          <w:rFonts w:ascii="Arial" w:cs="Arial" w:eastAsia="Arial" w:hAnsi="Arial"/>
+        </w:rPr>
+        <w:t xml:space="preserve">BPS menyebut disabilitas termasuk variabel, tetapi bobotnya tidak diketahui dan penyandang disabilitas tidak pernah didengar.</w:t>
+      </w:r>
+    </w:p>
+    <w:p>
+      <w:pPr>
+        <w:pStyle w:val="ListParagraph"/>
+        <w:numPr>
+          <w:ilvl w:val="0"/>
+          <w:numId w:val="3"/>
+        </w:numPr>
+        <w:spacing w:after="60"/>
+      </w:pPr>
+      <w:r>
+        <w:rPr>
+          <w:rFonts w:ascii="Arial" w:cs="Arial" w:eastAsia="Arial" w:hAnsi="Arial"/>
+        </w:rPr>
+        <w:t xml:space="preserve">Pasal 28H ayat (2) menjamin kemudahan dan perlakuan khusus; prinsip “tidak ada keputusan tentang kami tanpa kami” berasal dari gerakan penyandang disabilitas.</w:t>
+      </w:r>
+    </w:p>
+    <w:p>
+      <w:pPr>
+        <w:spacing w:after="120" w:line="276"/>
+        <w:jc w:val="both"/>
+      </w:pPr>
+      <w:r>
+        <w:rPr>
+          <w:rFonts w:ascii="Arial" w:cs="Arial" w:eastAsia="Arial" w:hAnsi="Arial"/>
+          <w:b/>
+          <w:bCs/>
+        </w:rPr>
+        <w:t xml:space="preserve">Bukti:</w:t>
+      </w:r>
+      <w:r>
+        <w:rPr>
+          <w:rFonts w:ascii="Arial" w:cs="Arial" w:eastAsia="Arial" w:hAnsi="Arial"/>
+        </w:rPr>
+        <w:t xml:space="preserve"> KTP, KK, surat keterangan disabilitas dari dokter, laporan kecelakaan kerja, hasil cek DTSEN, surat keterangan dari organisasi penyandang disabilitas.</w:t>
+      </w:r>
+    </w:p>
+    <w:p>
+      <w:pPr>
+        <w:pStyle w:val="Heading1"/>
+      </w:pPr>
+      <w:r>
+        <w:rPr>
+          <w:rFonts w:ascii="Arial" w:cs="Arial" w:eastAsia="Arial" w:hAnsi="Arial"/>
+        </w:rPr>
+        <w:t xml:space="preserve">6. Pihak dalam Sidang dan Pembagian Peran</w:t>
+      </w:r>
+    </w:p>
+    <w:p>
+      <w:pPr>
+        <w:spacing w:after="120" w:line="276"/>
+        <w:jc w:val="both"/>
+      </w:pPr>
+      <w:r>
+        <w:rPr>
+          <w:rFonts w:ascii="Arial" w:cs="Arial" w:eastAsia="Arial" w:hAnsi="Arial"/>
+        </w:rPr>
+        <w:t xml:space="preserve">Sidang simulasi melibatkan 41 orang dalam tiga kelompok. Tim Pemohon memakai </w:t>
+      </w:r>
+      <w:r>
+        <w:rPr>
+          <w:rFonts w:ascii="Arial" w:cs="Arial" w:eastAsia="Arial" w:hAnsi="Arial"/>
+          <w:b/>
+          <w:bCs/>
+        </w:rPr>
+        <w:t xml:space="preserve">1 kuasa hukum</w:t>
+      </w:r>
+      <w:r>
+        <w:rPr>
+          <w:rFonts w:ascii="Arial" w:cs="Arial" w:eastAsia="Arial" w:hAnsi="Arial"/>
+        </w:rPr>
+        <w:t xml:space="preserve">, sehingga 15 anggota lainnya dibagi menjadi 7 Pemohon prinsipal, 4 saksi, dan 4 ahli.</w:t>
       </w:r>
     </w:p>
     <w:tbl>
@@ -5861,7 +7230,7 @@
                 <w:sz w:val="18"/>
                 <w:szCs w:val="18"/>
               </w:rPr>
-              <w:t xml:space="preserve">Tugas</w:t>
+              <w:t xml:space="preserve">Siapa</w:t>
             </w:r>
           </w:p>
         </w:tc>
@@ -5930,7 +7299,7 @@
                 <w:sz w:val="18"/>
                 <w:szCs w:val="18"/>
               </w:rPr>
-              <w:t xml:space="preserve">5</w:t>
+              <w:t xml:space="preserve">1</w:t>
             </w:r>
           </w:p>
         </w:tc>
@@ -5962,7 +7331,7 @@
                 <w:sz w:val="18"/>
                 <w:szCs w:val="18"/>
               </w:rPr>
-              <w:t xml:space="preserve">1 koordinator; membacakan permohonan; memeriksa saksi dan ahli; bertanya kepada ahli Pemerintah; menyusun kesimpulan</w:t>
+              <w:t xml:space="preserve">Bicara atas nama semua Pemohon dan memimpin jalannya pemeriksaan</w:t>
             </w:r>
           </w:p>
         </w:tc>
@@ -6031,7 +7400,7 @@
                 <w:sz w:val="18"/>
                 <w:szCs w:val="18"/>
               </w:rPr>
-              <w:t xml:space="preserve">4</w:t>
+              <w:t xml:space="preserve">7</w:t>
             </w:r>
           </w:p>
         </w:tc>
@@ -6063,7 +7432,7 @@
                 <w:sz w:val="18"/>
                 <w:szCs w:val="18"/>
               </w:rPr>
-              <w:t xml:space="preserve">Pemohon I–IV; menyampaikan kerugian konstitusional masing-masing</w:t>
+              <w:t xml:space="preserve">Pemohon I, II, III, V, VI (masing-masing 1 orang) dan Pemohon IV (Ketua dan Sekretaris PSWB)</w:t>
             </w:r>
           </w:p>
         </w:tc>
@@ -6132,7 +7501,7 @@
                 <w:sz w:val="18"/>
                 <w:szCs w:val="18"/>
               </w:rPr>
-              <w:t xml:space="preserve">3</w:t>
+              <w:t xml:space="preserve">4</w:t>
             </w:r>
           </w:p>
         </w:tc>
@@ -6164,7 +7533,7 @@
                 <w:sz w:val="18"/>
                 <w:szCs w:val="18"/>
               </w:rPr>
-              <w:t xml:space="preserve">Saksi 1–3 (bagian 7)</w:t>
+              <w:t xml:space="preserve">Saksi 1–4 (bagian 7)</w:t>
             </w:r>
           </w:p>
         </w:tc>
@@ -6271,6 +7640,748 @@
         </w:tc>
       </w:tr>
     </w:tbl>
+    <w:p>
+      <w:pPr>
+        <w:spacing w:after="60" w:before="120"/>
+      </w:pPr>
+      <w:r>
+        <w:rPr>
+          <w:rFonts w:ascii="Arial" w:cs="Arial" w:eastAsia="Arial" w:hAnsi="Arial"/>
+          <w:b/>
+          <w:bCs/>
+        </w:rPr>
+        <w:t xml:space="preserve">Karena kuasa hukum hanya satu, sebagian tugas bicara dibagi ke Pemohon prinsipal:</w:t>
+      </w:r>
+    </w:p>
+    <w:tbl>
+      <w:tblPr>
+        <w:tblW w:type="dxa" w:w="9638"/>
+        <w:tblBorders>
+          <w:top w:val="single" w:color="auto" w:sz="4"/>
+          <w:left w:val="single" w:color="auto" w:sz="4"/>
+          <w:bottom w:val="single" w:color="auto" w:sz="4"/>
+          <w:right w:val="single" w:color="auto" w:sz="4"/>
+          <w:insideH w:val="single" w:color="auto" w:sz="4"/>
+          <w:insideV w:val="single" w:color="auto" w:sz="4"/>
+        </w:tblBorders>
+        <w:tblLayout w:type="fixed"/>
+      </w:tblPr>
+      <w:tblGrid>
+        <w:gridCol w:w="5000"/>
+        <w:gridCol w:w="4638"/>
+      </w:tblGrid>
+      <w:tr>
+        <w:trPr>
+          <w:tblHeader/>
+        </w:trPr>
+        <w:tc>
+          <w:tcPr>
+            <w:tcW w:type="dxa" w:w="5000"/>
+            <w:tcBorders>
+              <w:top w:val="single" w:color="999999" w:sz="4"/>
+              <w:left w:val="single" w:color="999999" w:sz="4"/>
+              <w:bottom w:val="single" w:color="999999" w:sz="4"/>
+              <w:right w:val="single" w:color="999999" w:sz="4"/>
+            </w:tcBorders>
+            <w:shd w:fill="D9E2F3" w:color="auto" w:val="clear"/>
+            <w:tcMar>
+              <w:top w:type="dxa" w:w="60"/>
+              <w:left w:type="dxa" w:w="100"/>
+              <w:bottom w:type="dxa" w:w="60"/>
+              <w:right w:type="dxa" w:w="100"/>
+            </w:tcMar>
+          </w:tcPr>
+          <w:p>
+            <w:pPr>
+              <w:jc w:val="left"/>
+            </w:pPr>
+            <w:r>
+              <w:rPr>
+                <w:rFonts w:ascii="Arial" w:cs="Arial" w:eastAsia="Arial" w:hAnsi="Arial"/>
+                <w:b/>
+                <w:bCs/>
+                <w:sz w:val="18"/>
+                <w:szCs w:val="18"/>
+              </w:rPr>
+              <w:t xml:space="preserve">Bagian sidang</w:t>
+            </w:r>
+          </w:p>
+        </w:tc>
+        <w:tc>
+          <w:tcPr>
+            <w:tcW w:type="dxa" w:w="4638"/>
+            <w:tcBorders>
+              <w:top w:val="single" w:color="999999" w:sz="4"/>
+              <w:left w:val="single" w:color="999999" w:sz="4"/>
+              <w:bottom w:val="single" w:color="999999" w:sz="4"/>
+              <w:right w:val="single" w:color="999999" w:sz="4"/>
+            </w:tcBorders>
+            <w:shd w:fill="D9E2F3" w:color="auto" w:val="clear"/>
+            <w:tcMar>
+              <w:top w:type="dxa" w:w="60"/>
+              <w:left w:type="dxa" w:w="100"/>
+              <w:bottom w:type="dxa" w:w="60"/>
+              <w:right w:type="dxa" w:w="100"/>
+            </w:tcMar>
+          </w:tcPr>
+          <w:p>
+            <w:pPr>
+              <w:jc w:val="left"/>
+            </w:pPr>
+            <w:r>
+              <w:rPr>
+                <w:rFonts w:ascii="Arial" w:cs="Arial" w:eastAsia="Arial" w:hAnsi="Arial"/>
+                <w:b/>
+                <w:bCs/>
+                <w:sz w:val="18"/>
+                <w:szCs w:val="18"/>
+              </w:rPr>
+              <w:t xml:space="preserve">Pembicara</w:t>
+            </w:r>
+          </w:p>
+        </w:tc>
+      </w:tr>
+      <w:tr>
+        <w:trPr>
+          <w:cantSplit/>
+        </w:trPr>
+        <w:tc>
+          <w:tcPr>
+            <w:tcW w:type="dxa" w:w="5000"/>
+            <w:tcBorders>
+              <w:top w:val="single" w:color="999999" w:sz="4"/>
+              <w:left w:val="single" w:color="999999" w:sz="4"/>
+              <w:bottom w:val="single" w:color="999999" w:sz="4"/>
+              <w:right w:val="single" w:color="999999" w:sz="4"/>
+            </w:tcBorders>
+            <w:tcMar>
+              <w:top w:type="dxa" w:w="60"/>
+              <w:left w:type="dxa" w:w="100"/>
+              <w:bottom w:type="dxa" w:w="60"/>
+              <w:right w:type="dxa" w:w="100"/>
+            </w:tcMar>
+          </w:tcPr>
+          <w:p>
+            <w:pPr>
+              <w:jc w:val="left"/>
+            </w:pPr>
+            <w:r>
+              <w:rPr>
+                <w:rFonts w:ascii="Arial" w:cs="Arial" w:eastAsia="Arial" w:hAnsi="Arial"/>
+                <w:b w:val="false"/>
+                <w:bCs w:val="false"/>
+                <w:sz w:val="18"/>
+                <w:szCs w:val="18"/>
+              </w:rPr>
+              <w:t xml:space="preserve">Pembukaan, identitas, dan kewenangan MK</w:t>
+            </w:r>
+          </w:p>
+        </w:tc>
+        <w:tc>
+          <w:tcPr>
+            <w:tcW w:type="dxa" w:w="4638"/>
+            <w:tcBorders>
+              <w:top w:val="single" w:color="999999" w:sz="4"/>
+              <w:left w:val="single" w:color="999999" w:sz="4"/>
+              <w:bottom w:val="single" w:color="999999" w:sz="4"/>
+              <w:right w:val="single" w:color="999999" w:sz="4"/>
+            </w:tcBorders>
+            <w:tcMar>
+              <w:top w:type="dxa" w:w="60"/>
+              <w:left w:type="dxa" w:w="100"/>
+              <w:bottom w:type="dxa" w:w="60"/>
+              <w:right w:type="dxa" w:w="100"/>
+            </w:tcMar>
+          </w:tcPr>
+          <w:p>
+            <w:pPr>
+              <w:jc w:val="left"/>
+            </w:pPr>
+            <w:r>
+              <w:rPr>
+                <w:rFonts w:ascii="Arial" w:cs="Arial" w:eastAsia="Arial" w:hAnsi="Arial"/>
+                <w:b w:val="false"/>
+                <w:bCs w:val="false"/>
+                <w:sz w:val="18"/>
+                <w:szCs w:val="18"/>
+              </w:rPr>
+              <w:t xml:space="preserve">Kuasa hukum</w:t>
+            </w:r>
+          </w:p>
+        </w:tc>
+      </w:tr>
+      <w:tr>
+        <w:trPr>
+          <w:cantSplit/>
+        </w:trPr>
+        <w:tc>
+          <w:tcPr>
+            <w:tcW w:type="dxa" w:w="5000"/>
+            <w:tcBorders>
+              <w:top w:val="single" w:color="999999" w:sz="4"/>
+              <w:left w:val="single" w:color="999999" w:sz="4"/>
+              <w:bottom w:val="single" w:color="999999" w:sz="4"/>
+              <w:right w:val="single" w:color="999999" w:sz="4"/>
+            </w:tcBorders>
+            <w:tcMar>
+              <w:top w:type="dxa" w:w="60"/>
+              <w:left w:type="dxa" w:w="100"/>
+              <w:bottom w:type="dxa" w:w="60"/>
+              <w:right w:type="dxa" w:w="100"/>
+            </w:tcMar>
+          </w:tcPr>
+          <w:p>
+            <w:pPr>
+              <w:jc w:val="left"/>
+            </w:pPr>
+            <w:r>
+              <w:rPr>
+                <w:rFonts w:ascii="Arial" w:cs="Arial" w:eastAsia="Arial" w:hAnsi="Arial"/>
+                <w:b w:val="false"/>
+                <w:bCs w:val="false"/>
+                <w:sz w:val="18"/>
+                <w:szCs w:val="18"/>
+              </w:rPr>
+              <w:t xml:space="preserve">Kedudukan hukum</w:t>
+            </w:r>
+          </w:p>
+        </w:tc>
+        <w:tc>
+          <w:tcPr>
+            <w:tcW w:type="dxa" w:w="4638"/>
+            <w:tcBorders>
+              <w:top w:val="single" w:color="999999" w:sz="4"/>
+              <w:left w:val="single" w:color="999999" w:sz="4"/>
+              <w:bottom w:val="single" w:color="999999" w:sz="4"/>
+              <w:right w:val="single" w:color="999999" w:sz="4"/>
+            </w:tcBorders>
+            <w:tcMar>
+              <w:top w:type="dxa" w:w="60"/>
+              <w:left w:type="dxa" w:w="100"/>
+              <w:bottom w:type="dxa" w:w="60"/>
+              <w:right w:type="dxa" w:w="100"/>
+            </w:tcMar>
+          </w:tcPr>
+          <w:p>
+            <w:pPr>
+              <w:jc w:val="left"/>
+            </w:pPr>
+            <w:r>
+              <w:rPr>
+                <w:rFonts w:ascii="Arial" w:cs="Arial" w:eastAsia="Arial" w:hAnsi="Arial"/>
+                <w:b w:val="false"/>
+                <w:bCs w:val="false"/>
+                <w:sz w:val="18"/>
+                <w:szCs w:val="18"/>
+              </w:rPr>
+              <w:t xml:space="preserve">Masing-masing Pemohon untuk dirinya sendiri</w:t>
+            </w:r>
+          </w:p>
+        </w:tc>
+      </w:tr>
+      <w:tr>
+        <w:trPr>
+          <w:cantSplit/>
+        </w:trPr>
+        <w:tc>
+          <w:tcPr>
+            <w:tcW w:type="dxa" w:w="5000"/>
+            <w:tcBorders>
+              <w:top w:val="single" w:color="999999" w:sz="4"/>
+              <w:left w:val="single" w:color="999999" w:sz="4"/>
+              <w:bottom w:val="single" w:color="999999" w:sz="4"/>
+              <w:right w:val="single" w:color="999999" w:sz="4"/>
+            </w:tcBorders>
+            <w:tcMar>
+              <w:top w:type="dxa" w:w="60"/>
+              <w:left w:type="dxa" w:w="100"/>
+              <w:bottom w:type="dxa" w:w="60"/>
+              <w:right w:type="dxa" w:w="100"/>
+            </w:tcMar>
+          </w:tcPr>
+          <w:p>
+            <w:pPr>
+              <w:jc w:val="left"/>
+            </w:pPr>
+            <w:r>
+              <w:rPr>
+                <w:rFonts w:ascii="Arial" w:cs="Arial" w:eastAsia="Arial" w:hAnsi="Arial"/>
+                <w:b w:val="false"/>
+                <w:bCs w:val="false"/>
+                <w:sz w:val="18"/>
+                <w:szCs w:val="18"/>
+              </w:rPr>
+              <w:t xml:space="preserve">Alasan permohonan: dalil partisipasi dan kontradiksi internal UU</w:t>
+            </w:r>
+          </w:p>
+        </w:tc>
+        <w:tc>
+          <w:tcPr>
+            <w:tcW w:type="dxa" w:w="4638"/>
+            <w:tcBorders>
+              <w:top w:val="single" w:color="999999" w:sz="4"/>
+              <w:left w:val="single" w:color="999999" w:sz="4"/>
+              <w:bottom w:val="single" w:color="999999" w:sz="4"/>
+              <w:right w:val="single" w:color="999999" w:sz="4"/>
+            </w:tcBorders>
+            <w:tcMar>
+              <w:top w:type="dxa" w:w="60"/>
+              <w:left w:type="dxa" w:w="100"/>
+              <w:bottom w:type="dxa" w:w="60"/>
+              <w:right w:type="dxa" w:w="100"/>
+            </w:tcMar>
+          </w:tcPr>
+          <w:p>
+            <w:pPr>
+              <w:jc w:val="left"/>
+            </w:pPr>
+            <w:r>
+              <w:rPr>
+                <w:rFonts w:ascii="Arial" w:cs="Arial" w:eastAsia="Arial" w:hAnsi="Arial"/>
+                <w:b w:val="false"/>
+                <w:bCs w:val="false"/>
+                <w:sz w:val="18"/>
+                <w:szCs w:val="18"/>
+              </w:rPr>
+              <w:t xml:space="preserve">Ketua PSWB (Pemohon IV)</w:t>
+            </w:r>
+          </w:p>
+        </w:tc>
+      </w:tr>
+      <w:tr>
+        <w:trPr>
+          <w:cantSplit/>
+        </w:trPr>
+        <w:tc>
+          <w:tcPr>
+            <w:tcW w:type="dxa" w:w="5000"/>
+            <w:tcBorders>
+              <w:top w:val="single" w:color="999999" w:sz="4"/>
+              <w:left w:val="single" w:color="999999" w:sz="4"/>
+              <w:bottom w:val="single" w:color="999999" w:sz="4"/>
+              <w:right w:val="single" w:color="999999" w:sz="4"/>
+            </w:tcBorders>
+            <w:tcMar>
+              <w:top w:type="dxa" w:w="60"/>
+              <w:left w:type="dxa" w:w="100"/>
+              <w:bottom w:type="dxa" w:w="60"/>
+              <w:right w:type="dxa" w:w="100"/>
+            </w:tcMar>
+          </w:tcPr>
+          <w:p>
+            <w:pPr>
+              <w:jc w:val="left"/>
+            </w:pPr>
+            <w:r>
+              <w:rPr>
+                <w:rFonts w:ascii="Arial" w:cs="Arial" w:eastAsia="Arial" w:hAnsi="Arial"/>
+                <w:b w:val="false"/>
+                <w:bCs w:val="false"/>
+                <w:sz w:val="18"/>
+                <w:szCs w:val="18"/>
+              </w:rPr>
+              <w:t xml:space="preserve">Alasan permohonan: bukti polemik desil</w:t>
+            </w:r>
+          </w:p>
+        </w:tc>
+        <w:tc>
+          <w:tcPr>
+            <w:tcW w:type="dxa" w:w="4638"/>
+            <w:tcBorders>
+              <w:top w:val="single" w:color="999999" w:sz="4"/>
+              <w:left w:val="single" w:color="999999" w:sz="4"/>
+              <w:bottom w:val="single" w:color="999999" w:sz="4"/>
+              <w:right w:val="single" w:color="999999" w:sz="4"/>
+            </w:tcBorders>
+            <w:tcMar>
+              <w:top w:type="dxa" w:w="60"/>
+              <w:left w:type="dxa" w:w="100"/>
+              <w:bottom w:type="dxa" w:w="60"/>
+              <w:right w:type="dxa" w:w="100"/>
+            </w:tcMar>
+          </w:tcPr>
+          <w:p>
+            <w:pPr>
+              <w:jc w:val="left"/>
+            </w:pPr>
+            <w:r>
+              <w:rPr>
+                <w:rFonts w:ascii="Arial" w:cs="Arial" w:eastAsia="Arial" w:hAnsi="Arial"/>
+                <w:b w:val="false"/>
+                <w:bCs w:val="false"/>
+                <w:sz w:val="18"/>
+                <w:szCs w:val="18"/>
+              </w:rPr>
+              <w:t xml:space="preserve">Pemohon V</w:t>
+            </w:r>
+          </w:p>
+        </w:tc>
+      </w:tr>
+      <w:tr>
+        <w:trPr>
+          <w:cantSplit/>
+        </w:trPr>
+        <w:tc>
+          <w:tcPr>
+            <w:tcW w:type="dxa" w:w="5000"/>
+            <w:tcBorders>
+              <w:top w:val="single" w:color="999999" w:sz="4"/>
+              <w:left w:val="single" w:color="999999" w:sz="4"/>
+              <w:bottom w:val="single" w:color="999999" w:sz="4"/>
+              <w:right w:val="single" w:color="999999" w:sz="4"/>
+            </w:tcBorders>
+            <w:tcMar>
+              <w:top w:type="dxa" w:w="60"/>
+              <w:left w:type="dxa" w:w="100"/>
+              <w:bottom w:type="dxa" w:w="60"/>
+              <w:right w:type="dxa" w:w="100"/>
+            </w:tcMar>
+          </w:tcPr>
+          <w:p>
+            <w:pPr>
+              <w:jc w:val="left"/>
+            </w:pPr>
+            <w:r>
+              <w:rPr>
+                <w:rFonts w:ascii="Arial" w:cs="Arial" w:eastAsia="Arial" w:hAnsi="Arial"/>
+                <w:b w:val="false"/>
+                <w:bCs w:val="false"/>
+                <w:sz w:val="18"/>
+                <w:szCs w:val="18"/>
+              </w:rPr>
+              <w:t xml:space="preserve">Alasan permohonan: kearifan lokal dan wilayah pesisir</w:t>
+            </w:r>
+          </w:p>
+        </w:tc>
+        <w:tc>
+          <w:tcPr>
+            <w:tcW w:type="dxa" w:w="4638"/>
+            <w:tcBorders>
+              <w:top w:val="single" w:color="999999" w:sz="4"/>
+              <w:left w:val="single" w:color="999999" w:sz="4"/>
+              <w:bottom w:val="single" w:color="999999" w:sz="4"/>
+              <w:right w:val="single" w:color="999999" w:sz="4"/>
+            </w:tcBorders>
+            <w:tcMar>
+              <w:top w:type="dxa" w:w="60"/>
+              <w:left w:type="dxa" w:w="100"/>
+              <w:bottom w:type="dxa" w:w="60"/>
+              <w:right w:type="dxa" w:w="100"/>
+            </w:tcMar>
+          </w:tcPr>
+          <w:p>
+            <w:pPr>
+              <w:jc w:val="left"/>
+            </w:pPr>
+            <w:r>
+              <w:rPr>
+                <w:rFonts w:ascii="Arial" w:cs="Arial" w:eastAsia="Arial" w:hAnsi="Arial"/>
+                <w:b w:val="false"/>
+                <w:bCs w:val="false"/>
+                <w:sz w:val="18"/>
+                <w:szCs w:val="18"/>
+              </w:rPr>
+              <w:t xml:space="preserve">Pemohon III</w:t>
+            </w:r>
+          </w:p>
+        </w:tc>
+      </w:tr>
+      <w:tr>
+        <w:trPr>
+          <w:cantSplit/>
+        </w:trPr>
+        <w:tc>
+          <w:tcPr>
+            <w:tcW w:type="dxa" w:w="5000"/>
+            <w:tcBorders>
+              <w:top w:val="single" w:color="999999" w:sz="4"/>
+              <w:left w:val="single" w:color="999999" w:sz="4"/>
+              <w:bottom w:val="single" w:color="999999" w:sz="4"/>
+              <w:right w:val="single" w:color="999999" w:sz="4"/>
+            </w:tcBorders>
+            <w:tcMar>
+              <w:top w:type="dxa" w:w="60"/>
+              <w:left w:type="dxa" w:w="100"/>
+              <w:bottom w:type="dxa" w:w="60"/>
+              <w:right w:type="dxa" w:w="100"/>
+            </w:tcMar>
+          </w:tcPr>
+          <w:p>
+            <w:pPr>
+              <w:jc w:val="left"/>
+            </w:pPr>
+            <w:r>
+              <w:rPr>
+                <w:rFonts w:ascii="Arial" w:cs="Arial" w:eastAsia="Arial" w:hAnsi="Arial"/>
+                <w:b w:val="false"/>
+                <w:bCs w:val="false"/>
+                <w:sz w:val="18"/>
+                <w:szCs w:val="18"/>
+              </w:rPr>
+              <w:t xml:space="preserve">Petitum</w:t>
+            </w:r>
+          </w:p>
+        </w:tc>
+        <w:tc>
+          <w:tcPr>
+            <w:tcW w:type="dxa" w:w="4638"/>
+            <w:tcBorders>
+              <w:top w:val="single" w:color="999999" w:sz="4"/>
+              <w:left w:val="single" w:color="999999" w:sz="4"/>
+              <w:bottom w:val="single" w:color="999999" w:sz="4"/>
+              <w:right w:val="single" w:color="999999" w:sz="4"/>
+            </w:tcBorders>
+            <w:tcMar>
+              <w:top w:type="dxa" w:w="60"/>
+              <w:left w:type="dxa" w:w="100"/>
+              <w:bottom w:type="dxa" w:w="60"/>
+              <w:right w:type="dxa" w:w="100"/>
+            </w:tcMar>
+          </w:tcPr>
+          <w:p>
+            <w:pPr>
+              <w:jc w:val="left"/>
+            </w:pPr>
+            <w:r>
+              <w:rPr>
+                <w:rFonts w:ascii="Arial" w:cs="Arial" w:eastAsia="Arial" w:hAnsi="Arial"/>
+                <w:b w:val="false"/>
+                <w:bCs w:val="false"/>
+                <w:sz w:val="18"/>
+                <w:szCs w:val="18"/>
+              </w:rPr>
+              <w:t xml:space="preserve">Kuasa hukum</w:t>
+            </w:r>
+          </w:p>
+        </w:tc>
+      </w:tr>
+      <w:tr>
+        <w:trPr>
+          <w:cantSplit/>
+        </w:trPr>
+        <w:tc>
+          <w:tcPr>
+            <w:tcW w:type="dxa" w:w="5000"/>
+            <w:tcBorders>
+              <w:top w:val="single" w:color="999999" w:sz="4"/>
+              <w:left w:val="single" w:color="999999" w:sz="4"/>
+              <w:bottom w:val="single" w:color="999999" w:sz="4"/>
+              <w:right w:val="single" w:color="999999" w:sz="4"/>
+            </w:tcBorders>
+            <w:tcMar>
+              <w:top w:type="dxa" w:w="60"/>
+              <w:left w:type="dxa" w:w="100"/>
+              <w:bottom w:type="dxa" w:w="60"/>
+              <w:right w:type="dxa" w:w="100"/>
+            </w:tcMar>
+          </w:tcPr>
+          <w:p>
+            <w:pPr>
+              <w:jc w:val="left"/>
+            </w:pPr>
+            <w:r>
+              <w:rPr>
+                <w:rFonts w:ascii="Arial" w:cs="Arial" w:eastAsia="Arial" w:hAnsi="Arial"/>
+                <w:b w:val="false"/>
+                <w:bCs w:val="false"/>
+                <w:sz w:val="18"/>
+                <w:szCs w:val="18"/>
+              </w:rPr>
+              <w:t xml:space="preserve">Pemeriksaan saksi dan ahli kita</w:t>
+            </w:r>
+          </w:p>
+        </w:tc>
+        <w:tc>
+          <w:tcPr>
+            <w:tcW w:type="dxa" w:w="4638"/>
+            <w:tcBorders>
+              <w:top w:val="single" w:color="999999" w:sz="4"/>
+              <w:left w:val="single" w:color="999999" w:sz="4"/>
+              <w:bottom w:val="single" w:color="999999" w:sz="4"/>
+              <w:right w:val="single" w:color="999999" w:sz="4"/>
+            </w:tcBorders>
+            <w:tcMar>
+              <w:top w:type="dxa" w:w="60"/>
+              <w:left w:type="dxa" w:w="100"/>
+              <w:bottom w:type="dxa" w:w="60"/>
+              <w:right w:type="dxa" w:w="100"/>
+            </w:tcMar>
+          </w:tcPr>
+          <w:p>
+            <w:pPr>
+              <w:jc w:val="left"/>
+            </w:pPr>
+            <w:r>
+              <w:rPr>
+                <w:rFonts w:ascii="Arial" w:cs="Arial" w:eastAsia="Arial" w:hAnsi="Arial"/>
+                <w:b w:val="false"/>
+                <w:bCs w:val="false"/>
+                <w:sz w:val="18"/>
+                <w:szCs w:val="18"/>
+              </w:rPr>
+              <w:t xml:space="preserve">Kuasa hukum</w:t>
+            </w:r>
+          </w:p>
+        </w:tc>
+      </w:tr>
+      <w:tr>
+        <w:trPr>
+          <w:cantSplit/>
+        </w:trPr>
+        <w:tc>
+          <w:tcPr>
+            <w:tcW w:type="dxa" w:w="5000"/>
+            <w:tcBorders>
+              <w:top w:val="single" w:color="999999" w:sz="4"/>
+              <w:left w:val="single" w:color="999999" w:sz="4"/>
+              <w:bottom w:val="single" w:color="999999" w:sz="4"/>
+              <w:right w:val="single" w:color="999999" w:sz="4"/>
+            </w:tcBorders>
+            <w:tcMar>
+              <w:top w:type="dxa" w:w="60"/>
+              <w:left w:type="dxa" w:w="100"/>
+              <w:bottom w:type="dxa" w:w="60"/>
+              <w:right w:type="dxa" w:w="100"/>
+            </w:tcMar>
+          </w:tcPr>
+          <w:p>
+            <w:pPr>
+              <w:jc w:val="left"/>
+            </w:pPr>
+            <w:r>
+              <w:rPr>
+                <w:rFonts w:ascii="Arial" w:cs="Arial" w:eastAsia="Arial" w:hAnsi="Arial"/>
+                <w:b w:val="false"/>
+                <w:bCs w:val="false"/>
+                <w:sz w:val="18"/>
+                <w:szCs w:val="18"/>
+              </w:rPr>
+              <w:t xml:space="preserve">Pertanyaan kepada saksi dan ahli Pemerintah</w:t>
+            </w:r>
+          </w:p>
+        </w:tc>
+        <w:tc>
+          <w:tcPr>
+            <w:tcW w:type="dxa" w:w="4638"/>
+            <w:tcBorders>
+              <w:top w:val="single" w:color="999999" w:sz="4"/>
+              <w:left w:val="single" w:color="999999" w:sz="4"/>
+              <w:bottom w:val="single" w:color="999999" w:sz="4"/>
+              <w:right w:val="single" w:color="999999" w:sz="4"/>
+            </w:tcBorders>
+            <w:tcMar>
+              <w:top w:type="dxa" w:w="60"/>
+              <w:left w:type="dxa" w:w="100"/>
+              <w:bottom w:type="dxa" w:w="60"/>
+              <w:right w:type="dxa" w:w="100"/>
+            </w:tcMar>
+          </w:tcPr>
+          <w:p>
+            <w:pPr>
+              <w:jc w:val="left"/>
+            </w:pPr>
+            <w:r>
+              <w:rPr>
+                <w:rFonts w:ascii="Arial" w:cs="Arial" w:eastAsia="Arial" w:hAnsi="Arial"/>
+                <w:b w:val="false"/>
+                <w:bCs w:val="false"/>
+                <w:sz w:val="18"/>
+                <w:szCs w:val="18"/>
+              </w:rPr>
+              <w:t xml:space="preserve">Kuasa hukum; Sekretaris PSWB mencatat jawaban untuk kesimpulan</w:t>
+            </w:r>
+          </w:p>
+        </w:tc>
+      </w:tr>
+      <w:tr>
+        <w:trPr>
+          <w:cantSplit/>
+        </w:trPr>
+        <w:tc>
+          <w:tcPr>
+            <w:tcW w:type="dxa" w:w="5000"/>
+            <w:tcBorders>
+              <w:top w:val="single" w:color="999999" w:sz="4"/>
+              <w:left w:val="single" w:color="999999" w:sz="4"/>
+              <w:bottom w:val="single" w:color="999999" w:sz="4"/>
+              <w:right w:val="single" w:color="999999" w:sz="4"/>
+            </w:tcBorders>
+            <w:tcMar>
+              <w:top w:type="dxa" w:w="60"/>
+              <w:left w:type="dxa" w:w="100"/>
+              <w:bottom w:type="dxa" w:w="60"/>
+              <w:right w:type="dxa" w:w="100"/>
+            </w:tcMar>
+          </w:tcPr>
+          <w:p>
+            <w:pPr>
+              <w:jc w:val="left"/>
+            </w:pPr>
+            <w:r>
+              <w:rPr>
+                <w:rFonts w:ascii="Arial" w:cs="Arial" w:eastAsia="Arial" w:hAnsi="Arial"/>
+                <w:b w:val="false"/>
+                <w:bCs w:val="false"/>
+                <w:sz w:val="18"/>
+                <w:szCs w:val="18"/>
+              </w:rPr>
+              <w:t xml:space="preserve">Kesimpulan</w:t>
+            </w:r>
+          </w:p>
+        </w:tc>
+        <w:tc>
+          <w:tcPr>
+            <w:tcW w:type="dxa" w:w="4638"/>
+            <w:tcBorders>
+              <w:top w:val="single" w:color="999999" w:sz="4"/>
+              <w:left w:val="single" w:color="999999" w:sz="4"/>
+              <w:bottom w:val="single" w:color="999999" w:sz="4"/>
+              <w:right w:val="single" w:color="999999" w:sz="4"/>
+            </w:tcBorders>
+            <w:tcMar>
+              <w:top w:type="dxa" w:w="60"/>
+              <w:left w:type="dxa" w:w="100"/>
+              <w:bottom w:type="dxa" w:w="60"/>
+              <w:right w:type="dxa" w:w="100"/>
+            </w:tcMar>
+          </w:tcPr>
+          <w:p>
+            <w:pPr>
+              <w:jc w:val="left"/>
+            </w:pPr>
+            <w:r>
+              <w:rPr>
+                <w:rFonts w:ascii="Arial" w:cs="Arial" w:eastAsia="Arial" w:hAnsi="Arial"/>
+                <w:b w:val="false"/>
+                <w:bCs w:val="false"/>
+                <w:sz w:val="18"/>
+                <w:szCs w:val="18"/>
+              </w:rPr>
+              <w:t xml:space="preserve">Kuasa hukum, disusun bersama</w:t>
+            </w:r>
+          </w:p>
+        </w:tc>
+      </w:tr>
+    </w:tbl>
+    <w:p>
+      <w:pPr>
+        <w:spacing w:after="120"/>
+      </w:pPr>
+    </w:p>
+    <w:p>
+      <w:pPr>
+        <w:spacing w:after="120" w:line="276"/>
+        <w:jc w:val="both"/>
+      </w:pPr>
+      <w:r>
+        <w:rPr>
+          <w:rFonts w:ascii="Arial" w:cs="Arial" w:eastAsia="Arial" w:hAnsi="Arial"/>
+          <w:i/>
+          <w:iCs/>
+        </w:rPr>
+        <w:t xml:space="preserve">Di MK, Pemohon prinsipal dapat hadir dan berbicara bersama kuasa hukumnya atas izin majelis; pastikan aturan simulasi dosen mengizinkan pembagian ini.</w:t>
+      </w:r>
+    </w:p>
     <w:p>
       <w:pPr>
         <w:pStyle w:val="Heading1"/>
@@ -7025,7 +9136,7 @@
                 <w:sz w:val="18"/>
                 <w:szCs w:val="18"/>
               </w:rPr>
-              <w:t xml:space="preserve">Ahli 1</w:t>
+              <w:t xml:space="preserve">Saksi 4</w:t>
             </w:r>
           </w:p>
         </w:tc>
@@ -7057,7 +9168,7 @@
                 <w:sz w:val="18"/>
                 <w:szCs w:val="18"/>
               </w:rPr>
-              <w:t xml:space="preserve">Prof. Dr. Aryani Kusumastuti, S.H., M.H.</w:t>
+              <w:t xml:space="preserve">Sri Wahyuni</w:t>
             </w:r>
           </w:p>
         </w:tc>
@@ -7089,7 +9200,7 @@
                 <w:sz w:val="18"/>
                 <w:szCs w:val="18"/>
               </w:rPr>
-              <w:t xml:space="preserve">Hukum Tata Negara, akademisi</w:t>
+              <w:t xml:space="preserve">Pengurus organisasi penyandang disabilitas di Kab. Sleman, bukan pegawai pemerintah</w:t>
             </w:r>
           </w:p>
         </w:tc>
@@ -7121,7 +9232,7 @@
                 <w:sz w:val="18"/>
                 <w:szCs w:val="18"/>
               </w:rPr>
-              <w:t xml:space="preserve">Partisipasi bermakna (Putusan 91/PUU-XVIII/2020) secara analogis; expressio unius est exclusio alterius; kontradiksi Pasal 4 huruf c dan Pasal 8 ayat (7) dengan Pasal 8 ayat (2); batas open legal policy; alasan putusan bersyarat; hak partisipasi dalam Kovenan Hak Ekosob (UU 11/2005)</w:t>
+              <w:t xml:space="preserve">Organisasinya tidak pernah diundang membahas kriteria; banyak anggotanya mengalami data yang tidak sesuai</w:t>
             </w:r>
           </w:p>
         </w:tc>
@@ -7153,7 +9264,7 @@
                 <w:sz w:val="18"/>
                 <w:szCs w:val="18"/>
               </w:rPr>
-              <w:t xml:space="preserve">Inti konstitusionalitas</w:t>
+              <w:t xml:space="preserve">Penyandang disabilitas tidak didengar</w:t>
             </w:r>
           </w:p>
         </w:tc>
@@ -7190,7 +9301,7 @@
                 <w:sz w:val="18"/>
                 <w:szCs w:val="18"/>
               </w:rPr>
-              <w:t xml:space="preserve">Ahli 2</w:t>
+              <w:t xml:space="preserve">Ahli 1</w:t>
             </w:r>
           </w:p>
         </w:tc>
@@ -7222,7 +9333,7 @@
                 <w:sz w:val="18"/>
                 <w:szCs w:val="18"/>
               </w:rPr>
-              <w:t xml:space="preserve">Dr. Bonifasius Tarigan, S.H., LL.M.</w:t>
+              <w:t xml:space="preserve">Prof. Dr. Aryani Kusumastuti, S.H., M.H.</w:t>
             </w:r>
           </w:p>
         </w:tc>
@@ -7254,7 +9365,7 @@
                 <w:sz w:val="18"/>
                 <w:szCs w:val="18"/>
               </w:rPr>
-              <w:t xml:space="preserve">Hukum Administrasi Negara, akademisi</w:t>
+              <w:t xml:space="preserve">Hukum Tata Negara, akademisi</w:t>
             </w:r>
           </w:p>
         </w:tc>
@@ -7286,7 +9397,7 @@
                 <w:sz w:val="18"/>
                 <w:szCs w:val="18"/>
               </w:rPr>
-              <w:t xml:space="preserve">Kriteria bersifat mengatur tetapi berbentuk Keputusan, sehingga lolos dari jaminan partisipasi Pasal 96 UU 12/2011; asas keterbukaan; pembanding kewajiban partisipasi dalam standar pelayanan UU 25/2009</w:t>
+              <w:t xml:space="preserve">Partisipasi bermakna (Putusan 91/PUU-XVIII/2020) secara analogis; expressio unius est exclusio alterius; kontradiksi Pasal 4 huruf c dan Pasal 8 ayat (7) dengan Pasal 8 ayat (2); batas open legal policy; alasan putusan bersyarat; hak partisipasi dalam Kovenan Hak Ekosob (UU 11/2005)</w:t>
             </w:r>
           </w:p>
         </w:tc>
@@ -7318,7 +9429,7 @@
                 <w:sz w:val="18"/>
                 <w:szCs w:val="18"/>
               </w:rPr>
-              <w:t xml:space="preserve">Kekosongan jaminan partisipasi</w:t>
+              <w:t xml:space="preserve">Inti konstitusionalitas</w:t>
             </w:r>
           </w:p>
         </w:tc>
@@ -7355,7 +9466,7 @@
                 <w:sz w:val="18"/>
                 <w:szCs w:val="18"/>
               </w:rPr>
-              <w:t xml:space="preserve">Ahli 3</w:t>
+              <w:t xml:space="preserve">Ahli 2</w:t>
             </w:r>
           </w:p>
         </w:tc>
@@ -7387,7 +9498,7 @@
                 <w:sz w:val="18"/>
                 <w:szCs w:val="18"/>
               </w:rPr>
-              <w:t xml:space="preserve">Dr. Maya Anggraini, M.Sc.</w:t>
+              <w:t xml:space="preserve">Dr. Bonifasius Tarigan, S.H., LL.M.</w:t>
             </w:r>
           </w:p>
         </w:tc>
@@ -7419,7 +9530,7 @@
                 <w:sz w:val="18"/>
                 <w:szCs w:val="18"/>
               </w:rPr>
-              <w:t xml:space="preserve">Ekonom kebijakan sosial di lembaga riset independen (fiktif)</w:t>
+              <w:t xml:space="preserve">Hukum Administrasi Negara, akademisi</w:t>
             </w:r>
           </w:p>
         </w:tc>
@@ -7451,7 +9562,7 @@
                 <w:sz w:val="18"/>
                 <w:szCs w:val="18"/>
               </w:rPr>
-              <w:t xml:space="preserve">Bukti salah sasaran (exclusion dan inclusion error); desil relatif berbeda dengan garis kemiskinan absolut; penargetan berbasis komunitas (Alatas dkk. 2012) dengan kelebihan dan kekurangannya; perlunya publikasi variabel dan bobot</w:t>
+              <w:t xml:space="preserve">Kriteria bersifat mengatur tetapi berbentuk Keputusan, sehingga lolos dari jaminan partisipasi Pasal 96 UU 12/2011; asas keterbukaan; pembanding kewajiban partisipasi dalam standar pelayanan UU 25/2009</w:t>
             </w:r>
           </w:p>
         </w:tc>
@@ -7483,7 +9594,7 @@
                 <w:sz w:val="18"/>
                 <w:szCs w:val="18"/>
               </w:rPr>
-              <w:t xml:space="preserve">Kriteria tertutup menghasilkan salah sasaran</w:t>
+              <w:t xml:space="preserve">Kekosongan jaminan partisipasi</w:t>
             </w:r>
           </w:p>
         </w:tc>
@@ -7520,6 +9631,171 @@
                 <w:sz w:val="18"/>
                 <w:szCs w:val="18"/>
               </w:rPr>
+              <w:t xml:space="preserve">Ahli 3</w:t>
+            </w:r>
+          </w:p>
+        </w:tc>
+        <w:tc>
+          <w:tcPr>
+            <w:tcW w:type="dxa" w:w="1500"/>
+            <w:tcBorders>
+              <w:top w:val="single" w:color="999999" w:sz="4"/>
+              <w:left w:val="single" w:color="999999" w:sz="4"/>
+              <w:bottom w:val="single" w:color="999999" w:sz="4"/>
+              <w:right w:val="single" w:color="999999" w:sz="4"/>
+            </w:tcBorders>
+            <w:tcMar>
+              <w:top w:type="dxa" w:w="60"/>
+              <w:left w:type="dxa" w:w="100"/>
+              <w:bottom w:type="dxa" w:w="60"/>
+              <w:right w:type="dxa" w:w="100"/>
+            </w:tcMar>
+          </w:tcPr>
+          <w:p>
+            <w:pPr>
+              <w:jc w:val="left"/>
+            </w:pPr>
+            <w:r>
+              <w:rPr>
+                <w:rFonts w:ascii="Arial" w:cs="Arial" w:eastAsia="Arial" w:hAnsi="Arial"/>
+                <w:b w:val="false"/>
+                <w:bCs w:val="false"/>
+                <w:sz w:val="18"/>
+                <w:szCs w:val="18"/>
+              </w:rPr>
+              <w:t xml:space="preserve">Dr. Maya Anggraini, M.Sc.</w:t>
+            </w:r>
+          </w:p>
+        </w:tc>
+        <w:tc>
+          <w:tcPr>
+            <w:tcW w:type="dxa" w:w="1900"/>
+            <w:tcBorders>
+              <w:top w:val="single" w:color="999999" w:sz="4"/>
+              <w:left w:val="single" w:color="999999" w:sz="4"/>
+              <w:bottom w:val="single" w:color="999999" w:sz="4"/>
+              <w:right w:val="single" w:color="999999" w:sz="4"/>
+            </w:tcBorders>
+            <w:tcMar>
+              <w:top w:type="dxa" w:w="60"/>
+              <w:left w:type="dxa" w:w="100"/>
+              <w:bottom w:type="dxa" w:w="60"/>
+              <w:right w:type="dxa" w:w="100"/>
+            </w:tcMar>
+          </w:tcPr>
+          <w:p>
+            <w:pPr>
+              <w:jc w:val="left"/>
+            </w:pPr>
+            <w:r>
+              <w:rPr>
+                <w:rFonts w:ascii="Arial" w:cs="Arial" w:eastAsia="Arial" w:hAnsi="Arial"/>
+                <w:b w:val="false"/>
+                <w:bCs w:val="false"/>
+                <w:sz w:val="18"/>
+                <w:szCs w:val="18"/>
+              </w:rPr>
+              <w:t xml:space="preserve">Ekonom kebijakan sosial di lembaga riset independen (fiktif)</w:t>
+            </w:r>
+          </w:p>
+        </w:tc>
+        <w:tc>
+          <w:tcPr>
+            <w:tcW w:type="dxa" w:w="3288"/>
+            <w:tcBorders>
+              <w:top w:val="single" w:color="999999" w:sz="4"/>
+              <w:left w:val="single" w:color="999999" w:sz="4"/>
+              <w:bottom w:val="single" w:color="999999" w:sz="4"/>
+              <w:right w:val="single" w:color="999999" w:sz="4"/>
+            </w:tcBorders>
+            <w:tcMar>
+              <w:top w:type="dxa" w:w="60"/>
+              <w:left w:type="dxa" w:w="100"/>
+              <w:bottom w:type="dxa" w:w="60"/>
+              <w:right w:type="dxa" w:w="100"/>
+            </w:tcMar>
+          </w:tcPr>
+          <w:p>
+            <w:pPr>
+              <w:jc w:val="left"/>
+            </w:pPr>
+            <w:r>
+              <w:rPr>
+                <w:rFonts w:ascii="Arial" w:cs="Arial" w:eastAsia="Arial" w:hAnsi="Arial"/>
+                <w:b w:val="false"/>
+                <w:bCs w:val="false"/>
+                <w:sz w:val="18"/>
+                <w:szCs w:val="18"/>
+              </w:rPr>
+              <w:t xml:space="preserve">Bukti salah sasaran (exclusion dan inclusion error); desil relatif berbeda dengan garis kemiskinan absolut; penargetan berbasis komunitas (Alatas dkk. 2012) dengan kelebihan dan kekurangannya; perlunya publikasi variabel dan bobot</w:t>
+            </w:r>
+          </w:p>
+        </w:tc>
+        <w:tc>
+          <w:tcPr>
+            <w:tcW w:type="dxa" w:w="2000"/>
+            <w:tcBorders>
+              <w:top w:val="single" w:color="999999" w:sz="4"/>
+              <w:left w:val="single" w:color="999999" w:sz="4"/>
+              <w:bottom w:val="single" w:color="999999" w:sz="4"/>
+              <w:right w:val="single" w:color="999999" w:sz="4"/>
+            </w:tcBorders>
+            <w:tcMar>
+              <w:top w:type="dxa" w:w="60"/>
+              <w:left w:type="dxa" w:w="100"/>
+              <w:bottom w:type="dxa" w:w="60"/>
+              <w:right w:type="dxa" w:w="100"/>
+            </w:tcMar>
+          </w:tcPr>
+          <w:p>
+            <w:pPr>
+              <w:jc w:val="left"/>
+            </w:pPr>
+            <w:r>
+              <w:rPr>
+                <w:rFonts w:ascii="Arial" w:cs="Arial" w:eastAsia="Arial" w:hAnsi="Arial"/>
+                <w:b w:val="false"/>
+                <w:bCs w:val="false"/>
+                <w:sz w:val="18"/>
+                <w:szCs w:val="18"/>
+              </w:rPr>
+              <w:t xml:space="preserve">Kriteria tertutup menghasilkan salah sasaran</w:t>
+            </w:r>
+          </w:p>
+        </w:tc>
+      </w:tr>
+      <w:tr>
+        <w:trPr>
+          <w:cantSplit/>
+        </w:trPr>
+        <w:tc>
+          <w:tcPr>
+            <w:tcW w:type="dxa" w:w="950"/>
+            <w:tcBorders>
+              <w:top w:val="single" w:color="999999" w:sz="4"/>
+              <w:left w:val="single" w:color="999999" w:sz="4"/>
+              <w:bottom w:val="single" w:color="999999" w:sz="4"/>
+              <w:right w:val="single" w:color="999999" w:sz="4"/>
+            </w:tcBorders>
+            <w:tcMar>
+              <w:top w:type="dxa" w:w="60"/>
+              <w:left w:type="dxa" w:w="100"/>
+              <w:bottom w:type="dxa" w:w="60"/>
+              <w:right w:type="dxa" w:w="100"/>
+            </w:tcMar>
+          </w:tcPr>
+          <w:p>
+            <w:pPr>
+              <w:jc w:val="left"/>
+            </w:pPr>
+            <w:r>
+              <w:rPr>
+                <w:rFonts w:ascii="Arial" w:cs="Arial" w:eastAsia="Arial" w:hAnsi="Arial"/>
+                <w:b w:val="false"/>
+                <w:bCs w:val="false"/>
+                <w:sz w:val="18"/>
+                <w:szCs w:val="18"/>
+              </w:rPr>
               <w:t xml:space="preserve">Ahli 4</w:t>
             </w:r>
           </w:p>
@@ -7616,7 +9892,7 @@
                 <w:sz w:val="18"/>
                 <w:szCs w:val="18"/>
               </w:rPr>
-              <w:t xml:space="preserve">Kemiskinan bersifat kontekstual; kearifan lokal dalam bentuk rumah dan pola penghasilan; metode penilaian kemiskinan partisipatif</w:t>
+              <w:t xml:space="preserve">Kemiskinan bersifat kontekstual; kearifan lokal dalam bentuk rumah dan pola penghasilan; kebutuhan khusus kelompok rentan seperti penyandang disabilitas; metode penilaian kemiskinan partisipatif</w:t>
             </w:r>
           </w:p>
         </w:tc>
@@ -8532,7 +10808,7 @@
         <w:rPr>
           <w:rFonts w:ascii="Arial" w:cs="Arial" w:eastAsia="Arial" w:hAnsi="Arial"/>
         </w:rPr>
-        <w:t xml:space="preserve">Sepakati usulan pembagian 16 anggota (5 kuasa hukum, 4 Pemohon prinsipal, 3 saksi, 4 ahli) dan cek ke tim Pemerintah atau dosen agar jenis saksi dan ahli tidak bertabrakan</w:t>
+        <w:t xml:space="preserve">Sepakati pembagian 16 anggota (1 kuasa hukum, 7 Pemohon prinsipal, 4 saksi, 4 ahli) dan cek ke tim Pemerintah atau dosen agar jenis saksi dan ahli tidak bertabrakan</w:t>
       </w:r>
     </w:p>
     <w:p>
@@ -8586,7 +10862,7 @@
         <w:rPr>
           <w:rFonts w:ascii="Arial" w:cs="Arial" w:eastAsia="Arial" w:hAnsi="Arial"/>
         </w:rPr>
-        <w:t xml:space="preserve">Perlu tidaknya Pemohon V, misalnya ibu rumah tangga di kontrakan yang tercatat desil 10, jika peran masih tersisa</w:t>
+        <w:t xml:space="preserve">Tanyakan ke dosen apakah Pemohon prinsipal boleh ikut berbicara bersama kuasa hukum dalam simulasi</w:t>
       </w:r>
     </w:p>
     <w:p>
@@ -8747,7 +11023,7 @@
         </w:numPr>
         <w:spacing w:after="40"/>
       </w:pPr>
-      <w:hyperlink w:history="1" r:id="rIdnho-vouksdoxvp2zsqm6u">
+      <w:hyperlink w:history="1" r:id="rIdur_bhgkkwd6va12jdgqqy">
         <w:r>
           <w:rPr>
             <w:rStyle w:val="Hyperlink"/>
@@ -8768,7 +11044,7 @@
         </w:numPr>
         <w:spacing w:after="40"/>
       </w:pPr>
-      <w:hyperlink w:history="1" r:id="rIdd61vm7eiucinn420f5zst">
+      <w:hyperlink w:history="1" r:id="rIdhyryhynnyfsx4k5qj--2z">
         <w:r>
           <w:rPr>
             <w:rStyle w:val="Hyperlink"/>
@@ -8789,7 +11065,7 @@
         </w:numPr>
         <w:spacing w:after="40"/>
       </w:pPr>
-      <w:hyperlink w:history="1" r:id="rIdmyzvbhzcboq2ctwniyyc_">
+      <w:hyperlink w:history="1" r:id="rIdsikdrxs3d6i8rxc_4k88s">
         <w:r>
           <w:rPr>
             <w:rStyle w:val="Hyperlink"/>
@@ -8810,7 +11086,7 @@
         </w:numPr>
         <w:spacing w:after="40"/>
       </w:pPr>
-      <w:hyperlink w:history="1" r:id="rIdeodin6b2mckz63kwfgzdc">
+      <w:hyperlink w:history="1" r:id="rIdcrqthxl5pxo-dutfmmeaz">
         <w:r>
           <w:rPr>
             <w:rStyle w:val="Hyperlink"/>
@@ -8831,7 +11107,7 @@
         </w:numPr>
         <w:spacing w:after="40"/>
       </w:pPr>
-      <w:hyperlink w:history="1" r:id="rIdtquzzedrpmbznbtvx-ce3">
+      <w:hyperlink w:history="1" r:id="rIde-fieuruavw0ticbwk3jo">
         <w:r>
           <w:rPr>
             <w:rStyle w:val="Hyperlink"/>
@@ -8852,7 +11128,7 @@
         </w:numPr>
         <w:spacing w:after="40"/>
       </w:pPr>
-      <w:hyperlink w:history="1" r:id="rId2_9jrat48plrqk0oqzoat">
+      <w:hyperlink w:history="1" r:id="rIdr2ptlgx6ye_8ezfpnexxt">
         <w:r>
           <w:rPr>
             <w:rStyle w:val="Hyperlink"/>
@@ -8873,7 +11149,7 @@
         </w:numPr>
         <w:spacing w:after="40"/>
       </w:pPr>
-      <w:hyperlink w:history="1" r:id="rIdpkapyzstzcyrxfjm3pa-u">
+      <w:hyperlink w:history="1" r:id="rIdb11wjkpdb2d5blqqllpb9">
         <w:r>
           <w:rPr>
             <w:rStyle w:val="Hyperlink"/>
@@ -8894,7 +11170,7 @@
         </w:numPr>
         <w:spacing w:after="40"/>
       </w:pPr>
-      <w:hyperlink w:history="1" r:id="rIdavqx6odotujsgrjyr_lef">
+      <w:hyperlink w:history="1" r:id="rIdr38o10j-dsrxl5qbgleu5">
         <w:r>
           <w:rPr>
             <w:rStyle w:val="Hyperlink"/>
@@ -8915,7 +11191,7 @@
         </w:numPr>
         <w:spacing w:after="40"/>
       </w:pPr>
-      <w:hyperlink w:history="1" r:id="rIdlefe905gqsaq4xime3swm">
+      <w:hyperlink w:history="1" r:id="rId8wgq76hh8ykesb3olqrbx">
         <w:r>
           <w:rPr>
             <w:rStyle w:val="Hyperlink"/>
@@ -8936,7 +11212,7 @@
         </w:numPr>
         <w:spacing w:after="40"/>
       </w:pPr>
-      <w:hyperlink w:history="1" r:id="rId0whmcbsskk1gxj5hunnne">
+      <w:hyperlink w:history="1" r:id="rIdpzqo3dxgfkh8xppexj1vt">
         <w:r>
           <w:rPr>
             <w:rStyle w:val="Hyperlink"/>
@@ -8957,7 +11233,7 @@
         </w:numPr>
         <w:spacing w:after="40"/>
       </w:pPr>
-      <w:hyperlink w:history="1" r:id="rIdznq9xxai9cb7t_kk1gme4">
+      <w:hyperlink w:history="1" r:id="rIdfwckrj1c0agptq1kapmzi">
         <w:r>
           <w:rPr>
             <w:rStyle w:val="Hyperlink"/>
@@ -8978,7 +11254,7 @@
         </w:numPr>
         <w:spacing w:after="40"/>
       </w:pPr>
-      <w:hyperlink w:history="1" r:id="rId--lwnyhphw0idzoytqkgt">
+      <w:hyperlink w:history="1" r:id="rIdpciwztjxkytj7-bxnlw9p">
         <w:r>
           <w:rPr>
             <w:rStyle w:val="Hyperlink"/>
@@ -8999,7 +11275,7 @@
         </w:numPr>
         <w:spacing w:after="40"/>
       </w:pPr>
-      <w:hyperlink w:history="1" r:id="rIdo531jagokf7bnyuyqii5v">
+      <w:hyperlink w:history="1" r:id="rIdqeo52ydwamy9tzrr4wcqc">
         <w:r>
           <w:rPr>
             <w:rStyle w:val="Hyperlink"/>
@@ -9020,7 +11296,7 @@
         </w:numPr>
         <w:spacing w:after="40"/>
       </w:pPr>
-      <w:hyperlink w:history="1" r:id="rIds3bz4qb7jl1y2htklcxbe">
+      <w:hyperlink w:history="1" r:id="rIdofsx_jexaio8ti3qqv-qw">
         <w:r>
           <w:rPr>
             <w:rStyle w:val="Hyperlink"/>
@@ -9041,7 +11317,7 @@
         </w:numPr>
         <w:spacing w:after="40"/>
       </w:pPr>
-      <w:hyperlink w:history="1" r:id="rIdqipyce_goiij-t3t4r74a">
+      <w:hyperlink w:history="1" r:id="rIdpii0cuo6nkxoq5a-0rv4i">
         <w:r>
           <w:rPr>
             <w:rStyle w:val="Hyperlink"/>
@@ -9316,6 +11592,18 @@
     </w:lvlOverride>
   </w:num>
   <w:num w:numId="7">
+    <w:abstractNumId w:val="3"/>
+    <w:lvlOverride w:ilvl="0">
+      <w:startOverride w:val="1"/>
+    </w:lvlOverride>
+  </w:num>
+  <w:num w:numId="8">
+    <w:abstractNumId w:val="3"/>
+    <w:lvlOverride w:ilvl="0">
+      <w:startOverride w:val="1"/>
+    </w:lvlOverride>
+  </w:num>
+  <w:num w:numId="9">
     <w:abstractNumId w:val="3"/>
     <w:lvlOverride w:ilvl="0">
       <w:startOverride w:val="1"/>

</xml_diff>